<commit_message>
docs(georgetown): clean up Word forms — Calibri font, typing space, no underscores
The .docx forms read as paper forms (Aptos font, underscore fill-in lines).
Members type into Word, so replaced underscores with blank-line typing space
under each prompt, switched the theme font to Calibri, and set 1.5 line
spacing via a custom pandoc reference doc. Regenerated both the member form
and Mike's Aquaponics draft; updated their Word-source markdowns to match.

Co-Authored-By: Claude Opus 4.8 (1M context) <noreply@anthropic.com>
</commit_message>
<xml_diff>
--- a/apps/georgetown/docs/templates/Project-Summary-Aquaponics-Workshop-for-Mike.docx
+++ b/apps/georgetown/docs/templates/Project-Summary-Aquaponics-Workshop-for-Mike.docx
@@ -2,14 +2,6 @@
 <file path=word/document.xml><?xml version="1.0" encoding="utf-8"?>
 <w:document xmlns:w="http://schemas.openxmlformats.org/wordprocessingml/2006/main" xmlns:m="http://schemas.openxmlformats.org/officeDocument/2006/math" xmlns:r="http://schemas.openxmlformats.org/officeDocument/2006/relationships" xmlns:o="urn:schemas-microsoft-com:office:office" xmlns:v="urn:schemas-microsoft-com:vml" xmlns:w10="urn:schemas-microsoft-com:office:word" xmlns:a="http://schemas.openxmlformats.org/drawingml/2006/main" xmlns:pic="http://schemas.openxmlformats.org/drawingml/2006/picture" xmlns:wp="http://schemas.openxmlformats.org/drawingml/2006/wordprocessingDrawing">
   <w:body>
-    <w:p>
-      <w:pPr>
-        <w:pStyle w:val="Title"/>
-      </w:pPr>
-      <w:r>
-        <w:t xml:space="preserve">RC Georgetown — Project Summary Form: Aquaponics Workshop</w:t>
-      </w:r>
-    </w:p>
     <w:bookmarkStart w:id="17" w:name="rc-georgetown-project-summary-form"/>
     <w:p>
       <w:pPr>
@@ -47,29 +39,532 @@
           <w:i/>
           <w:iCs/>
         </w:rPr>
-        <w:t xml:space="preserve">Hi Mike — we’ve started this from what we already have on record. Please</w:t>
+        <w:t xml:space="preserve">Hi Mike — we’ve started this from what we already have on record. Please correct anything wrong, and type your answers in the space under each blank prompt. Return it however suits you. Thank you!</w:t>
+      </w:r>
+    </w:p>
+    <w:bookmarkEnd w:id="9"/>
+    <w:bookmarkStart w:id="10" w:name="project-identity"/>
+    <w:p>
+      <w:pPr>
+        <w:pStyle w:val="Heading2"/>
+      </w:pPr>
+      <w:r>
+        <w:t xml:space="preserve">1 · Project Identity</w:t>
+      </w:r>
+    </w:p>
+    <w:p>
+      <w:pPr>
+        <w:pStyle w:val="FirstParagraph"/>
+      </w:pPr>
+      <w:r>
+        <w:rPr>
+          <w:b/>
+          <w:bCs/>
+        </w:rPr>
+        <w:t xml:space="preserve">Project name:</w:t>
+      </w:r>
+      <w:r>
+        <w:t xml:space="preserve"> </w:t>
+      </w:r>
+      <w:r>
+        <w:t xml:space="preserve">Aquaponics Workshop</w:t>
+      </w:r>
+      <w:r>
+        <w:t xml:space="preserve"> </w:t>
       </w:r>
       <w:r>
         <w:rPr>
           <w:i/>
           <w:iCs/>
         </w:rPr>
-        <w:t xml:space="preserve"> </w:t>
-      </w:r>
-      <w:r>
-        <w:rPr>
-          <w:b/>
-          <w:bCs/>
+        <w:t xml:space="preserve">(correct if it had a fuller name)</w:t>
+      </w:r>
+    </w:p>
+    <w:p>
+      <w:pPr>
+        <w:pStyle w:val="BodyText"/>
+      </w:pPr>
+      <w:r>
+        <w:rPr>
+          <w:b/>
+          <w:bCs/>
+        </w:rPr>
+        <w:t xml:space="preserve">Rotary year:</w:t>
+      </w:r>
+      <w:r>
+        <w:t xml:space="preserve"> </w:t>
+      </w:r>
+      <w:r>
+        <w:t xml:space="preserve">2024-25</w:t>
+      </w:r>
+    </w:p>
+    <w:p>
+      <w:pPr>
+        <w:pStyle w:val="BodyText"/>
+      </w:pPr>
+      <w:r>
+        <w:rPr>
+          <w:b/>
+          <w:bCs/>
+        </w:rPr>
+        <w:t xml:space="preserve">Champion:</w:t>
+      </w:r>
+      <w:r>
+        <w:t xml:space="preserve"> </w:t>
+      </w:r>
+      <w:r>
+        <w:t xml:space="preserve">Mike Jackman</w:t>
+      </w:r>
+    </w:p>
+    <w:bookmarkEnd w:id="10"/>
+    <w:bookmarkStart w:id="11" w:name="the-story"/>
+    <w:p>
+      <w:pPr>
+        <w:pStyle w:val="Heading2"/>
+      </w:pPr>
+      <w:r>
+        <w:t xml:space="preserve">2 · The Story</w:t>
+      </w:r>
+    </w:p>
+    <w:p>
+      <w:pPr>
+        <w:pStyle w:val="FirstParagraph"/>
+      </w:pPr>
+      <w:r>
+        <w:rPr>
+          <w:b/>
+          <w:bCs/>
+        </w:rPr>
+        <w:t xml:space="preserve">What was it?</w:t>
+      </w:r>
+      <w:r>
+        <w:t xml:space="preserve"> </w:t>
+      </w:r>
+      <w:r>
+        <w:t xml:space="preserve">(one or two sentences)</w:t>
+      </w:r>
+    </w:p>
+    <w:p>
+      <w:pPr>
+        <w:pStyle w:val="BodyText"/>
+      </w:pPr>
+      <w:r>
+        <w:t xml:space="preserve"> </w:t>
+      </w:r>
+    </w:p>
+    <w:p>
+      <w:pPr>
+        <w:pStyle w:val="BodyText"/>
+      </w:pPr>
+      <w:r>
+        <w:t xml:space="preserve"> </w:t>
+      </w:r>
+    </w:p>
+    <w:p>
+      <w:pPr>
+        <w:pStyle w:val="BodyText"/>
+      </w:pPr>
+      <w:r>
+        <w:rPr>
+          <w:b/>
+          <w:bCs/>
+        </w:rPr>
+        <w:t xml:space="preserve">Why did the club do it?</w:t>
+      </w:r>
+      <w:r>
+        <w:t xml:space="preserve"> </w:t>
+      </w:r>
+      <w:r>
+        <w:t xml:space="preserve">(the need or opportunity it addressed)</w:t>
+      </w:r>
+    </w:p>
+    <w:p>
+      <w:pPr>
+        <w:pStyle w:val="BodyText"/>
+      </w:pPr>
+      <w:r>
+        <w:t xml:space="preserve"> </w:t>
+      </w:r>
+    </w:p>
+    <w:p>
+      <w:pPr>
+        <w:pStyle w:val="BodyText"/>
+      </w:pPr>
+      <w:r>
+        <w:t xml:space="preserve"> </w:t>
+      </w:r>
+    </w:p>
+    <w:p>
+      <w:pPr>
+        <w:pStyle w:val="BodyText"/>
+      </w:pPr>
+      <w:r>
+        <w:rPr>
+          <w:b/>
+          <w:bCs/>
+        </w:rPr>
+        <w:t xml:space="preserve">Impact — what changed because of it?</w:t>
+      </w:r>
+      <w:r>
+        <w:t xml:space="preserve"> </w:t>
+      </w:r>
+      <w:r>
+        <w:t xml:space="preserve">(e.g. how many people attended / trained, what they took away)</w:t>
+      </w:r>
+    </w:p>
+    <w:p>
+      <w:pPr>
+        <w:pStyle w:val="BodyText"/>
+      </w:pPr>
+      <w:r>
+        <w:t xml:space="preserve"> </w:t>
+      </w:r>
+    </w:p>
+    <w:p>
+      <w:pPr>
+        <w:pStyle w:val="BodyText"/>
+      </w:pPr>
+      <w:r>
+        <w:t xml:space="preserve"> </w:t>
+      </w:r>
+    </w:p>
+    <w:bookmarkEnd w:id="11"/>
+    <w:bookmarkStart w:id="12" w:name="classification"/>
+    <w:p>
+      <w:pPr>
+        <w:pStyle w:val="Heading2"/>
+      </w:pPr>
+      <w:r>
+        <w:t xml:space="preserve">3 · Classification</w:t>
+      </w:r>
+    </w:p>
+    <w:p>
+      <w:pPr>
+        <w:pStyle w:val="FirstParagraph"/>
+      </w:pPr>
+      <w:r>
+        <w:rPr>
+          <w:b/>
+          <w:bCs/>
+        </w:rPr>
+        <w:t xml:space="preserve">Area of Focus:</w:t>
+      </w:r>
+      <w:r>
+        <w:t xml:space="preserve"> </w:t>
+      </w:r>
+      <w:r>
+        <w:t xml:space="preserve">Environment</w:t>
+      </w:r>
+      <w:r>
+        <w:t xml:space="preserve"> </w:t>
+      </w:r>
+      <w:r>
+        <w:rPr>
           <w:i/>
           <w:iCs/>
         </w:rPr>
-        <w:t xml:space="preserve">correct anything wrong</w:t>
+        <w:t xml:space="preserve">(our best guess — change if you disagree)</w:t>
+      </w:r>
+    </w:p>
+    <w:p>
+      <w:pPr>
+        <w:pStyle w:val="BodyText"/>
+      </w:pPr>
+      <w:r>
+        <w:rPr>
+          <w:b/>
+          <w:bCs/>
+        </w:rPr>
+        <w:t xml:space="preserve">Funding:</w:t>
+      </w:r>
+      <w:r>
+        <w:t xml:space="preserve"> </w:t>
+      </w:r>
+      <w:r>
+        <w:t xml:space="preserve">Club</w:t>
+      </w:r>
+    </w:p>
+    <w:p>
+      <w:pPr>
+        <w:pStyle w:val="BodyText"/>
+      </w:pPr>
+      <w:r>
+        <w:rPr>
+          <w:b/>
+          <w:bCs/>
+        </w:rPr>
+        <w:t xml:space="preserve">Status:</w:t>
+      </w:r>
+      <w:r>
+        <w:t xml:space="preserve"> </w:t>
+      </w:r>
+      <w:r>
+        <w:t xml:space="preserve">Completed</w:t>
+      </w:r>
+    </w:p>
+    <w:bookmarkEnd w:id="12"/>
+    <w:bookmarkStart w:id="13" w:name="when-where"/>
+    <w:p>
+      <w:pPr>
+        <w:pStyle w:val="Heading2"/>
+      </w:pPr>
+      <w:r>
+        <w:t xml:space="preserve">4 · When &amp; Where</w:t>
+      </w:r>
+    </w:p>
+    <w:p>
+      <w:pPr>
+        <w:pStyle w:val="FirstParagraph"/>
+      </w:pPr>
+      <w:r>
+        <w:rPr>
+          <w:b/>
+          <w:bCs/>
+        </w:rPr>
+        <w:t xml:space="preserve">Start date</w:t>
+      </w:r>
+      <w:r>
+        <w:t xml:space="preserve"> </w:t>
+      </w:r>
+      <w:r>
+        <w:t xml:space="preserve">(month is fine, e.g. 2024-09)</w:t>
+      </w:r>
+      <w:r>
+        <w:rPr>
+          <w:b/>
+          <w:bCs/>
+        </w:rPr>
+        <w:t xml:space="preserve">:</w:t>
+      </w:r>
+    </w:p>
+    <w:p>
+      <w:pPr>
+        <w:pStyle w:val="BodyText"/>
+      </w:pPr>
+      <w:r>
+        <w:t xml:space="preserve"> </w:t>
+      </w:r>
+    </w:p>
+    <w:p>
+      <w:pPr>
+        <w:pStyle w:val="BodyText"/>
+      </w:pPr>
+      <w:r>
+        <w:rPr>
+          <w:b/>
+          <w:bCs/>
+        </w:rPr>
+        <w:t xml:space="preserve">Completion date:</w:t>
+      </w:r>
+    </w:p>
+    <w:p>
+      <w:pPr>
+        <w:pStyle w:val="BodyText"/>
+      </w:pPr>
+      <w:r>
+        <w:t xml:space="preserve"> </w:t>
+      </w:r>
+    </w:p>
+    <w:p>
+      <w:pPr>
+        <w:pStyle w:val="BodyText"/>
+      </w:pPr>
+      <w:r>
+        <w:rPr>
+          <w:b/>
+          <w:bCs/>
+        </w:rPr>
+        <w:t xml:space="preserve">Location:</w:t>
+      </w:r>
+      <w:r>
+        <w:t xml:space="preserve"> </w:t>
+      </w:r>
+      <w:r>
+        <w:t xml:space="preserve">Penang</w:t>
+      </w:r>
+      <w:r>
+        <w:t xml:space="preserve"> </w:t>
       </w:r>
       <w:r>
         <w:rPr>
           <w:i/>
           <w:iCs/>
         </w:rPr>
+        <w:t xml:space="preserve">(more specific venue if you have it)</w:t>
+      </w:r>
+    </w:p>
+    <w:p>
+      <w:pPr>
+        <w:pStyle w:val="BodyText"/>
+      </w:pPr>
+      <w:r>
+        <w:t xml:space="preserve"> </w:t>
+      </w:r>
+    </w:p>
+    <w:bookmarkEnd w:id="13"/>
+    <w:bookmarkStart w:id="14" w:name="by-the-numbers"/>
+    <w:p>
+      <w:pPr>
+        <w:pStyle w:val="Heading2"/>
+      </w:pPr>
+      <w:r>
+        <w:t xml:space="preserve">5 · By the Numbers</w:t>
+      </w:r>
+    </w:p>
+    <w:p>
+      <w:pPr>
+        <w:pStyle w:val="FirstParagraph"/>
+      </w:pPr>
+      <w:r>
+        <w:rPr>
+          <w:b/>
+          <w:bCs/>
+        </w:rPr>
+        <w:t xml:space="preserve">Beneficiaries</w:t>
+      </w:r>
+      <w:r>
+        <w:t xml:space="preserve"> </w:t>
+      </w:r>
+      <w:r>
+        <w:t xml:space="preserve">(how many attended / were helped)</w:t>
+      </w:r>
+      <w:r>
+        <w:rPr>
+          <w:b/>
+          <w:bCs/>
+        </w:rPr>
+        <w:t xml:space="preserve">:</w:t>
+      </w:r>
+    </w:p>
+    <w:p>
+      <w:pPr>
+        <w:pStyle w:val="BodyText"/>
+      </w:pPr>
+      <w:r>
+        <w:t xml:space="preserve"> </w:t>
+      </w:r>
+    </w:p>
+    <w:p>
+      <w:pPr>
+        <w:pStyle w:val="BodyText"/>
+      </w:pPr>
+      <w:r>
+        <w:rPr>
+          <w:b/>
+          <w:bCs/>
+        </w:rPr>
+        <w:t xml:space="preserve">Project value (RM)</w:t>
+      </w:r>
+      <w:r>
+        <w:t xml:space="preserve"> </w:t>
+      </w:r>
+      <w:r>
+        <w:t xml:space="preserve">(total spent / value delivered)</w:t>
+      </w:r>
+      <w:r>
+        <w:rPr>
+          <w:b/>
+          <w:bCs/>
+        </w:rPr>
+        <w:t xml:space="preserve">:</w:t>
+      </w:r>
+    </w:p>
+    <w:p>
+      <w:pPr>
+        <w:pStyle w:val="BodyText"/>
+      </w:pPr>
+      <w:r>
+        <w:t xml:space="preserve"> </w:t>
+      </w:r>
+    </w:p>
+    <w:p>
+      <w:pPr>
+        <w:pStyle w:val="BodyText"/>
+      </w:pPr>
+      <w:r>
+        <w:rPr>
+          <w:b/>
+          <w:bCs/>
+        </w:rPr>
+        <w:t xml:space="preserve">Volunteer hours</w:t>
+      </w:r>
+      <w:r>
+        <w:t xml:space="preserve"> </w:t>
+      </w:r>
+      <w:r>
+        <w:t xml:space="preserve">(optional)</w:t>
+      </w:r>
+      <w:r>
+        <w:rPr>
+          <w:b/>
+          <w:bCs/>
+        </w:rPr>
+        <w:t xml:space="preserve">:</w:t>
+      </w:r>
+    </w:p>
+    <w:p>
+      <w:pPr>
+        <w:pStyle w:val="BodyText"/>
+      </w:pPr>
+      <w:r>
+        <w:t xml:space="preserve"> </w:t>
+      </w:r>
+    </w:p>
+    <w:bookmarkEnd w:id="14"/>
+    <w:bookmarkStart w:id="15" w:name="partners"/>
+    <w:p>
+      <w:pPr>
+        <w:pStyle w:val="Heading2"/>
+      </w:pPr>
+      <w:r>
+        <w:t xml:space="preserve">6 · Partners</w:t>
+      </w:r>
+    </w:p>
+    <w:p>
+      <w:pPr>
+        <w:pStyle w:val="FirstParagraph"/>
+      </w:pPr>
+      <w:r>
+        <w:rPr>
+          <w:b/>
+          <w:bCs/>
+        </w:rPr>
+        <w:t xml:space="preserve">Organisations, sponsors, or co-clubs involved</w:t>
+      </w:r>
+      <w:r>
+        <w:t xml:space="preserve"> </w:t>
+      </w:r>
+      <w:r>
+        <w:t xml:space="preserve">(list them, or write</w:t>
+      </w:r>
+      <w:r>
+        <w:t xml:space="preserve"> </w:t>
+      </w:r>
+      <w:r>
+        <w:t xml:space="preserve">“none”</w:t>
+      </w:r>
+      <w:r>
+        <w:t xml:space="preserve">):</w:t>
+      </w:r>
+    </w:p>
+    <w:p>
+      <w:pPr>
+        <w:pStyle w:val="BodyText"/>
+      </w:pPr>
+      <w:r>
+        <w:t xml:space="preserve"> </w:t>
+      </w:r>
+    </w:p>
+    <w:bookmarkEnd w:id="15"/>
+    <w:bookmarkStart w:id="16" w:name="extras-all-optional"/>
+    <w:p>
+      <w:pPr>
+        <w:pStyle w:val="Heading2"/>
+      </w:pPr>
+      <w:r>
+        <w:t xml:space="preserve">7 · Extras</w:t>
+      </w:r>
+      <w:r>
         <w:t xml:space="preserve"> </w:t>
       </w:r>
       <w:r>
@@ -77,755 +572,122 @@
           <w:i/>
           <w:iCs/>
         </w:rPr>
-        <w:t xml:space="preserve">and</w:t>
+        <w:t xml:space="preserve">(all optional)</w:t>
+      </w:r>
+    </w:p>
+    <w:p>
+      <w:pPr>
+        <w:pStyle w:val="FirstParagraph"/>
+      </w:pPr>
+      <w:r>
+        <w:rPr>
+          <w:b/>
+          <w:bCs/>
+        </w:rPr>
+        <w:t xml:space="preserve">Photos?</w:t>
+      </w:r>
+      <w:r>
+        <w:t xml:space="preserve"> </w:t>
+      </w:r>
+      <w:r>
+        <w:t xml:space="preserve">(yes / no — where are they?)</w:t>
+      </w:r>
+    </w:p>
+    <w:p>
+      <w:pPr>
+        <w:pStyle w:val="BodyText"/>
+      </w:pPr>
+      <w:r>
+        <w:t xml:space="preserve"> </w:t>
+      </w:r>
+    </w:p>
+    <w:p>
+      <w:pPr>
+        <w:pStyle w:val="BodyText"/>
+      </w:pPr>
+      <w:r>
+        <w:rPr>
+          <w:b/>
+          <w:bCs/>
+        </w:rPr>
+        <w:t xml:space="preserve">Publicity</w:t>
+      </w:r>
+      <w:r>
+        <w:t xml:space="preserve"> </w:t>
+      </w:r>
+      <w:r>
+        <w:t xml:space="preserve">(any links or write-ups):</w:t>
+      </w:r>
+    </w:p>
+    <w:p>
+      <w:pPr>
+        <w:pStyle w:val="BodyText"/>
+      </w:pPr>
+      <w:r>
+        <w:t xml:space="preserve"> </w:t>
+      </w:r>
+    </w:p>
+    <w:p>
+      <w:pPr>
+        <w:pStyle w:val="BodyText"/>
+      </w:pPr>
+      <w:r>
+        <w:rPr>
+          <w:b/>
+          <w:bCs/>
+        </w:rPr>
+        <w:t xml:space="preserve">Lessons learned / would you repeat it?</w:t>
+      </w:r>
+    </w:p>
+    <w:p>
+      <w:pPr>
+        <w:pStyle w:val="BodyText"/>
+      </w:pPr>
+      <w:r>
+        <w:t xml:space="preserve"> </w:t>
+      </w:r>
+    </w:p>
+    <w:p>
+      <w:pPr>
+        <w:pStyle w:val="BodyText"/>
+      </w:pPr>
+      <w:r>
+        <w:rPr>
+          <w:b/>
+          <w:bCs/>
+        </w:rPr>
+        <w:t xml:space="preserve">Anything else we should record?</w:t>
+      </w:r>
+      <w:r>
+        <w:t xml:space="preserve"> </w:t>
       </w:r>
       <w:r>
         <w:rPr>
           <w:i/>
           <w:iCs/>
         </w:rPr>
-        <w:t xml:space="preserve"> </w:t>
-      </w:r>
-      <w:r>
-        <w:rPr>
-          <w:b/>
-          <w:bCs/>
-          <w:i/>
-          <w:iCs/>
-        </w:rPr>
-        <w:t xml:space="preserve">fill the blanks</w:t>
-      </w:r>
-      <w:r>
-        <w:rPr>
-          <w:i/>
-          <w:iCs/>
-        </w:rPr>
-        <w:t xml:space="preserve"> </w:t>
-      </w:r>
-      <w:r>
-        <w:rPr>
-          <w:i/>
-          <w:iCs/>
-        </w:rPr>
-        <w:t xml:space="preserve">on the lines provided. Return it however suits you. Thank you!</w:t>
-      </w:r>
-    </w:p>
-    <w:p>
-      <w:r>
-        <w:pict>
-          <v:rect style="width:0;height:1.5pt" o:hralign="center" o:hrstd="t" o:hr="t"/>
-        </w:pict>
-      </w:r>
-    </w:p>
-    <w:bookmarkEnd w:id="9"/>
-    <w:bookmarkStart w:id="10" w:name="project-identity"/>
-    <w:p>
-      <w:pPr>
-        <w:pStyle w:val="Heading2"/>
-      </w:pPr>
-      <w:r>
-        <w:t xml:space="preserve">1 · Project Identity</w:t>
-      </w:r>
-    </w:p>
-    <w:p>
-      <w:pPr>
-        <w:pStyle w:val="FirstParagraph"/>
-      </w:pPr>
-      <w:r>
-        <w:rPr>
-          <w:b/>
-          <w:bCs/>
-        </w:rPr>
-        <w:t xml:space="preserve">Project name:</w:t>
-      </w:r>
-      <w:r>
-        <w:t xml:space="preserve"> </w:t>
-      </w:r>
-      <w:r>
-        <w:t xml:space="preserve">Aquaponics Workshop</w:t>
-      </w:r>
-      <w:r>
-        <w:t xml:space="preserve"> </w:t>
-      </w:r>
-      <w:r>
-        <w:rPr>
-          <w:i/>
-          <w:iCs/>
-        </w:rPr>
-        <w:t xml:space="preserve">(correct if it had a fuller name: ____________________ )</w:t>
-      </w:r>
-    </w:p>
-    <w:p>
-      <w:pPr>
-        <w:pStyle w:val="BodyText"/>
-      </w:pPr>
-      <w:r>
-        <w:rPr>
-          <w:b/>
-          <w:bCs/>
-        </w:rPr>
-        <w:t xml:space="preserve">Rotary year:</w:t>
-      </w:r>
-      <w:r>
-        <w:t xml:space="preserve"> </w:t>
-      </w:r>
-      <w:r>
-        <w:t xml:space="preserve">2024-25</w:t>
-      </w:r>
-    </w:p>
-    <w:p>
-      <w:pPr>
-        <w:pStyle w:val="BodyText"/>
-      </w:pPr>
-      <w:r>
-        <w:rPr>
-          <w:b/>
-          <w:bCs/>
-        </w:rPr>
-        <w:t xml:space="preserve">Champion:</w:t>
-      </w:r>
-      <w:r>
-        <w:t xml:space="preserve"> </w:t>
-      </w:r>
-      <w:r>
-        <w:t xml:space="preserve">Mike Jackman</w:t>
-      </w:r>
-    </w:p>
-    <w:p>
-      <w:r>
-        <w:pict>
-          <v:rect style="width:0;height:1.5pt" o:hralign="center" o:hrstd="t" o:hr="t"/>
-        </w:pict>
-      </w:r>
-    </w:p>
-    <w:bookmarkEnd w:id="10"/>
-    <w:bookmarkStart w:id="11" w:name="the-story"/>
-    <w:p>
-      <w:pPr>
-        <w:pStyle w:val="Heading2"/>
-      </w:pPr>
-      <w:r>
-        <w:t xml:space="preserve">2 · The Story</w:t>
-      </w:r>
-    </w:p>
-    <w:p>
-      <w:pPr>
-        <w:pStyle w:val="FirstParagraph"/>
-      </w:pPr>
-      <w:r>
-        <w:rPr>
-          <w:b/>
-          <w:bCs/>
-        </w:rPr>
-        <w:t xml:space="preserve">What was it?</w:t>
-      </w:r>
-      <w:r>
-        <w:t xml:space="preserve"> </w:t>
-      </w:r>
-      <w:r>
-        <w:rPr>
-          <w:i/>
-          <w:iCs/>
-        </w:rPr>
-        <w:t xml:space="preserve">(one or two sentences)</w:t>
-      </w:r>
-    </w:p>
-    <w:p>
-      <w:r>
-        <w:pict>
-          <v:rect style="width:0;height:1.5pt" o:hralign="center" o:hrstd="t" o:hr="t"/>
-        </w:pict>
-      </w:r>
-    </w:p>
-    <w:p>
-      <w:r>
-        <w:pict>
-          <v:rect style="width:0;height:1.5pt" o:hralign="center" o:hrstd="t" o:hr="t"/>
-        </w:pict>
-      </w:r>
-    </w:p>
-    <w:p>
-      <w:pPr>
-        <w:pStyle w:val="FirstParagraph"/>
-      </w:pPr>
-      <w:r>
-        <w:rPr>
-          <w:b/>
-          <w:bCs/>
-        </w:rPr>
-        <w:t xml:space="preserve">Why did the club do it?</w:t>
-      </w:r>
-      <w:r>
-        <w:t xml:space="preserve"> </w:t>
-      </w:r>
-      <w:r>
-        <w:rPr>
-          <w:i/>
-          <w:iCs/>
-        </w:rPr>
-        <w:t xml:space="preserve">(the need or opportunity it addressed)</w:t>
-      </w:r>
-    </w:p>
-    <w:p>
-      <w:r>
-        <w:pict>
-          <v:rect style="width:0;height:1.5pt" o:hralign="center" o:hrstd="t" o:hr="t"/>
-        </w:pict>
-      </w:r>
-    </w:p>
-    <w:p>
-      <w:r>
-        <w:pict>
-          <v:rect style="width:0;height:1.5pt" o:hralign="center" o:hrstd="t" o:hr="t"/>
-        </w:pict>
-      </w:r>
-    </w:p>
-    <w:p>
-      <w:pPr>
-        <w:pStyle w:val="FirstParagraph"/>
-      </w:pPr>
-      <w:r>
-        <w:rPr>
-          <w:b/>
-          <w:bCs/>
-        </w:rPr>
-        <w:t xml:space="preserve">Impact — what changed because of it?</w:t>
-      </w:r>
-      <w:r>
-        <w:t xml:space="preserve"> </w:t>
-      </w:r>
-      <w:r>
-        <w:rPr>
-          <w:i/>
-          <w:iCs/>
-        </w:rPr>
-        <w:t xml:space="preserve">(e.g. how many people attended / trained, what they took away)</w:t>
-      </w:r>
-    </w:p>
-    <w:p>
-      <w:r>
-        <w:pict>
-          <v:rect style="width:0;height:1.5pt" o:hralign="center" o:hrstd="t" o:hr="t"/>
-        </w:pict>
-      </w:r>
-    </w:p>
-    <w:p>
-      <w:r>
-        <w:pict>
-          <v:rect style="width:0;height:1.5pt" o:hralign="center" o:hrstd="t" o:hr="t"/>
-        </w:pict>
-      </w:r>
-    </w:p>
-    <w:p>
-      <w:r>
-        <w:pict>
-          <v:rect style="width:0;height:1.5pt" o:hralign="center" o:hrstd="t" o:hr="t"/>
-        </w:pict>
-      </w:r>
-    </w:p>
-    <w:bookmarkEnd w:id="11"/>
-    <w:bookmarkStart w:id="12" w:name="classification"/>
-    <w:p>
-      <w:pPr>
-        <w:pStyle w:val="Heading2"/>
-      </w:pPr>
-      <w:r>
-        <w:t xml:space="preserve">3 · Classification</w:t>
-      </w:r>
-    </w:p>
-    <w:p>
-      <w:pPr>
-        <w:pStyle w:val="FirstParagraph"/>
-      </w:pPr>
-      <w:r>
-        <w:rPr>
-          <w:b/>
-          <w:bCs/>
-        </w:rPr>
-        <w:t xml:space="preserve">Area of Focus:</w:t>
-      </w:r>
-      <w:r>
-        <w:t xml:space="preserve"> </w:t>
-      </w:r>
-      <w:r>
-        <w:t xml:space="preserve">☒ Supporting the Environment</w:t>
-      </w:r>
-      <w:r>
-        <w:t xml:space="preserve"> </w:t>
-      </w:r>
-      <w:r>
-        <w:rPr>
-          <w:i/>
-          <w:iCs/>
-        </w:rPr>
-        <w:t xml:space="preserve">(our best guess — change if you disagree:)</w:t>
-      </w:r>
-    </w:p>
-    <w:p>
-      <w:pPr>
-        <w:pStyle w:val="Compact"/>
-        <w:numPr>
-          <w:ilvl w:val="0"/>
-          <w:numId w:val="1001"/>
-        </w:numPr>
-      </w:pPr>
-      <w:r>
-        <w:t xml:space="preserve">Peace ☐ Disease ☐ Water ☐ Maternal/Child ☐ Education ☐ Economy</w:t>
-      </w:r>
-    </w:p>
-    <w:p>
-      <w:pPr>
-        <w:pStyle w:val="FirstParagraph"/>
-      </w:pPr>
-      <w:r>
-        <w:rPr>
-          <w:b/>
-          <w:bCs/>
-        </w:rPr>
-        <w:t xml:space="preserve">Funding:</w:t>
-      </w:r>
-      <w:r>
-        <w:t xml:space="preserve"> </w:t>
-      </w:r>
-      <w:r>
-        <w:t xml:space="preserve">☒ Club</w:t>
-      </w:r>
-      <w:r>
-        <w:t xml:space="preserve"> </w:t>
-      </w:r>
-      <w:r>
-        <w:rPr>
-          <w:i/>
-          <w:iCs/>
-        </w:rPr>
-        <w:t xml:space="preserve">(or: ☐ District Grant ☐ Global Grant ☐ Joint)</w:t>
-      </w:r>
-    </w:p>
-    <w:p>
-      <w:pPr>
-        <w:pStyle w:val="BodyText"/>
-      </w:pPr>
-      <w:r>
-        <w:rPr>
-          <w:b/>
-          <w:bCs/>
-        </w:rPr>
-        <w:t xml:space="preserve">Status:</w:t>
-      </w:r>
-      <w:r>
-        <w:t xml:space="preserve"> </w:t>
-      </w:r>
-      <w:r>
-        <w:t xml:space="preserve">☒ Completed</w:t>
-      </w:r>
-      <w:r>
-        <w:t xml:space="preserve"> </w:t>
-      </w:r>
-      <w:r>
-        <w:rPr>
-          <w:i/>
-          <w:iCs/>
-        </w:rPr>
-        <w:t xml:space="preserve">(or: ☐ Planning ☐ Execution ☐ Paused ☐ Dropped)</w:t>
-      </w:r>
-    </w:p>
-    <w:p>
-      <w:r>
-        <w:pict>
-          <v:rect style="width:0;height:1.5pt" o:hralign="center" o:hrstd="t" o:hr="t"/>
-        </w:pict>
-      </w:r>
-    </w:p>
-    <w:bookmarkEnd w:id="12"/>
-    <w:bookmarkStart w:id="13" w:name="when-where"/>
-    <w:p>
-      <w:pPr>
-        <w:pStyle w:val="Heading2"/>
-      </w:pPr>
-      <w:r>
-        <w:t xml:space="preserve">4 · When &amp; Where</w:t>
-      </w:r>
-    </w:p>
-    <w:p>
-      <w:pPr>
-        <w:pStyle w:val="FirstParagraph"/>
-      </w:pPr>
-      <w:r>
-        <w:rPr>
-          <w:b/>
-          <w:bCs/>
-        </w:rPr>
-        <w:t xml:space="preserve">Start date</w:t>
-      </w:r>
-      <w:r>
-        <w:t xml:space="preserve"> </w:t>
-      </w:r>
-      <w:r>
-        <w:rPr>
-          <w:i/>
-          <w:iCs/>
-        </w:rPr>
-        <w:t xml:space="preserve">(month is fine, e.g. 2024-09)</w:t>
-      </w:r>
-      <w:r>
-        <w:t xml:space="preserve">: _______________</w:t>
-      </w:r>
-    </w:p>
-    <w:p>
-      <w:pPr>
-        <w:pStyle w:val="BodyText"/>
-      </w:pPr>
-      <w:r>
-        <w:rPr>
-          <w:b/>
-          <w:bCs/>
-        </w:rPr>
-        <w:t xml:space="preserve">Completion date:</w:t>
-      </w:r>
-      <w:r>
-        <w:t xml:space="preserve"> </w:t>
-      </w:r>
-      <w:r>
-        <w:t xml:space="preserve">_______________</w:t>
-      </w:r>
-    </w:p>
-    <w:p>
-      <w:pPr>
-        <w:pStyle w:val="BodyText"/>
-      </w:pPr>
-      <w:r>
-        <w:rPr>
-          <w:b/>
-          <w:bCs/>
-        </w:rPr>
-        <w:t xml:space="preserve">Location:</w:t>
-      </w:r>
-      <w:r>
-        <w:t xml:space="preserve"> </w:t>
-      </w:r>
-      <w:r>
-        <w:t xml:space="preserve">Penang</w:t>
-      </w:r>
-      <w:r>
-        <w:t xml:space="preserve"> </w:t>
-      </w:r>
-      <w:r>
-        <w:rPr>
-          <w:i/>
-          <w:iCs/>
-        </w:rPr>
-        <w:t xml:space="preserve">(more specific venue if you have it: ____________________ )</w:t>
-      </w:r>
-    </w:p>
-    <w:p>
-      <w:r>
-        <w:pict>
-          <v:rect style="width:0;height:1.5pt" o:hralign="center" o:hrstd="t" o:hr="t"/>
-        </w:pict>
-      </w:r>
-    </w:p>
-    <w:bookmarkEnd w:id="13"/>
-    <w:bookmarkStart w:id="14" w:name="by-the-numbers"/>
-    <w:p>
-      <w:pPr>
-        <w:pStyle w:val="Heading2"/>
-      </w:pPr>
-      <w:r>
-        <w:t xml:space="preserve">5 · By the Numbers</w:t>
-      </w:r>
-    </w:p>
-    <w:p>
-      <w:pPr>
-        <w:pStyle w:val="FirstParagraph"/>
-      </w:pPr>
-      <w:r>
-        <w:rPr>
-          <w:b/>
-          <w:bCs/>
-        </w:rPr>
-        <w:t xml:space="preserve">Beneficiaries</w:t>
-      </w:r>
-      <w:r>
-        <w:t xml:space="preserve"> </w:t>
-      </w:r>
-      <w:r>
-        <w:rPr>
-          <w:i/>
-          <w:iCs/>
-        </w:rPr>
-        <w:t xml:space="preserve">(how many attended / were helped)</w:t>
-      </w:r>
-      <w:r>
-        <w:t xml:space="preserve">: _______________</w:t>
-      </w:r>
-    </w:p>
-    <w:p>
-      <w:pPr>
-        <w:pStyle w:val="BodyText"/>
-      </w:pPr>
-      <w:r>
-        <w:rPr>
-          <w:b/>
-          <w:bCs/>
-        </w:rPr>
-        <w:t xml:space="preserve">Project value (RM)</w:t>
-      </w:r>
-      <w:r>
-        <w:t xml:space="preserve"> </w:t>
-      </w:r>
-      <w:r>
-        <w:rPr>
-          <w:i/>
-          <w:iCs/>
-        </w:rPr>
-        <w:t xml:space="preserve">(total spent / value delivered)</w:t>
-      </w:r>
-      <w:r>
-        <w:t xml:space="preserve">: _______________</w:t>
-      </w:r>
-    </w:p>
-    <w:p>
-      <w:pPr>
-        <w:pStyle w:val="BodyText"/>
-      </w:pPr>
-      <w:r>
-        <w:rPr>
-          <w:b/>
-          <w:bCs/>
-        </w:rPr>
-        <w:t xml:space="preserve">Volunteer hours</w:t>
-      </w:r>
-      <w:r>
-        <w:t xml:space="preserve"> </w:t>
-      </w:r>
-      <w:r>
-        <w:rPr>
-          <w:i/>
-          <w:iCs/>
-        </w:rPr>
-        <w:t xml:space="preserve">(optional)</w:t>
-      </w:r>
-      <w:r>
-        <w:t xml:space="preserve">: _______________</w:t>
-      </w:r>
-    </w:p>
-    <w:p>
-      <w:r>
-        <w:pict>
-          <v:rect style="width:0;height:1.5pt" o:hralign="center" o:hrstd="t" o:hr="t"/>
-        </w:pict>
-      </w:r>
-    </w:p>
-    <w:bookmarkEnd w:id="14"/>
-    <w:bookmarkStart w:id="15" w:name="partners"/>
-    <w:p>
-      <w:pPr>
-        <w:pStyle w:val="Heading2"/>
-      </w:pPr>
-      <w:r>
-        <w:t xml:space="preserve">6 · Partners</w:t>
-      </w:r>
-    </w:p>
-    <w:p>
-      <w:pPr>
-        <w:pStyle w:val="FirstParagraph"/>
-      </w:pPr>
-      <w:r>
-        <w:rPr>
-          <w:b/>
-          <w:bCs/>
-        </w:rPr>
-        <w:t xml:space="preserve">Organisations, sponsors, or co-clubs involved</w:t>
-      </w:r>
-      <w:r>
-        <w:t xml:space="preserve"> </w:t>
-      </w:r>
-      <w:r>
-        <w:rPr>
-          <w:i/>
-          <w:iCs/>
-        </w:rPr>
-        <w:t xml:space="preserve">(one per line;</w:t>
-      </w:r>
-      <w:r>
-        <w:rPr>
-          <w:i/>
-          <w:iCs/>
-        </w:rPr>
-        <w:t xml:space="preserve"> </w:t>
-      </w:r>
-      <w:r>
-        <w:rPr>
-          <w:i/>
-          <w:iCs/>
-        </w:rPr>
-        <w:t xml:space="preserve">“none”</w:t>
-      </w:r>
-      <w:r>
-        <w:rPr>
-          <w:i/>
-          <w:iCs/>
-        </w:rPr>
-        <w:t xml:space="preserve"> </w:t>
-      </w:r>
-      <w:r>
-        <w:rPr>
-          <w:i/>
-          <w:iCs/>
-        </w:rPr>
-        <w:t xml:space="preserve">is fine)</w:t>
-      </w:r>
-    </w:p>
-    <w:p>
-      <w:r>
-        <w:pict>
-          <v:rect style="width:0;height:1.5pt" o:hralign="center" o:hrstd="t" o:hr="t"/>
-        </w:pict>
-      </w:r>
-    </w:p>
-    <w:p>
-      <w:r>
-        <w:pict>
-          <v:rect style="width:0;height:1.5pt" o:hralign="center" o:hrstd="t" o:hr="t"/>
-        </w:pict>
-      </w:r>
-    </w:p>
-    <w:bookmarkEnd w:id="15"/>
-    <w:bookmarkStart w:id="16" w:name="extras-all-optional"/>
-    <w:p>
-      <w:pPr>
-        <w:pStyle w:val="Heading2"/>
-      </w:pPr>
-      <w:r>
-        <w:t xml:space="preserve">7 · Extras</w:t>
-      </w:r>
-      <w:r>
-        <w:t xml:space="preserve"> </w:t>
-      </w:r>
-      <w:r>
-        <w:rPr>
-          <w:i/>
-          <w:iCs/>
-        </w:rPr>
-        <w:t xml:space="preserve">(all optional)</w:t>
-      </w:r>
-    </w:p>
-    <w:p>
-      <w:pPr>
-        <w:pStyle w:val="FirstParagraph"/>
-      </w:pPr>
-      <w:r>
-        <w:rPr>
-          <w:b/>
-          <w:bCs/>
-        </w:rPr>
-        <w:t xml:space="preserve">Photos?</w:t>
-      </w:r>
-      <w:r>
-        <w:t xml:space="preserve"> </w:t>
-      </w:r>
-      <w:r>
-        <w:rPr>
-          <w:i/>
-          <w:iCs/>
-        </w:rPr>
-        <w:t xml:space="preserve">(yes / no — where are they?)</w:t>
-      </w:r>
-    </w:p>
-    <w:p>
-      <w:r>
-        <w:pict>
-          <v:rect style="width:0;height:1.5pt" o:hralign="center" o:hrstd="t" o:hr="t"/>
-        </w:pict>
-      </w:r>
-    </w:p>
-    <w:p>
-      <w:pPr>
-        <w:pStyle w:val="FirstParagraph"/>
-      </w:pPr>
-      <w:r>
-        <w:rPr>
-          <w:b/>
-          <w:bCs/>
-        </w:rPr>
-        <w:t xml:space="preserve">Publicity</w:t>
-      </w:r>
-      <w:r>
-        <w:t xml:space="preserve"> </w:t>
-      </w:r>
-      <w:r>
-        <w:rPr>
-          <w:i/>
-          <w:iCs/>
-        </w:rPr>
-        <w:t xml:space="preserve">(any links or write-ups)</w:t>
-      </w:r>
-    </w:p>
-    <w:p>
-      <w:r>
-        <w:pict>
-          <v:rect style="width:0;height:1.5pt" o:hralign="center" o:hrstd="t" o:hr="t"/>
-        </w:pict>
-      </w:r>
-    </w:p>
-    <w:p>
-      <w:pPr>
-        <w:pStyle w:val="FirstParagraph"/>
-      </w:pPr>
-      <w:r>
-        <w:rPr>
-          <w:b/>
-          <w:bCs/>
-        </w:rPr>
-        <w:t xml:space="preserve">Lessons learned / would you repeat it?</w:t>
-      </w:r>
-    </w:p>
-    <w:p>
-      <w:r>
-        <w:pict>
-          <v:rect style="width:0;height:1.5pt" o:hralign="center" o:hrstd="t" o:hr="t"/>
-        </w:pict>
-      </w:r>
-    </w:p>
-    <w:p>
-      <w:pPr>
-        <w:pStyle w:val="FirstParagraph"/>
-      </w:pPr>
-      <w:r>
-        <w:rPr>
-          <w:b/>
-          <w:bCs/>
-        </w:rPr>
-        <w:t xml:space="preserve">Anything else we should record?</w:t>
-      </w:r>
-      <w:r>
-        <w:t xml:space="preserve"> </w:t>
-      </w:r>
-      <w:r>
-        <w:rPr>
-          <w:i/>
-          <w:iCs/>
-        </w:rPr>
         <w:t xml:space="preserve">(For our records: the club ran an earlier aquaponics installation at St Nicholas Home for the Blind in 2021-22 — was this workshop related to that?)</w:t>
       </w:r>
     </w:p>
     <w:p>
-      <w:r>
-        <w:pict>
-          <v:rect style="width:0;height:1.5pt" o:hralign="center" o:hrstd="t" o:hr="t"/>
-        </w:pict>
-      </w:r>
-    </w:p>
-    <w:p>
-      <w:r>
-        <w:pict>
-          <v:rect style="width:0;height:1.5pt" o:hralign="center" o:hrstd="t" o:hr="t"/>
-        </w:pict>
-      </w:r>
-    </w:p>
-    <w:p>
-      <w:pPr>
-        <w:pStyle w:val="FirstParagraph"/>
+      <w:pPr>
+        <w:pStyle w:val="BodyText"/>
+      </w:pPr>
+      <w:r>
+        <w:t xml:space="preserve"> </w:t>
+      </w:r>
+    </w:p>
+    <w:p>
+      <w:pPr>
+        <w:pStyle w:val="BodyText"/>
+      </w:pPr>
+      <w:r>
+        <w:t xml:space="preserve"> </w:t>
+      </w:r>
+    </w:p>
+    <w:p>
+      <w:pPr>
+        <w:pStyle w:val="BodyText"/>
       </w:pPr>
       <w:r>
         <w:rPr>
@@ -947,87 +809,8 @@
       </w:pPr>
     </w:lvl>
   </w:abstractNum>
-  <w:abstractNum w:abstractNumId="992">
-    <w:nsid w:val="0000A992"/>
-    <w:multiLevelType w:val="multilevel"/>
-    <w:lvl w:ilvl="0">
-      <w:numFmt w:val="bullet"/>
-      <w:lvlText w:val="☐"/>
-      <w:lvlJc w:val="left"/>
-      <w:pPr>
-        <w:ind w:left="720" w:hanging="360"/>
-      </w:pPr>
-    </w:lvl>
-    <w:lvl w:ilvl="1">
-      <w:numFmt w:val="bullet"/>
-      <w:lvlText w:val="☐"/>
-      <w:lvlJc w:val="left"/>
-      <w:pPr>
-        <w:ind w:left="1440" w:hanging="360"/>
-      </w:pPr>
-    </w:lvl>
-    <w:lvl w:ilvl="2">
-      <w:numFmt w:val="bullet"/>
-      <w:lvlText w:val="☐"/>
-      <w:lvlJc w:val="left"/>
-      <w:pPr>
-        <w:ind w:left="2160" w:hanging="360"/>
-      </w:pPr>
-    </w:lvl>
-    <w:lvl w:ilvl="3">
-      <w:numFmt w:val="bullet"/>
-      <w:lvlText w:val="☐"/>
-      <w:lvlJc w:val="left"/>
-      <w:pPr>
-        <w:ind w:left="2880" w:hanging="360"/>
-      </w:pPr>
-    </w:lvl>
-    <w:lvl w:ilvl="4">
-      <w:numFmt w:val="bullet"/>
-      <w:lvlText w:val="☐"/>
-      <w:lvlJc w:val="left"/>
-      <w:pPr>
-        <w:ind w:left="3600" w:hanging="360"/>
-      </w:pPr>
-    </w:lvl>
-    <w:lvl w:ilvl="5">
-      <w:numFmt w:val="bullet"/>
-      <w:lvlText w:val="☐"/>
-      <w:lvlJc w:val="left"/>
-      <w:pPr>
-        <w:ind w:left="4320" w:hanging="360"/>
-      </w:pPr>
-    </w:lvl>
-    <w:lvl w:ilvl="6">
-      <w:numFmt w:val="bullet"/>
-      <w:lvlText w:val="☐"/>
-      <w:lvlJc w:val="left"/>
-      <w:pPr>
-        <w:ind w:left="5040" w:hanging="360"/>
-      </w:pPr>
-    </w:lvl>
-    <w:lvl w:ilvl="7">
-      <w:numFmt w:val="bullet"/>
-      <w:lvlText w:val="☐"/>
-      <w:lvlJc w:val="left"/>
-      <w:pPr>
-        <w:ind w:left="5760" w:hanging="360"/>
-      </w:pPr>
-    </w:lvl>
-    <w:lvl w:ilvl="8">
-      <w:numFmt w:val="bullet"/>
-      <w:lvlText w:val="☐"/>
-      <w:lvlJc w:val="left"/>
-      <w:pPr>
-        <w:ind w:left="6480" w:hanging="360"/>
-      </w:pPr>
-    </w:lvl>
-  </w:abstractNum>
   <w:num w:numId="1000">
     <w:abstractNumId w:val="990"/>
-  </w:num>
-  <w:num w:numId="1001">
-    <w:abstractNumId w:val="992"/>
   </w:num>
 </w:numbering>
 </file>
@@ -1045,7 +828,7 @@
     </w:rPrDefault>
     <w:pPrDefault>
       <w:pPr>
-        <w:spacing w:after="200"/>
+        <w:spacing w:after="240" w:line="360" w:lineRule="auto"/>
       </w:pPr>
     </w:pPrDefault>
   </w:docDefaults>
@@ -1968,7 +1751,7 @@
     </a:clrScheme>
     <a:fontScheme name="Office">
       <a:majorFont>
-        <a:latin typeface="Aptos Display" panose="02110004020202020204"/>
+        <a:latin typeface="Calibri" panose="02110004020202020204"/>
         <a:ea typeface=""/>
         <a:cs typeface=""/>
         <a:font script="Jpan" typeface="游ゴシック Light"/>
@@ -2020,7 +1803,7 @@
         <a:font script="Tfng" typeface="Ebrima"/>
       </a:majorFont>
       <a:minorFont>
-        <a:latin typeface="Aptos" panose="02110004020202020204"/>
+        <a:latin typeface="Calibri" panose="02110004020202020204"/>
         <a:ea typeface=""/>
         <a:cs typeface=""/>
         <a:font script="Jpan" typeface="游明朝"/>

</xml_diff>

<commit_message>
docs(georgetown): rebuild Project Summary forms as branded Word tables
Restructured the .docx forms as real fillable forms — bordered two-column
tables (Field / Your answer) per section, type directly into the right cells.
Applied the club house standard from the brand guide: Open Sans body, Open
Sans Condensed headings, Heading 1 in Royal Blue (#17458F), Heading 2 in
Rotary Azure (#0067C8). Built via a custom branded pandoc reference doc
(kept in scratch; sources updated to the table layout).

Also remove a stray Word lock file and gitignore ~$*.docx.

Co-Authored-By: Claude Opus 4.8 (1M context) <noreply@anthropic.com>
</commit_message>
<xml_diff>
--- a/apps/georgetown/docs/templates/Project-Summary-Aquaponics-Workshop-for-Mike.docx
+++ b/apps/georgetown/docs/templates/Project-Summary-Aquaponics-Workshop-for-Mike.docx
@@ -2,32 +2,20 @@
 <file path=word/document.xml><?xml version="1.0" encoding="utf-8"?>
 <w:document xmlns:w="http://schemas.openxmlformats.org/wordprocessingml/2006/main" xmlns:m="http://schemas.openxmlformats.org/officeDocument/2006/math" xmlns:r="http://schemas.openxmlformats.org/officeDocument/2006/relationships" xmlns:o="urn:schemas-microsoft-com:office:office" xmlns:v="urn:schemas-microsoft-com:vml" xmlns:w10="urn:schemas-microsoft-com:office:word" xmlns:a="http://schemas.openxmlformats.org/drawingml/2006/main" xmlns:pic="http://schemas.openxmlformats.org/drawingml/2006/picture" xmlns:wp="http://schemas.openxmlformats.org/drawingml/2006/wordprocessingDrawing">
   <w:body>
-    <w:bookmarkStart w:id="17" w:name="rc-georgetown-project-summary-form"/>
     <w:p>
       <w:pPr>
-        <w:pStyle w:val="Heading1"/>
+        <w:pStyle w:val="Title"/>
       </w:pPr>
       <w:r>
         <w:t xml:space="preserve">RC Georgetown — Project Summary Form</w:t>
       </w:r>
     </w:p>
-    <w:bookmarkStart w:id="9" w:name="X93d6f82fd949fef3e6cf93257c2e4ecfde8ec73"/>
     <w:p>
       <w:pPr>
-        <w:pStyle w:val="Heading2"/>
+        <w:pStyle w:val="Author"/>
       </w:pPr>
       <w:r>
-        <w:t xml:space="preserve">Aquaponics Workshop</w:t>
-      </w:r>
-      <w:r>
-        <w:t xml:space="preserve"> </w:t>
-      </w:r>
-      <w:r>
-        <w:rPr>
-          <w:i/>
-          <w:iCs/>
-        </w:rPr>
-        <w:t xml:space="preserve">(draft for Mike Jackman to complete)</w:t>
+        <w:t xml:space="preserve">Aquaponics Workshop — draft for Mike Jackman</w:t>
       </w:r>
     </w:p>
     <w:p>
@@ -39,530 +27,882 @@
           <w:i/>
           <w:iCs/>
         </w:rPr>
-        <w:t xml:space="preserve">Hi Mike — we’ve started this from what we already have on record. Please correct anything wrong, and type your answers in the space under each blank prompt. Return it however suits you. Thank you!</w:t>
+        <w:t xml:space="preserve">Hi Mike — we’ve pre-filled what we have on record. Please correct anything wrong and type your answers into the blank right-hand cells. Thank you!</w:t>
       </w:r>
     </w:p>
-    <w:bookmarkEnd w:id="9"/>
-    <w:bookmarkStart w:id="10" w:name="project-identity"/>
+    <w:bookmarkStart w:id="9" w:name="project-identity"/>
     <w:p>
       <w:pPr>
         <w:pStyle w:val="Heading2"/>
       </w:pPr>
       <w:r>
-        <w:t xml:space="preserve">1 · Project Identity</w:t>
+        <w:t xml:space="preserve">Project Identity</w:t>
       </w:r>
     </w:p>
-    <w:p>
-      <w:pPr>
-        <w:pStyle w:val="FirstParagraph"/>
-      </w:pPr>
-      <w:r>
-        <w:rPr>
-          <w:b/>
-          <w:bCs/>
-        </w:rPr>
-        <w:t xml:space="preserve">Project name:</w:t>
-      </w:r>
-      <w:r>
-        <w:t xml:space="preserve"> </w:t>
-      </w:r>
-      <w:r>
-        <w:t xml:space="preserve">Aquaponics Workshop</w:t>
-      </w:r>
-      <w:r>
-        <w:t xml:space="preserve"> </w:t>
-      </w:r>
-      <w:r>
-        <w:rPr>
-          <w:i/>
-          <w:iCs/>
-        </w:rPr>
-        <w:t xml:space="preserve">(correct if it had a fuller name)</w:t>
-      </w:r>
-    </w:p>
-    <w:p>
-      <w:pPr>
-        <w:pStyle w:val="BodyText"/>
-      </w:pPr>
-      <w:r>
-        <w:rPr>
-          <w:b/>
-          <w:bCs/>
-        </w:rPr>
-        <w:t xml:space="preserve">Rotary year:</w:t>
-      </w:r>
-      <w:r>
-        <w:t xml:space="preserve"> </w:t>
-      </w:r>
-      <w:r>
-        <w:t xml:space="preserve">2024-25</w:t>
-      </w:r>
-    </w:p>
-    <w:p>
-      <w:pPr>
-        <w:pStyle w:val="BodyText"/>
-      </w:pPr>
-      <w:r>
-        <w:rPr>
-          <w:b/>
-          <w:bCs/>
-        </w:rPr>
-        <w:t xml:space="preserve">Champion:</w:t>
-      </w:r>
-      <w:r>
-        <w:t xml:space="preserve"> </w:t>
-      </w:r>
-      <w:r>
-        <w:t xml:space="preserve">Mike Jackman</w:t>
-      </w:r>
-    </w:p>
-    <w:bookmarkEnd w:id="10"/>
-    <w:bookmarkStart w:id="11" w:name="the-story"/>
+    <w:tbl>
+      <w:tblPr>
+        <w:tblStyle w:val="Table"/>
+        <w:tblW w:type="pct" w:w="5000"/>
+        <w:tblLayout w:type="fixed"/>
+        <w:tblLook w:firstRow="1" w:lastRow="0" w:firstColumn="0" w:lastColumn="0" w:noHBand="0" w:noVBand="0" w:val="0020"/>
+      </w:tblPr>
+      <w:tblGrid>
+        <w:gridCol w:w="2869"/>
+        <w:gridCol w:w="5050"/>
+      </w:tblGrid>
+      <w:tr>
+        <w:trPr>
+          <w:tblHeader w:val="on"/>
+        </w:trPr>
+        <w:tc>
+          <w:tcPr/>
+          <w:p>
+            <w:pPr>
+              <w:pStyle w:val="Compact"/>
+              <w:jc w:val="left"/>
+            </w:pPr>
+            <w:r>
+              <w:t xml:space="preserve">Field</w:t>
+            </w:r>
+          </w:p>
+        </w:tc>
+        <w:tc>
+          <w:tcPr/>
+          <w:p>
+            <w:pPr>
+              <w:pStyle w:val="Compact"/>
+              <w:jc w:val="left"/>
+            </w:pPr>
+            <w:r>
+              <w:t xml:space="preserve">Your answer</w:t>
+            </w:r>
+          </w:p>
+        </w:tc>
+      </w:tr>
+      <w:tr>
+        <w:tc>
+          <w:tcPr/>
+          <w:p>
+            <w:pPr>
+              <w:pStyle w:val="Compact"/>
+              <w:jc w:val="left"/>
+            </w:pPr>
+            <w:r>
+              <w:rPr>
+                <w:b/>
+                <w:bCs/>
+              </w:rPr>
+              <w:t xml:space="preserve">Project name</w:t>
+            </w:r>
+          </w:p>
+        </w:tc>
+        <w:tc>
+          <w:tcPr/>
+          <w:p>
+            <w:pPr>
+              <w:pStyle w:val="Compact"/>
+              <w:jc w:val="left"/>
+            </w:pPr>
+            <w:r>
+              <w:t xml:space="preserve">Aquaponics Workshop</w:t>
+            </w:r>
+            <w:r>
+              <w:t xml:space="preserve"> </w:t>
+            </w:r>
+            <w:r>
+              <w:rPr>
+                <w:i/>
+                <w:iCs/>
+              </w:rPr>
+              <w:t xml:space="preserve">(correct if it had a fuller name)</w:t>
+            </w:r>
+          </w:p>
+        </w:tc>
+      </w:tr>
+      <w:tr>
+        <w:tc>
+          <w:tcPr/>
+          <w:p>
+            <w:pPr>
+              <w:pStyle w:val="Compact"/>
+              <w:jc w:val="left"/>
+            </w:pPr>
+            <w:r>
+              <w:rPr>
+                <w:b/>
+                <w:bCs/>
+              </w:rPr>
+              <w:t xml:space="preserve">Rotary year</w:t>
+            </w:r>
+          </w:p>
+        </w:tc>
+        <w:tc>
+          <w:tcPr/>
+          <w:p>
+            <w:pPr>
+              <w:pStyle w:val="Compact"/>
+              <w:jc w:val="left"/>
+            </w:pPr>
+            <w:r>
+              <w:t xml:space="preserve">2024-25</w:t>
+            </w:r>
+          </w:p>
+        </w:tc>
+      </w:tr>
+      <w:tr>
+        <w:tc>
+          <w:tcPr/>
+          <w:p>
+            <w:pPr>
+              <w:pStyle w:val="Compact"/>
+              <w:jc w:val="left"/>
+            </w:pPr>
+            <w:r>
+              <w:rPr>
+                <w:b/>
+                <w:bCs/>
+              </w:rPr>
+              <w:t xml:space="preserve">Champion</w:t>
+            </w:r>
+          </w:p>
+        </w:tc>
+        <w:tc>
+          <w:tcPr/>
+          <w:p>
+            <w:pPr>
+              <w:pStyle w:val="Compact"/>
+              <w:jc w:val="left"/>
+            </w:pPr>
+            <w:r>
+              <w:t xml:space="preserve">Mike Jackman</w:t>
+            </w:r>
+          </w:p>
+        </w:tc>
+      </w:tr>
+    </w:tbl>
+    <w:bookmarkEnd w:id="9"/>
+    <w:bookmarkStart w:id="10" w:name="the-story"/>
     <w:p>
       <w:pPr>
         <w:pStyle w:val="Heading2"/>
       </w:pPr>
       <w:r>
-        <w:t xml:space="preserve">2 · The Story</w:t>
+        <w:t xml:space="preserve">The Story</w:t>
       </w:r>
     </w:p>
-    <w:p>
-      <w:pPr>
-        <w:pStyle w:val="FirstParagraph"/>
-      </w:pPr>
-      <w:r>
-        <w:rPr>
-          <w:b/>
-          <w:bCs/>
-        </w:rPr>
-        <w:t xml:space="preserve">What was it?</w:t>
-      </w:r>
-      <w:r>
-        <w:t xml:space="preserve"> </w:t>
-      </w:r>
-      <w:r>
-        <w:t xml:space="preserve">(one or two sentences)</w:t>
-      </w:r>
-    </w:p>
-    <w:p>
-      <w:pPr>
-        <w:pStyle w:val="BodyText"/>
-      </w:pPr>
-      <w:r>
-        <w:t xml:space="preserve"> </w:t>
-      </w:r>
-    </w:p>
-    <w:p>
-      <w:pPr>
-        <w:pStyle w:val="BodyText"/>
-      </w:pPr>
-      <w:r>
-        <w:t xml:space="preserve"> </w:t>
-      </w:r>
-    </w:p>
-    <w:p>
-      <w:pPr>
-        <w:pStyle w:val="BodyText"/>
-      </w:pPr>
-      <w:r>
-        <w:rPr>
-          <w:b/>
-          <w:bCs/>
-        </w:rPr>
-        <w:t xml:space="preserve">Why did the club do it?</w:t>
-      </w:r>
-      <w:r>
-        <w:t xml:space="preserve"> </w:t>
-      </w:r>
-      <w:r>
-        <w:t xml:space="preserve">(the need or opportunity it addressed)</w:t>
-      </w:r>
-    </w:p>
-    <w:p>
-      <w:pPr>
-        <w:pStyle w:val="BodyText"/>
-      </w:pPr>
-      <w:r>
-        <w:t xml:space="preserve"> </w:t>
-      </w:r>
-    </w:p>
-    <w:p>
-      <w:pPr>
-        <w:pStyle w:val="BodyText"/>
-      </w:pPr>
-      <w:r>
-        <w:t xml:space="preserve"> </w:t>
-      </w:r>
-    </w:p>
-    <w:p>
-      <w:pPr>
-        <w:pStyle w:val="BodyText"/>
-      </w:pPr>
-      <w:r>
-        <w:rPr>
-          <w:b/>
-          <w:bCs/>
-        </w:rPr>
-        <w:t xml:space="preserve">Impact — what changed because of it?</w:t>
-      </w:r>
-      <w:r>
-        <w:t xml:space="preserve"> </w:t>
-      </w:r>
-      <w:r>
-        <w:t xml:space="preserve">(e.g. how many people attended / trained, what they took away)</w:t>
-      </w:r>
-    </w:p>
-    <w:p>
-      <w:pPr>
-        <w:pStyle w:val="BodyText"/>
-      </w:pPr>
-      <w:r>
-        <w:t xml:space="preserve"> </w:t>
-      </w:r>
-    </w:p>
-    <w:p>
-      <w:pPr>
-        <w:pStyle w:val="BodyText"/>
-      </w:pPr>
-      <w:r>
-        <w:t xml:space="preserve"> </w:t>
-      </w:r>
-    </w:p>
-    <w:bookmarkEnd w:id="11"/>
-    <w:bookmarkStart w:id="12" w:name="classification"/>
+    <w:tbl>
+      <w:tblPr>
+        <w:tblStyle w:val="Table"/>
+        <w:tblW w:type="auto" w:w="0"/>
+        <w:tblLook w:firstRow="1" w:lastRow="0" w:firstColumn="0" w:lastColumn="0" w:noHBand="0" w:noVBand="0" w:val="0020"/>
+      </w:tblPr>
+      <w:tblGrid>
+        <w:gridCol w:w="3960"/>
+        <w:gridCol w:w="3960"/>
+      </w:tblGrid>
+      <w:tr>
+        <w:trPr>
+          <w:tblHeader w:val="on"/>
+        </w:trPr>
+        <w:tc>
+          <w:tcPr/>
+          <w:p>
+            <w:pPr>
+              <w:pStyle w:val="Compact"/>
+              <w:jc w:val="left"/>
+            </w:pPr>
+            <w:r>
+              <w:t xml:space="preserve">Prompt</w:t>
+            </w:r>
+          </w:p>
+        </w:tc>
+        <w:tc>
+          <w:tcPr/>
+          <w:p>
+            <w:pPr>
+              <w:pStyle w:val="Compact"/>
+              <w:jc w:val="left"/>
+            </w:pPr>
+            <w:r>
+              <w:t xml:space="preserve">Your answer</w:t>
+            </w:r>
+          </w:p>
+        </w:tc>
+      </w:tr>
+      <w:tr>
+        <w:tc>
+          <w:tcPr/>
+          <w:p>
+            <w:pPr>
+              <w:pStyle w:val="Compact"/>
+              <w:jc w:val="left"/>
+            </w:pPr>
+            <w:r>
+              <w:rPr>
+                <w:b/>
+                <w:bCs/>
+              </w:rPr>
+              <w:t xml:space="preserve">What was it?</w:t>
+            </w:r>
+            <w:r>
+              <w:t xml:space="preserve"> </w:t>
+            </w:r>
+            <w:r>
+              <w:rPr>
+                <w:i/>
+                <w:iCs/>
+              </w:rPr>
+              <w:t xml:space="preserve">(one or two sentences)</w:t>
+            </w:r>
+          </w:p>
+        </w:tc>
+        <w:tc>
+          <w:tcPr/>
+          <w:p>
+            <w:pPr>
+              <w:pStyle w:val="Compact"/>
+            </w:pPr>
+          </w:p>
+        </w:tc>
+      </w:tr>
+      <w:tr>
+        <w:tc>
+          <w:tcPr/>
+          <w:p>
+            <w:pPr>
+              <w:pStyle w:val="Compact"/>
+              <w:jc w:val="left"/>
+            </w:pPr>
+            <w:r>
+              <w:rPr>
+                <w:b/>
+                <w:bCs/>
+              </w:rPr>
+              <w:t xml:space="preserve">Why did the club do it?</w:t>
+            </w:r>
+            <w:r>
+              <w:t xml:space="preserve"> </w:t>
+            </w:r>
+            <w:r>
+              <w:rPr>
+                <w:i/>
+                <w:iCs/>
+              </w:rPr>
+              <w:t xml:space="preserve">(the need it addressed)</w:t>
+            </w:r>
+          </w:p>
+        </w:tc>
+        <w:tc>
+          <w:tcPr/>
+          <w:p>
+            <w:pPr>
+              <w:pStyle w:val="Compact"/>
+            </w:pPr>
+          </w:p>
+        </w:tc>
+      </w:tr>
+      <w:tr>
+        <w:tc>
+          <w:tcPr/>
+          <w:p>
+            <w:pPr>
+              <w:pStyle w:val="Compact"/>
+              <w:jc w:val="left"/>
+            </w:pPr>
+            <w:r>
+              <w:rPr>
+                <w:b/>
+                <w:bCs/>
+              </w:rPr>
+              <w:t xml:space="preserve">Impact</w:t>
+            </w:r>
+            <w:r>
+              <w:t xml:space="preserve"> </w:t>
+            </w:r>
+            <w:r>
+              <w:rPr>
+                <w:i/>
+                <w:iCs/>
+              </w:rPr>
+              <w:t xml:space="preserve">(what changed — in human terms)</w:t>
+            </w:r>
+          </w:p>
+        </w:tc>
+        <w:tc>
+          <w:tcPr/>
+          <w:p>
+            <w:pPr>
+              <w:pStyle w:val="Compact"/>
+            </w:pPr>
+          </w:p>
+        </w:tc>
+      </w:tr>
+    </w:tbl>
+    <w:bookmarkEnd w:id="10"/>
+    <w:bookmarkStart w:id="11" w:name="classification"/>
     <w:p>
       <w:pPr>
         <w:pStyle w:val="Heading2"/>
       </w:pPr>
       <w:r>
-        <w:t xml:space="preserve">3 · Classification</w:t>
+        <w:t xml:space="preserve">Classification</w:t>
       </w:r>
     </w:p>
-    <w:p>
-      <w:pPr>
-        <w:pStyle w:val="FirstParagraph"/>
-      </w:pPr>
-      <w:r>
-        <w:rPr>
-          <w:b/>
-          <w:bCs/>
-        </w:rPr>
-        <w:t xml:space="preserve">Area of Focus:</w:t>
-      </w:r>
-      <w:r>
-        <w:t xml:space="preserve"> </w:t>
-      </w:r>
-      <w:r>
-        <w:t xml:space="preserve">Environment</w:t>
-      </w:r>
-      <w:r>
-        <w:t xml:space="preserve"> </w:t>
-      </w:r>
-      <w:r>
-        <w:rPr>
-          <w:i/>
-          <w:iCs/>
-        </w:rPr>
-        <w:t xml:space="preserve">(our best guess — change if you disagree)</w:t>
-      </w:r>
-    </w:p>
-    <w:p>
-      <w:pPr>
-        <w:pStyle w:val="BodyText"/>
-      </w:pPr>
-      <w:r>
-        <w:rPr>
-          <w:b/>
-          <w:bCs/>
-        </w:rPr>
-        <w:t xml:space="preserve">Funding:</w:t>
-      </w:r>
-      <w:r>
-        <w:t xml:space="preserve"> </w:t>
-      </w:r>
-      <w:r>
-        <w:t xml:space="preserve">Club</w:t>
-      </w:r>
-    </w:p>
-    <w:p>
-      <w:pPr>
-        <w:pStyle w:val="BodyText"/>
-      </w:pPr>
-      <w:r>
-        <w:rPr>
-          <w:b/>
-          <w:bCs/>
-        </w:rPr>
-        <w:t xml:space="preserve">Status:</w:t>
-      </w:r>
-      <w:r>
-        <w:t xml:space="preserve"> </w:t>
-      </w:r>
-      <w:r>
-        <w:t xml:space="preserve">Completed</w:t>
-      </w:r>
-    </w:p>
-    <w:bookmarkEnd w:id="12"/>
-    <w:bookmarkStart w:id="13" w:name="when-where"/>
+    <w:tbl>
+      <w:tblPr>
+        <w:tblStyle w:val="Table"/>
+        <w:tblW w:type="auto" w:w="0"/>
+        <w:tblLook w:firstRow="1" w:lastRow="0" w:firstColumn="0" w:lastColumn="0" w:noHBand="0" w:noVBand="0" w:val="0020"/>
+      </w:tblPr>
+      <w:tblGrid>
+        <w:gridCol w:w="3960"/>
+        <w:gridCol w:w="3960"/>
+      </w:tblGrid>
+      <w:tr>
+        <w:trPr>
+          <w:tblHeader w:val="on"/>
+        </w:trPr>
+        <w:tc>
+          <w:tcPr/>
+          <w:p>
+            <w:pPr>
+              <w:pStyle w:val="Compact"/>
+              <w:jc w:val="left"/>
+            </w:pPr>
+            <w:r>
+              <w:t xml:space="preserve">Field</w:t>
+            </w:r>
+          </w:p>
+        </w:tc>
+        <w:tc>
+          <w:tcPr/>
+          <w:p>
+            <w:pPr>
+              <w:pStyle w:val="Compact"/>
+              <w:jc w:val="left"/>
+            </w:pPr>
+            <w:r>
+              <w:t xml:space="preserve">Your answer</w:t>
+            </w:r>
+          </w:p>
+        </w:tc>
+      </w:tr>
+      <w:tr>
+        <w:tc>
+          <w:tcPr/>
+          <w:p>
+            <w:pPr>
+              <w:pStyle w:val="Compact"/>
+              <w:jc w:val="left"/>
+            </w:pPr>
+            <w:r>
+              <w:rPr>
+                <w:b/>
+                <w:bCs/>
+              </w:rPr>
+              <w:t xml:space="preserve">Area of Focus</w:t>
+            </w:r>
+            <w:r>
+              <w:t xml:space="preserve"> </w:t>
+            </w:r>
+            <w:r>
+              <w:rPr>
+                <w:i/>
+                <w:iCs/>
+              </w:rPr>
+              <w:t xml:space="preserve">(change if you disagree)</w:t>
+            </w:r>
+          </w:p>
+        </w:tc>
+        <w:tc>
+          <w:tcPr/>
+          <w:p>
+            <w:pPr>
+              <w:pStyle w:val="Compact"/>
+              <w:jc w:val="left"/>
+            </w:pPr>
+            <w:r>
+              <w:t xml:space="preserve">Environment</w:t>
+            </w:r>
+          </w:p>
+        </w:tc>
+      </w:tr>
+      <w:tr>
+        <w:tc>
+          <w:tcPr/>
+          <w:p>
+            <w:pPr>
+              <w:pStyle w:val="Compact"/>
+              <w:jc w:val="left"/>
+            </w:pPr>
+            <w:r>
+              <w:rPr>
+                <w:b/>
+                <w:bCs/>
+              </w:rPr>
+              <w:t xml:space="preserve">Funding</w:t>
+            </w:r>
+          </w:p>
+        </w:tc>
+        <w:tc>
+          <w:tcPr/>
+          <w:p>
+            <w:pPr>
+              <w:pStyle w:val="Compact"/>
+              <w:jc w:val="left"/>
+            </w:pPr>
+            <w:r>
+              <w:t xml:space="preserve">Club</w:t>
+            </w:r>
+          </w:p>
+        </w:tc>
+      </w:tr>
+      <w:tr>
+        <w:tc>
+          <w:tcPr/>
+          <w:p>
+            <w:pPr>
+              <w:pStyle w:val="Compact"/>
+              <w:jc w:val="left"/>
+            </w:pPr>
+            <w:r>
+              <w:rPr>
+                <w:b/>
+                <w:bCs/>
+              </w:rPr>
+              <w:t xml:space="preserve">Status</w:t>
+            </w:r>
+          </w:p>
+        </w:tc>
+        <w:tc>
+          <w:tcPr/>
+          <w:p>
+            <w:pPr>
+              <w:pStyle w:val="Compact"/>
+              <w:jc w:val="left"/>
+            </w:pPr>
+            <w:r>
+              <w:t xml:space="preserve">Completed</w:t>
+            </w:r>
+          </w:p>
+        </w:tc>
+      </w:tr>
+    </w:tbl>
+    <w:bookmarkEnd w:id="11"/>
+    <w:bookmarkStart w:id="12" w:name="when-where"/>
     <w:p>
       <w:pPr>
         <w:pStyle w:val="Heading2"/>
       </w:pPr>
       <w:r>
-        <w:t xml:space="preserve">4 · When &amp; Where</w:t>
+        <w:t xml:space="preserve">When &amp; Where</w:t>
       </w:r>
     </w:p>
-    <w:p>
-      <w:pPr>
-        <w:pStyle w:val="FirstParagraph"/>
-      </w:pPr>
-      <w:r>
-        <w:rPr>
-          <w:b/>
-          <w:bCs/>
-        </w:rPr>
-        <w:t xml:space="preserve">Start date</w:t>
-      </w:r>
-      <w:r>
-        <w:t xml:space="preserve"> </w:t>
-      </w:r>
-      <w:r>
-        <w:t xml:space="preserve">(month is fine, e.g. 2024-09)</w:t>
-      </w:r>
-      <w:r>
-        <w:rPr>
-          <w:b/>
-          <w:bCs/>
-        </w:rPr>
-        <w:t xml:space="preserve">:</w:t>
-      </w:r>
-    </w:p>
-    <w:p>
-      <w:pPr>
-        <w:pStyle w:val="BodyText"/>
-      </w:pPr>
-      <w:r>
-        <w:t xml:space="preserve"> </w:t>
-      </w:r>
-    </w:p>
-    <w:p>
-      <w:pPr>
-        <w:pStyle w:val="BodyText"/>
-      </w:pPr>
-      <w:r>
-        <w:rPr>
-          <w:b/>
-          <w:bCs/>
-        </w:rPr>
-        <w:t xml:space="preserve">Completion date:</w:t>
-      </w:r>
-    </w:p>
-    <w:p>
-      <w:pPr>
-        <w:pStyle w:val="BodyText"/>
-      </w:pPr>
-      <w:r>
-        <w:t xml:space="preserve"> </w:t>
-      </w:r>
-    </w:p>
-    <w:p>
-      <w:pPr>
-        <w:pStyle w:val="BodyText"/>
-      </w:pPr>
-      <w:r>
-        <w:rPr>
-          <w:b/>
-          <w:bCs/>
-        </w:rPr>
-        <w:t xml:space="preserve">Location:</w:t>
-      </w:r>
-      <w:r>
-        <w:t xml:space="preserve"> </w:t>
-      </w:r>
-      <w:r>
-        <w:t xml:space="preserve">Penang</w:t>
-      </w:r>
-      <w:r>
-        <w:t xml:space="preserve"> </w:t>
-      </w:r>
-      <w:r>
-        <w:rPr>
-          <w:i/>
-          <w:iCs/>
-        </w:rPr>
-        <w:t xml:space="preserve">(more specific venue if you have it)</w:t>
-      </w:r>
-    </w:p>
-    <w:p>
-      <w:pPr>
-        <w:pStyle w:val="BodyText"/>
-      </w:pPr>
-      <w:r>
-        <w:t xml:space="preserve"> </w:t>
-      </w:r>
-    </w:p>
-    <w:bookmarkEnd w:id="13"/>
-    <w:bookmarkStart w:id="14" w:name="by-the-numbers"/>
+    <w:tbl>
+      <w:tblPr>
+        <w:tblStyle w:val="Table"/>
+        <w:tblW w:type="auto" w:w="0"/>
+        <w:tblLook w:firstRow="1" w:lastRow="0" w:firstColumn="0" w:lastColumn="0" w:noHBand="0" w:noVBand="0" w:val="0020"/>
+      </w:tblPr>
+      <w:tblGrid>
+        <w:gridCol w:w="3960"/>
+        <w:gridCol w:w="3960"/>
+      </w:tblGrid>
+      <w:tr>
+        <w:trPr>
+          <w:tblHeader w:val="on"/>
+        </w:trPr>
+        <w:tc>
+          <w:tcPr/>
+          <w:p>
+            <w:pPr>
+              <w:pStyle w:val="Compact"/>
+              <w:jc w:val="left"/>
+            </w:pPr>
+            <w:r>
+              <w:t xml:space="preserve">Field</w:t>
+            </w:r>
+          </w:p>
+        </w:tc>
+        <w:tc>
+          <w:tcPr/>
+          <w:p>
+            <w:pPr>
+              <w:pStyle w:val="Compact"/>
+              <w:jc w:val="left"/>
+            </w:pPr>
+            <w:r>
+              <w:t xml:space="preserve">Your answer</w:t>
+            </w:r>
+          </w:p>
+        </w:tc>
+      </w:tr>
+      <w:tr>
+        <w:tc>
+          <w:tcPr/>
+          <w:p>
+            <w:pPr>
+              <w:pStyle w:val="Compact"/>
+              <w:jc w:val="left"/>
+            </w:pPr>
+            <w:r>
+              <w:rPr>
+                <w:b/>
+                <w:bCs/>
+              </w:rPr>
+              <w:t xml:space="preserve">Start date</w:t>
+            </w:r>
+            <w:r>
+              <w:t xml:space="preserve"> </w:t>
+            </w:r>
+            <w:r>
+              <w:rPr>
+                <w:i/>
+                <w:iCs/>
+              </w:rPr>
+              <w:t xml:space="preserve">(e.g. 2024-09)</w:t>
+            </w:r>
+          </w:p>
+        </w:tc>
+        <w:tc>
+          <w:tcPr/>
+          <w:p>
+            <w:pPr>
+              <w:pStyle w:val="Compact"/>
+            </w:pPr>
+          </w:p>
+        </w:tc>
+      </w:tr>
+      <w:tr>
+        <w:tc>
+          <w:tcPr/>
+          <w:p>
+            <w:pPr>
+              <w:pStyle w:val="Compact"/>
+              <w:jc w:val="left"/>
+            </w:pPr>
+            <w:r>
+              <w:rPr>
+                <w:b/>
+                <w:bCs/>
+              </w:rPr>
+              <w:t xml:space="preserve">Completion date</w:t>
+            </w:r>
+          </w:p>
+        </w:tc>
+        <w:tc>
+          <w:tcPr/>
+          <w:p>
+            <w:pPr>
+              <w:pStyle w:val="Compact"/>
+            </w:pPr>
+          </w:p>
+        </w:tc>
+      </w:tr>
+      <w:tr>
+        <w:tc>
+          <w:tcPr/>
+          <w:p>
+            <w:pPr>
+              <w:pStyle w:val="Compact"/>
+              <w:jc w:val="left"/>
+            </w:pPr>
+            <w:r>
+              <w:rPr>
+                <w:b/>
+                <w:bCs/>
+              </w:rPr>
+              <w:t xml:space="preserve">Location</w:t>
+            </w:r>
+          </w:p>
+        </w:tc>
+        <w:tc>
+          <w:tcPr/>
+          <w:p>
+            <w:pPr>
+              <w:pStyle w:val="Compact"/>
+              <w:jc w:val="left"/>
+            </w:pPr>
+            <w:r>
+              <w:t xml:space="preserve">Penang</w:t>
+            </w:r>
+            <w:r>
+              <w:t xml:space="preserve"> </w:t>
+            </w:r>
+            <w:r>
+              <w:rPr>
+                <w:i/>
+                <w:iCs/>
+              </w:rPr>
+              <w:t xml:space="preserve">(more specific venue if you have it)</w:t>
+            </w:r>
+          </w:p>
+        </w:tc>
+      </w:tr>
+    </w:tbl>
+    <w:bookmarkEnd w:id="12"/>
+    <w:bookmarkStart w:id="13" w:name="by-the-numbers"/>
     <w:p>
       <w:pPr>
         <w:pStyle w:val="Heading2"/>
       </w:pPr>
       <w:r>
-        <w:t xml:space="preserve">5 · By the Numbers</w:t>
+        <w:t xml:space="preserve">By the Numbers</w:t>
       </w:r>
     </w:p>
-    <w:p>
-      <w:pPr>
-        <w:pStyle w:val="FirstParagraph"/>
-      </w:pPr>
-      <w:r>
-        <w:rPr>
-          <w:b/>
-          <w:bCs/>
-        </w:rPr>
-        <w:t xml:space="preserve">Beneficiaries</w:t>
-      </w:r>
-      <w:r>
-        <w:t xml:space="preserve"> </w:t>
-      </w:r>
-      <w:r>
-        <w:t xml:space="preserve">(how many attended / were helped)</w:t>
-      </w:r>
-      <w:r>
-        <w:rPr>
-          <w:b/>
-          <w:bCs/>
-        </w:rPr>
-        <w:t xml:space="preserve">:</w:t>
-      </w:r>
-    </w:p>
-    <w:p>
-      <w:pPr>
-        <w:pStyle w:val="BodyText"/>
-      </w:pPr>
-      <w:r>
-        <w:t xml:space="preserve"> </w:t>
-      </w:r>
-    </w:p>
-    <w:p>
-      <w:pPr>
-        <w:pStyle w:val="BodyText"/>
-      </w:pPr>
-      <w:r>
-        <w:rPr>
-          <w:b/>
-          <w:bCs/>
-        </w:rPr>
-        <w:t xml:space="preserve">Project value (RM)</w:t>
-      </w:r>
-      <w:r>
-        <w:t xml:space="preserve"> </w:t>
-      </w:r>
-      <w:r>
-        <w:t xml:space="preserve">(total spent / value delivered)</w:t>
-      </w:r>
-      <w:r>
-        <w:rPr>
-          <w:b/>
-          <w:bCs/>
-        </w:rPr>
-        <w:t xml:space="preserve">:</w:t>
-      </w:r>
-    </w:p>
-    <w:p>
-      <w:pPr>
-        <w:pStyle w:val="BodyText"/>
-      </w:pPr>
-      <w:r>
-        <w:t xml:space="preserve"> </w:t>
-      </w:r>
-    </w:p>
-    <w:p>
-      <w:pPr>
-        <w:pStyle w:val="BodyText"/>
-      </w:pPr>
-      <w:r>
-        <w:rPr>
-          <w:b/>
-          <w:bCs/>
-        </w:rPr>
-        <w:t xml:space="preserve">Volunteer hours</w:t>
-      </w:r>
-      <w:r>
-        <w:t xml:space="preserve"> </w:t>
-      </w:r>
-      <w:r>
-        <w:t xml:space="preserve">(optional)</w:t>
-      </w:r>
-      <w:r>
-        <w:rPr>
-          <w:b/>
-          <w:bCs/>
-        </w:rPr>
-        <w:t xml:space="preserve">:</w:t>
-      </w:r>
-    </w:p>
-    <w:p>
-      <w:pPr>
-        <w:pStyle w:val="BodyText"/>
-      </w:pPr>
-      <w:r>
-        <w:t xml:space="preserve"> </w:t>
-      </w:r>
-    </w:p>
-    <w:bookmarkEnd w:id="14"/>
-    <w:bookmarkStart w:id="15" w:name="partners"/>
+    <w:tbl>
+      <w:tblPr>
+        <w:tblStyle w:val="Table"/>
+        <w:tblW w:type="auto" w:w="0"/>
+        <w:tblLook w:firstRow="1" w:lastRow="0" w:firstColumn="0" w:lastColumn="0" w:noHBand="0" w:noVBand="0" w:val="0020"/>
+      </w:tblPr>
+      <w:tblGrid>
+        <w:gridCol w:w="3960"/>
+        <w:gridCol w:w="3960"/>
+      </w:tblGrid>
+      <w:tr>
+        <w:trPr>
+          <w:tblHeader w:val="on"/>
+        </w:trPr>
+        <w:tc>
+          <w:tcPr/>
+          <w:p>
+            <w:pPr>
+              <w:pStyle w:val="Compact"/>
+              <w:jc w:val="left"/>
+            </w:pPr>
+            <w:r>
+              <w:t xml:space="preserve">Field</w:t>
+            </w:r>
+          </w:p>
+        </w:tc>
+        <w:tc>
+          <w:tcPr/>
+          <w:p>
+            <w:pPr>
+              <w:pStyle w:val="Compact"/>
+              <w:jc w:val="left"/>
+            </w:pPr>
+            <w:r>
+              <w:t xml:space="preserve">Your answer</w:t>
+            </w:r>
+          </w:p>
+        </w:tc>
+      </w:tr>
+      <w:tr>
+        <w:tc>
+          <w:tcPr/>
+          <w:p>
+            <w:pPr>
+              <w:pStyle w:val="Compact"/>
+              <w:jc w:val="left"/>
+            </w:pPr>
+            <w:r>
+              <w:rPr>
+                <w:b/>
+                <w:bCs/>
+              </w:rPr>
+              <w:t xml:space="preserve">Beneficiaries</w:t>
+            </w:r>
+            <w:r>
+              <w:t xml:space="preserve"> </w:t>
+            </w:r>
+            <w:r>
+              <w:rPr>
+                <w:i/>
+                <w:iCs/>
+              </w:rPr>
+              <w:t xml:space="preserve">(how many attended / helped)</w:t>
+            </w:r>
+          </w:p>
+        </w:tc>
+        <w:tc>
+          <w:tcPr/>
+          <w:p>
+            <w:pPr>
+              <w:pStyle w:val="Compact"/>
+            </w:pPr>
+          </w:p>
+        </w:tc>
+      </w:tr>
+      <w:tr>
+        <w:tc>
+          <w:tcPr/>
+          <w:p>
+            <w:pPr>
+              <w:pStyle w:val="Compact"/>
+              <w:jc w:val="left"/>
+            </w:pPr>
+            <w:r>
+              <w:rPr>
+                <w:b/>
+                <w:bCs/>
+              </w:rPr>
+              <w:t xml:space="preserve">Project value (RM)</w:t>
+            </w:r>
+          </w:p>
+        </w:tc>
+        <w:tc>
+          <w:tcPr/>
+          <w:p>
+            <w:pPr>
+              <w:pStyle w:val="Compact"/>
+            </w:pPr>
+          </w:p>
+        </w:tc>
+      </w:tr>
+      <w:tr>
+        <w:tc>
+          <w:tcPr/>
+          <w:p>
+            <w:pPr>
+              <w:pStyle w:val="Compact"/>
+              <w:jc w:val="left"/>
+            </w:pPr>
+            <w:r>
+              <w:rPr>
+                <w:b/>
+                <w:bCs/>
+              </w:rPr>
+              <w:t xml:space="preserve">Volunteer hours</w:t>
+            </w:r>
+            <w:r>
+              <w:t xml:space="preserve"> </w:t>
+            </w:r>
+            <w:r>
+              <w:rPr>
+                <w:i/>
+                <w:iCs/>
+              </w:rPr>
+              <w:t xml:space="preserve">(optional)</w:t>
+            </w:r>
+          </w:p>
+        </w:tc>
+        <w:tc>
+          <w:tcPr/>
+          <w:p>
+            <w:pPr>
+              <w:pStyle w:val="Compact"/>
+            </w:pPr>
+          </w:p>
+        </w:tc>
+      </w:tr>
+    </w:tbl>
+    <w:bookmarkEnd w:id="13"/>
+    <w:bookmarkStart w:id="14" w:name="partners"/>
     <w:p>
       <w:pPr>
         <w:pStyle w:val="Heading2"/>
       </w:pPr>
       <w:r>
-        <w:t xml:space="preserve">6 · Partners</w:t>
+        <w:t xml:space="preserve">Partners</w:t>
       </w:r>
     </w:p>
-    <w:p>
-      <w:pPr>
-        <w:pStyle w:val="FirstParagraph"/>
-      </w:pPr>
-      <w:r>
-        <w:rPr>
-          <w:b/>
-          <w:bCs/>
-        </w:rPr>
-        <w:t xml:space="preserve">Organisations, sponsors, or co-clubs involved</w:t>
-      </w:r>
-      <w:r>
-        <w:t xml:space="preserve"> </w:t>
-      </w:r>
-      <w:r>
-        <w:t xml:space="preserve">(list them, or write</w:t>
-      </w:r>
-      <w:r>
-        <w:t xml:space="preserve"> </w:t>
-      </w:r>
-      <w:r>
-        <w:t xml:space="preserve">“none”</w:t>
-      </w:r>
-      <w:r>
-        <w:t xml:space="preserve">):</w:t>
-      </w:r>
-    </w:p>
-    <w:p>
-      <w:pPr>
-        <w:pStyle w:val="BodyText"/>
-      </w:pPr>
-      <w:r>
-        <w:t xml:space="preserve"> </w:t>
-      </w:r>
-    </w:p>
-    <w:bookmarkEnd w:id="15"/>
-    <w:bookmarkStart w:id="16" w:name="extras-all-optional"/>
+    <w:tbl>
+      <w:tblPr>
+        <w:tblStyle w:val="Table"/>
+        <w:tblW w:type="auto" w:w="0"/>
+        <w:tblLook w:firstRow="1" w:lastRow="0" w:firstColumn="0" w:lastColumn="0" w:noHBand="0" w:noVBand="0" w:val="0020"/>
+      </w:tblPr>
+      <w:tblGrid>
+        <w:gridCol w:w="3960"/>
+        <w:gridCol w:w="3960"/>
+      </w:tblGrid>
+      <w:tr>
+        <w:trPr>
+          <w:tblHeader w:val="on"/>
+        </w:trPr>
+        <w:tc>
+          <w:tcPr/>
+          <w:p>
+            <w:pPr>
+              <w:pStyle w:val="Compact"/>
+              <w:jc w:val="left"/>
+            </w:pPr>
+            <w:r>
+              <w:t xml:space="preserve">Field</w:t>
+            </w:r>
+          </w:p>
+        </w:tc>
+        <w:tc>
+          <w:tcPr/>
+          <w:p>
+            <w:pPr>
+              <w:pStyle w:val="Compact"/>
+              <w:jc w:val="left"/>
+            </w:pPr>
+            <w:r>
+              <w:t xml:space="preserve">Your answer</w:t>
+            </w:r>
+          </w:p>
+        </w:tc>
+      </w:tr>
+      <w:tr>
+        <w:tc>
+          <w:tcPr/>
+          <w:p>
+            <w:pPr>
+              <w:pStyle w:val="Compact"/>
+              <w:jc w:val="left"/>
+            </w:pPr>
+            <w:r>
+              <w:rPr>
+                <w:b/>
+                <w:bCs/>
+              </w:rPr>
+              <w:t xml:space="preserve">Organisations / sponsors / co-clubs</w:t>
+            </w:r>
+            <w:r>
+              <w:t xml:space="preserve"> </w:t>
+            </w:r>
+            <w:r>
+              <w:rPr>
+                <w:i/>
+                <w:iCs/>
+              </w:rPr>
+              <w:t xml:space="preserve">(or</w:t>
+            </w:r>
+            <w:r>
+              <w:rPr>
+                <w:i/>
+                <w:iCs/>
+              </w:rPr>
+              <w:t xml:space="preserve"> </w:t>
+            </w:r>
+            <w:r>
+              <w:rPr>
+                <w:i/>
+                <w:iCs/>
+              </w:rPr>
+              <w:t xml:space="preserve">“none”</w:t>
+            </w:r>
+            <w:r>
+              <w:rPr>
+                <w:i/>
+                <w:iCs/>
+              </w:rPr>
+              <w:t xml:space="preserve">)</w:t>
+            </w:r>
+          </w:p>
+        </w:tc>
+        <w:tc>
+          <w:tcPr/>
+          <w:p>
+            <w:pPr>
+              <w:pStyle w:val="Compact"/>
+            </w:pPr>
+          </w:p>
+        </w:tc>
+      </w:tr>
+    </w:tbl>
+    <w:bookmarkEnd w:id="14"/>
+    <w:bookmarkStart w:id="15" w:name="extras-all-optional"/>
     <w:p>
       <w:pPr>
         <w:pStyle w:val="Heading2"/>
       </w:pPr>
       <w:r>
-        <w:t xml:space="preserve">7 · Extras</w:t>
+        <w:t xml:space="preserve">Extras</w:t>
       </w:r>
       <w:r>
         <w:t xml:space="preserve"> </w:t>
@@ -575,116 +915,181 @@
         <w:t xml:space="preserve">(all optional)</w:t>
       </w:r>
     </w:p>
-    <w:p>
-      <w:pPr>
-        <w:pStyle w:val="FirstParagraph"/>
-      </w:pPr>
-      <w:r>
-        <w:rPr>
-          <w:b/>
-          <w:bCs/>
-        </w:rPr>
-        <w:t xml:space="preserve">Photos?</w:t>
-      </w:r>
-      <w:r>
-        <w:t xml:space="preserve"> </w:t>
-      </w:r>
-      <w:r>
-        <w:t xml:space="preserve">(yes / no — where are they?)</w:t>
-      </w:r>
-    </w:p>
-    <w:p>
-      <w:pPr>
-        <w:pStyle w:val="BodyText"/>
-      </w:pPr>
-      <w:r>
-        <w:t xml:space="preserve"> </w:t>
-      </w:r>
-    </w:p>
-    <w:p>
-      <w:pPr>
-        <w:pStyle w:val="BodyText"/>
-      </w:pPr>
-      <w:r>
-        <w:rPr>
-          <w:b/>
-          <w:bCs/>
-        </w:rPr>
-        <w:t xml:space="preserve">Publicity</w:t>
-      </w:r>
-      <w:r>
-        <w:t xml:space="preserve"> </w:t>
-      </w:r>
-      <w:r>
-        <w:t xml:space="preserve">(any links or write-ups):</w:t>
-      </w:r>
-    </w:p>
-    <w:p>
-      <w:pPr>
-        <w:pStyle w:val="BodyText"/>
-      </w:pPr>
-      <w:r>
-        <w:t xml:space="preserve"> </w:t>
-      </w:r>
-    </w:p>
-    <w:p>
-      <w:pPr>
-        <w:pStyle w:val="BodyText"/>
-      </w:pPr>
-      <w:r>
-        <w:rPr>
-          <w:b/>
-          <w:bCs/>
-        </w:rPr>
-        <w:t xml:space="preserve">Lessons learned / would you repeat it?</w:t>
-      </w:r>
-    </w:p>
-    <w:p>
-      <w:pPr>
-        <w:pStyle w:val="BodyText"/>
-      </w:pPr>
-      <w:r>
-        <w:t xml:space="preserve"> </w:t>
-      </w:r>
-    </w:p>
-    <w:p>
-      <w:pPr>
-        <w:pStyle w:val="BodyText"/>
-      </w:pPr>
-      <w:r>
-        <w:rPr>
-          <w:b/>
-          <w:bCs/>
-        </w:rPr>
-        <w:t xml:space="preserve">Anything else we should record?</w:t>
-      </w:r>
-      <w:r>
-        <w:t xml:space="preserve"> </w:t>
-      </w:r>
-      <w:r>
-        <w:rPr>
-          <w:i/>
-          <w:iCs/>
-        </w:rPr>
-        <w:t xml:space="preserve">(For our records: the club ran an earlier aquaponics installation at St Nicholas Home for the Blind in 2021-22 — was this workshop related to that?)</w:t>
-      </w:r>
-    </w:p>
-    <w:p>
-      <w:pPr>
-        <w:pStyle w:val="BodyText"/>
-      </w:pPr>
-      <w:r>
-        <w:t xml:space="preserve"> </w:t>
-      </w:r>
-    </w:p>
-    <w:p>
-      <w:pPr>
-        <w:pStyle w:val="BodyText"/>
-      </w:pPr>
-      <w:r>
-        <w:t xml:space="preserve"> </w:t>
-      </w:r>
-    </w:p>
+    <w:tbl>
+      <w:tblPr>
+        <w:tblStyle w:val="Table"/>
+        <w:tblW w:type="pct" w:w="5000"/>
+        <w:tblLayout w:type="fixed"/>
+        <w:tblLook w:firstRow="1" w:lastRow="0" w:firstColumn="0" w:lastColumn="0" w:noHBand="0" w:noVBand="0" w:val="0020"/>
+      </w:tblPr>
+      <w:tblGrid>
+        <w:gridCol w:w="2869"/>
+        <w:gridCol w:w="5050"/>
+      </w:tblGrid>
+      <w:tr>
+        <w:trPr>
+          <w:tblHeader w:val="on"/>
+        </w:trPr>
+        <w:tc>
+          <w:tcPr/>
+          <w:p>
+            <w:pPr>
+              <w:pStyle w:val="Compact"/>
+              <w:jc w:val="left"/>
+            </w:pPr>
+            <w:r>
+              <w:t xml:space="preserve">Field</w:t>
+            </w:r>
+          </w:p>
+        </w:tc>
+        <w:tc>
+          <w:tcPr/>
+          <w:p>
+            <w:pPr>
+              <w:pStyle w:val="Compact"/>
+              <w:jc w:val="left"/>
+            </w:pPr>
+            <w:r>
+              <w:t xml:space="preserve">Your answer</w:t>
+            </w:r>
+          </w:p>
+        </w:tc>
+      </w:tr>
+      <w:tr>
+        <w:tc>
+          <w:tcPr/>
+          <w:p>
+            <w:pPr>
+              <w:pStyle w:val="Compact"/>
+              <w:jc w:val="left"/>
+            </w:pPr>
+            <w:r>
+              <w:rPr>
+                <w:b/>
+                <w:bCs/>
+              </w:rPr>
+              <w:t xml:space="preserve">Photos?</w:t>
+            </w:r>
+            <w:r>
+              <w:t xml:space="preserve"> </w:t>
+            </w:r>
+            <w:r>
+              <w:rPr>
+                <w:i/>
+                <w:iCs/>
+              </w:rPr>
+              <w:t xml:space="preserve">(yes / no — where?)</w:t>
+            </w:r>
+          </w:p>
+        </w:tc>
+        <w:tc>
+          <w:tcPr/>
+          <w:p>
+            <w:pPr>
+              <w:pStyle w:val="Compact"/>
+            </w:pPr>
+          </w:p>
+        </w:tc>
+      </w:tr>
+      <w:tr>
+        <w:tc>
+          <w:tcPr/>
+          <w:p>
+            <w:pPr>
+              <w:pStyle w:val="Compact"/>
+              <w:jc w:val="left"/>
+            </w:pPr>
+            <w:r>
+              <w:rPr>
+                <w:b/>
+                <w:bCs/>
+              </w:rPr>
+              <w:t xml:space="preserve">Publicity</w:t>
+            </w:r>
+            <w:r>
+              <w:t xml:space="preserve"> </w:t>
+            </w:r>
+            <w:r>
+              <w:rPr>
+                <w:i/>
+                <w:iCs/>
+              </w:rPr>
+              <w:t xml:space="preserve">(links, write-ups)</w:t>
+            </w:r>
+          </w:p>
+        </w:tc>
+        <w:tc>
+          <w:tcPr/>
+          <w:p>
+            <w:pPr>
+              <w:pStyle w:val="Compact"/>
+            </w:pPr>
+          </w:p>
+        </w:tc>
+      </w:tr>
+      <w:tr>
+        <w:tc>
+          <w:tcPr/>
+          <w:p>
+            <w:pPr>
+              <w:pStyle w:val="Compact"/>
+              <w:jc w:val="left"/>
+            </w:pPr>
+            <w:r>
+              <w:rPr>
+                <w:b/>
+                <w:bCs/>
+              </w:rPr>
+              <w:t xml:space="preserve">Lessons learned / would you repeat it?</w:t>
+            </w:r>
+          </w:p>
+        </w:tc>
+        <w:tc>
+          <w:tcPr/>
+          <w:p>
+            <w:pPr>
+              <w:pStyle w:val="Compact"/>
+            </w:pPr>
+          </w:p>
+        </w:tc>
+      </w:tr>
+      <w:tr>
+        <w:tc>
+          <w:tcPr/>
+          <w:p>
+            <w:pPr>
+              <w:pStyle w:val="Compact"/>
+              <w:jc w:val="left"/>
+            </w:pPr>
+            <w:r>
+              <w:rPr>
+                <w:b/>
+                <w:bCs/>
+              </w:rPr>
+              <w:t xml:space="preserve">Anything else?</w:t>
+            </w:r>
+            <w:r>
+              <w:t xml:space="preserve"> </w:t>
+            </w:r>
+            <w:r>
+              <w:rPr>
+                <w:i/>
+                <w:iCs/>
+              </w:rPr>
+              <w:t xml:space="preserve">(Note: the club ran an earlier aquaponics installation at St Nicholas Home for the Blind in 2021-22 — was this related?)</w:t>
+            </w:r>
+          </w:p>
+        </w:tc>
+        <w:tc>
+          <w:tcPr/>
+          <w:p>
+            <w:pPr>
+              <w:pStyle w:val="Compact"/>
+            </w:pPr>
+          </w:p>
+        </w:tc>
+      </w:tr>
+    </w:tbl>
     <w:p>
       <w:pPr>
         <w:pStyle w:val="BodyText"/>
@@ -694,11 +1099,10 @@
           <w:i/>
           <w:iCs/>
         </w:rPr>
-        <w:t xml:space="preserve">Thank you, Mike. This will complete the 2024-25 entry in the club’s Service Projects record.</w:t>
+        <w:t xml:space="preserve">Thank you, Mike. This completes the 2024-25 entry in the club’s Service Projects record.</w:t>
       </w:r>
     </w:p>
-    <w:bookmarkEnd w:id="16"/>
-    <w:bookmarkEnd w:id="17"/>
+    <w:bookmarkEnd w:id="15"/>
     <w:sectPr>
       <w:footnotePr>
         <w:numRestart w:val="eachSect"/>
@@ -828,7 +1232,7 @@
     </w:rPrDefault>
     <w:pPrDefault>
       <w:pPr>
-        <w:spacing w:after="240" w:line="360" w:lineRule="auto"/>
+        <w:spacing w:after="160" w:line="276" w:lineRule="auto"/>
       </w:pPr>
     </w:pPrDefault>
   </w:docDefaults>
@@ -919,7 +1323,7 @@
     <w:rsid w:val="00A10FD9"/>
     <w:rPr>
       <w:rFonts w:cstheme="majorBidi" w:eastAsiaTheme="majorEastAsia"/>
-      <w:color w:themeColor="text1" w:themeTint="A6" w:val="595959"/>
+      <w:color w:val="17458F"/>
       <w:spacing w:val="15"/>
       <w:sz w:val="28"/>
       <w:szCs w:val="28"/>
@@ -1009,7 +1413,7 @@
     </w:pPr>
     <w:rPr>
       <w:rFonts w:asciiTheme="majorHAnsi" w:cstheme="majorBidi" w:eastAsiaTheme="majorEastAsia" w:hAnsiTheme="majorHAnsi"/>
-      <w:color w:themeColor="accent1" w:themeShade="BF" w:val="0F4761"/>
+      <w:color w:val="17458F"/>
       <w:sz w:val="40"/>
       <w:szCs w:val="40"/>
     </w:rPr>
@@ -1032,7 +1436,7 @@
     </w:pPr>
     <w:rPr>
       <w:rFonts w:asciiTheme="majorHAnsi" w:cstheme="majorBidi" w:eastAsiaTheme="majorEastAsia" w:hAnsiTheme="majorHAnsi"/>
-      <w:color w:themeColor="accent1" w:themeShade="BF" w:val="0F4761"/>
+      <w:color w:val="0067C8"/>
       <w:sz w:val="32"/>
       <w:szCs w:val="32"/>
     </w:rPr>
@@ -1751,7 +2155,7 @@
     </a:clrScheme>
     <a:fontScheme name="Office">
       <a:majorFont>
-        <a:latin typeface="Calibri" panose="02110004020202020204"/>
+        <a:latin typeface="Open Sans" panose="02110004020202020204"/>
         <a:ea typeface=""/>
         <a:cs typeface=""/>
         <a:font script="Jpan" typeface="游ゴシック Light"/>
@@ -1803,7 +2207,7 @@
         <a:font script="Tfng" typeface="Ebrima"/>
       </a:majorFont>
       <a:minorFont>
-        <a:latin typeface="Calibri" panose="02110004020202020204"/>
+        <a:latin typeface="Open Sans" panose="02110004020202020204"/>
         <a:ea typeface=""/>
         <a:cs typeface=""/>
         <a:font script="Jpan" typeface="游明朝"/>

</xml_diff>

<commit_message>
docs(georgetown): restyle Project Summary forms to match FINAL house templates
Matched the Project Brief / Approval FINAL templates' form style: azure header
block (gold club name, white title, light-blue subtitle), azure section bars,
thin grey grid, grey-shaded label column + white input cells, Calibri body in
#222222, roomy rows for prose fields. Verified by rendering to image via
LibreOffice. Generator updated accordingly.

Co-Authored-By: Claude Opus 4.8 (1M context) <noreply@anthropic.com>
</commit_message>
<xml_diff>
--- a/apps/georgetown/docs/templates/Project-Summary-Aquaponics-Workshop-for-Mike.docx
+++ b/apps/georgetown/docs/templates/Project-Summary-Aquaponics-Workshop-for-Mike.docx
@@ -2,67 +2,158 @@
 <file path=word/document.xml><?xml version="1.0" encoding="utf-8"?>
 <w:document xmlns:wpc="http://schemas.microsoft.com/office/word/2010/wordprocessingCanvas" xmlns:mo="http://schemas.microsoft.com/office/mac/office/2008/main" xmlns:mc="http://schemas.openxmlformats.org/markup-compatibility/2006" xmlns:mv="urn:schemas-microsoft-com:mac:vml" xmlns:o="urn:schemas-microsoft-com:office:office" xmlns:r="http://schemas.openxmlformats.org/officeDocument/2006/relationships" xmlns:m="http://schemas.openxmlformats.org/officeDocument/2006/math" xmlns:v="urn:schemas-microsoft-com:vml" xmlns:wp14="http://schemas.microsoft.com/office/word/2010/wordprocessingDrawing" xmlns:wp="http://schemas.openxmlformats.org/drawingml/2006/wordprocessingDrawing" xmlns:w10="urn:schemas-microsoft-com:office:word" xmlns:w="http://schemas.openxmlformats.org/wordprocessingml/2006/main" xmlns:w14="http://schemas.microsoft.com/office/word/2010/wordml" xmlns:wpg="http://schemas.microsoft.com/office/word/2010/wordprocessingGroup" xmlns:wpi="http://schemas.microsoft.com/office/word/2010/wordprocessingInk" xmlns:wne="http://schemas.microsoft.com/office/word/2006/wordml" xmlns:wps="http://schemas.microsoft.com/office/word/2010/wordprocessingShape" mc:Ignorable="w14 wp14">
   <w:body>
+    <w:tbl>
+      <w:tblPr>
+        <w:tblW w:type="auto" w:w="0"/>
+        <w:jc w:val="left"/>
+        <w:tblLook w:firstColumn="1" w:firstRow="1" w:lastColumn="0" w:lastRow="0" w:noHBand="0" w:noVBand="1" w:val="04A0"/>
+      </w:tblPr>
+      <w:tblGrid>
+        <w:gridCol w:w="9648"/>
+      </w:tblGrid>
+      <w:tr>
+        <w:trPr>
+          <w:trHeight w:val="900" w:hRule="atLeast"/>
+        </w:trPr>
+        <w:tc>
+          <w:tcPr>
+            <w:tcW w:type="dxa" w:w="9648"/>
+            <w:shd w:val="clear" w:color="auto" w:fill="0067C8"/>
+            <w:tcBorders>
+              <w:top w:val="single" w:sz="4" w:space="0" w:color="0067C8"/>
+              <w:left w:val="single" w:sz="4" w:space="0" w:color="0067C8"/>
+              <w:bottom w:val="single" w:sz="4" w:space="0" w:color="0067C8"/>
+              <w:right w:val="single" w:sz="4" w:space="0" w:color="0067C8"/>
+            </w:tcBorders>
+            <w:tcMar>
+              <w:top w:w="90" w:type="dxa"/>
+              <w:bottom w:w="90" w:type="dxa"/>
+              <w:left w:w="160" w:type="dxa"/>
+              <w:right w:w="160" w:type="dxa"/>
+            </w:tcMar>
+            <w:vAlign w:val="center"/>
+          </w:tcPr>
+          <w:p>
+            <w:pPr>
+              <w:spacing w:before="0" w:after="0" w:line="252" w:lineRule="auto"/>
+            </w:pPr>
+            <w:r>
+              <w:rPr>
+                <w:rFonts w:ascii="Calibri" w:hAnsi="Calibri" w:cs="Calibri"/>
+                <w:b/>
+                <w:i w:val="0"/>
+                <w:color w:val="F7A81B"/>
+                <w:sz w:val="22"/>
+              </w:rPr>
+              <w:t>ROTARY CLUB OF GEORGETOWN</w:t>
+            </w:r>
+          </w:p>
+          <w:p>
+            <w:pPr>
+              <w:spacing w:before="40" w:after="0"/>
+            </w:pPr>
+            <w:r>
+              <w:rPr>
+                <w:rFonts w:ascii="Calibri" w:hAnsi="Calibri" w:cs="Calibri"/>
+                <w:b/>
+                <w:i w:val="0"/>
+                <w:color w:val="FFFFFF"/>
+                <w:sz w:val="36"/>
+              </w:rPr>
+              <w:t>Project Summary Form</w:t>
+            </w:r>
+          </w:p>
+          <w:p>
+            <w:pPr>
+              <w:spacing w:before="20" w:after="0"/>
+            </w:pPr>
+            <w:r>
+              <w:rPr>
+                <w:rFonts w:ascii="Calibri" w:hAnsi="Calibri" w:cs="Calibri"/>
+                <w:b w:val="0"/>
+                <w:i w:val="0"/>
+                <w:color w:val="C8DCEE"/>
+                <w:sz w:val="18"/>
+              </w:rPr>
+              <w:t>Aquaponics Workshop — draft for Mike Jackman</w:t>
+            </w:r>
+          </w:p>
+        </w:tc>
+      </w:tr>
+    </w:tbl>
     <w:p>
       <w:pPr>
-        <w:spacing w:after="40"/>
-        <w:jc w:val="left"/>
+        <w:spacing w:before="0" w:after="80" w:line="269" w:lineRule="auto"/>
+      </w:pPr>
+    </w:p>
+    <w:p>
+      <w:pPr>
+        <w:spacing w:before="0" w:after="160" w:line="269" w:lineRule="auto"/>
       </w:pPr>
       <w:r>
         <w:rPr>
-          <w:rFonts w:ascii="Open Sans Condensed" w:hAnsi="Open Sans Condensed" w:cs="Open Sans Condensed"/>
-          <w:b/>
-          <w:i w:val="0"/>
-          <w:color w:val="17458F"/>
-          <w:sz w:val="44"/>
-        </w:rPr>
-        <w:t>RC Georgetown — Project Summary Form</w:t>
-      </w:r>
-    </w:p>
-    <w:p>
-      <w:pPr>
-        <w:spacing w:after="160"/>
-      </w:pPr>
-      <w:r>
-        <w:rPr>
-          <w:rFonts w:ascii="Open Sans Condensed" w:hAnsi="Open Sans Condensed" w:cs="Open Sans Condensed"/>
-          <w:b w:val="0"/>
-          <w:i w:val="0"/>
-          <w:color w:val="0067C8"/>
-          <w:sz w:val="26"/>
-        </w:rPr>
-        <w:t>Aquaponics Workshop — draft for Mike Jackman</w:t>
-      </w:r>
-    </w:p>
-    <w:p>
-      <w:pPr>
-        <w:spacing w:after="200"/>
-      </w:pPr>
-      <w:r>
-        <w:rPr>
-          <w:rFonts w:ascii="Open Sans" w:hAnsi="Open Sans" w:cs="Open Sans"/>
+          <w:rFonts w:ascii="Calibri" w:hAnsi="Calibri" w:cs="Calibri"/>
           <w:b w:val="0"/>
           <w:i/>
-          <w:color w:val="54565A"/>
-          <w:sz w:val="21"/>
+          <w:color w:val="555555"/>
+          <w:sz w:val="18"/>
         </w:rPr>
         <w:t>Hi Mike — we've pre-filled what we have on record. Please correct anything wrong and type your answers into the blank right-hand cells. Thank you!</w:t>
       </w:r>
     </w:p>
+    <w:tbl>
+      <w:tblPr>
+        <w:tblW w:type="auto" w:w="0"/>
+        <w:jc w:val="left"/>
+        <w:tblLook w:firstColumn="1" w:firstRow="1" w:lastColumn="0" w:lastRow="0" w:noHBand="0" w:noVBand="1" w:val="04A0"/>
+      </w:tblPr>
+      <w:tblGrid>
+        <w:gridCol w:w="9648"/>
+      </w:tblGrid>
+      <w:tr>
+        <w:trPr>
+          <w:trHeight w:val="300" w:hRule="atLeast"/>
+        </w:trPr>
+        <w:tc>
+          <w:tcPr>
+            <w:tcW w:type="dxa" w:w="9648"/>
+            <w:shd w:val="clear" w:color="auto" w:fill="0067C8"/>
+            <w:tcBorders>
+              <w:top w:val="single" w:sz="4" w:space="0" w:color="0067C8"/>
+              <w:left w:val="single" w:sz="4" w:space="0" w:color="0067C8"/>
+              <w:bottom w:val="single" w:sz="4" w:space="0" w:color="0067C8"/>
+              <w:right w:val="single" w:sz="4" w:space="0" w:color="0067C8"/>
+            </w:tcBorders>
+            <w:tcMar>
+              <w:top w:w="40" w:type="dxa"/>
+              <w:bottom w:w="40" w:type="dxa"/>
+              <w:left w:w="110" w:type="dxa"/>
+              <w:right w:w="110" w:type="dxa"/>
+            </w:tcMar>
+            <w:vAlign w:val="center"/>
+          </w:tcPr>
+          <w:p>
+            <w:pPr>
+              <w:spacing w:before="0" w:after="0" w:line="252" w:lineRule="auto"/>
+            </w:pPr>
+            <w:r>
+              <w:rPr>
+                <w:rFonts w:ascii="Calibri" w:hAnsi="Calibri" w:cs="Calibri"/>
+                <w:b/>
+                <w:i w:val="0"/>
+                <w:color w:val="FFFFFF"/>
+                <w:sz w:val="21"/>
+              </w:rPr>
+              <w:t>Project Identity</w:t>
+            </w:r>
+          </w:p>
+        </w:tc>
+      </w:tr>
+    </w:tbl>
     <w:p>
       <w:pPr>
-        <w:keepNext/>
-        <w:spacing w:before="320" w:after="120"/>
+        <w:spacing w:before="0" w:after="0" w:line="269" w:lineRule="auto"/>
       </w:pPr>
-      <w:r>
-        <w:rPr>
-          <w:rFonts w:ascii="Open Sans Condensed" w:hAnsi="Open Sans Condensed" w:cs="Open Sans Condensed"/>
-          <w:b/>
-          <w:i w:val="0"/>
-          <w:color w:val="0067C8"/>
-          <w:sz w:val="30"/>
-        </w:rPr>
-        <w:t>Project Identity</w:t>
-      </w:r>
     </w:p>
     <w:tbl>
       <w:tblPr>
@@ -76,37 +167,37 @@
       </w:tblGrid>
       <w:tr>
         <w:trPr>
-          <w:trHeight w:val="560" w:hRule="atLeast"/>
+          <w:trHeight w:val="380" w:hRule="atLeast"/>
         </w:trPr>
         <w:tc>
           <w:tcPr>
-            <w:tcW w:type="dxa" w:w="3888"/>
-            <w:shd w:val="clear" w:color="auto" w:fill="EAF1FB"/>
+            <w:tcW w:type="dxa" w:w="3600"/>
+            <w:shd w:val="clear" w:color="auto" w:fill="F5F5F5"/>
             <w:tcBorders>
-              <w:top w:val="single" w:sz="6" w:space="0" w:color="C9CCD1"/>
-              <w:left w:val="single" w:sz="6" w:space="0" w:color="C9CCD1"/>
-              <w:bottom w:val="single" w:sz="6" w:space="0" w:color="C9CCD1"/>
-              <w:right w:val="single" w:sz="6" w:space="0" w:color="C9CCD1"/>
+              <w:top w:val="single" w:sz="4" w:space="0" w:color="BFBFBF"/>
+              <w:left w:val="single" w:sz="4" w:space="0" w:color="BFBFBF"/>
+              <w:bottom w:val="single" w:sz="4" w:space="0" w:color="BFBFBF"/>
+              <w:right w:val="single" w:sz="4" w:space="0" w:color="BFBFBF"/>
             </w:tcBorders>
             <w:tcMar>
-              <w:top w:w="80" w:type="dxa"/>
-              <w:bottom w:w="80" w:type="dxa"/>
-              <w:left w:w="120" w:type="dxa"/>
-              <w:right w:w="120" w:type="dxa"/>
+              <w:top w:w="70" w:type="dxa"/>
+              <w:bottom w:w="70" w:type="dxa"/>
+              <w:left w:w="110" w:type="dxa"/>
+              <w:right w:w="110" w:type="dxa"/>
             </w:tcMar>
             <w:vAlign w:val="center"/>
           </w:tcPr>
           <w:p>
             <w:pPr>
-              <w:spacing w:after="0" w:before="0"/>
+              <w:spacing w:before="0" w:after="0" w:line="252" w:lineRule="auto"/>
             </w:pPr>
             <w:r>
               <w:rPr>
-                <w:rFonts w:ascii="Open Sans" w:hAnsi="Open Sans" w:cs="Open Sans"/>
+                <w:rFonts w:ascii="Calibri" w:hAnsi="Calibri" w:cs="Calibri"/>
                 <w:b/>
                 <w:i w:val="0"/>
-                <w:color w:val="54565A"/>
-                <w:sz w:val="21"/>
+                <w:color w:val="222222"/>
+                <w:sz w:val="19"/>
               </w:rPr>
               <w:t>Project name</w:t>
             </w:r>
@@ -114,32 +205,32 @@
         </w:tc>
         <w:tc>
           <w:tcPr>
-            <w:tcW w:type="dxa" w:w="5472"/>
+            <w:tcW w:type="dxa" w:w="6048"/>
             <w:tcBorders>
-              <w:top w:val="single" w:sz="6" w:space="0" w:color="C9CCD1"/>
-              <w:left w:val="single" w:sz="6" w:space="0" w:color="C9CCD1"/>
-              <w:bottom w:val="single" w:sz="6" w:space="0" w:color="C9CCD1"/>
-              <w:right w:val="single" w:sz="6" w:space="0" w:color="C9CCD1"/>
+              <w:top w:val="single" w:sz="4" w:space="0" w:color="BFBFBF"/>
+              <w:left w:val="single" w:sz="4" w:space="0" w:color="BFBFBF"/>
+              <w:bottom w:val="single" w:sz="4" w:space="0" w:color="BFBFBF"/>
+              <w:right w:val="single" w:sz="4" w:space="0" w:color="BFBFBF"/>
             </w:tcBorders>
             <w:tcMar>
-              <w:top w:w="80" w:type="dxa"/>
-              <w:bottom w:w="80" w:type="dxa"/>
-              <w:left w:w="120" w:type="dxa"/>
-              <w:right w:w="120" w:type="dxa"/>
+              <w:top w:w="70" w:type="dxa"/>
+              <w:bottom w:w="70" w:type="dxa"/>
+              <w:left w:w="110" w:type="dxa"/>
+              <w:right w:w="110" w:type="dxa"/>
             </w:tcMar>
             <w:vAlign w:val="center"/>
           </w:tcPr>
           <w:p>
             <w:pPr>
-              <w:spacing w:after="0" w:before="0"/>
+              <w:spacing w:before="0" w:after="0" w:line="252" w:lineRule="auto"/>
             </w:pPr>
             <w:r>
               <w:rPr>
-                <w:rFonts w:ascii="Open Sans" w:hAnsi="Open Sans" w:cs="Open Sans"/>
+                <w:rFonts w:ascii="Calibri" w:hAnsi="Calibri" w:cs="Calibri"/>
                 <w:b w:val="0"/>
                 <w:i w:val="0"/>
-                <w:color w:val="54565A"/>
-                <w:sz w:val="21"/>
+                <w:color w:val="222222"/>
+                <w:sz w:val="19"/>
               </w:rPr>
               <w:t>Aquaponics Workshop</w:t>
             </w:r>
@@ -148,47 +239,47 @@
       </w:tr>
       <w:tr>
         <w:trPr>
-          <w:trHeight w:val="560" w:hRule="atLeast"/>
+          <w:trHeight w:val="380" w:hRule="atLeast"/>
         </w:trPr>
         <w:tc>
           <w:tcPr>
-            <w:tcW w:type="dxa" w:w="3888"/>
-            <w:shd w:val="clear" w:color="auto" w:fill="EAF1FB"/>
+            <w:tcW w:type="dxa" w:w="3600"/>
+            <w:shd w:val="clear" w:color="auto" w:fill="F5F5F5"/>
             <w:tcBorders>
-              <w:top w:val="single" w:sz="6" w:space="0" w:color="C9CCD1"/>
-              <w:left w:val="single" w:sz="6" w:space="0" w:color="C9CCD1"/>
-              <w:bottom w:val="single" w:sz="6" w:space="0" w:color="C9CCD1"/>
-              <w:right w:val="single" w:sz="6" w:space="0" w:color="C9CCD1"/>
+              <w:top w:val="single" w:sz="4" w:space="0" w:color="BFBFBF"/>
+              <w:left w:val="single" w:sz="4" w:space="0" w:color="BFBFBF"/>
+              <w:bottom w:val="single" w:sz="4" w:space="0" w:color="BFBFBF"/>
+              <w:right w:val="single" w:sz="4" w:space="0" w:color="BFBFBF"/>
             </w:tcBorders>
             <w:tcMar>
-              <w:top w:w="80" w:type="dxa"/>
-              <w:bottom w:w="80" w:type="dxa"/>
-              <w:left w:w="120" w:type="dxa"/>
-              <w:right w:w="120" w:type="dxa"/>
+              <w:top w:w="70" w:type="dxa"/>
+              <w:bottom w:w="70" w:type="dxa"/>
+              <w:left w:w="110" w:type="dxa"/>
+              <w:right w:w="110" w:type="dxa"/>
             </w:tcMar>
             <w:vAlign w:val="center"/>
           </w:tcPr>
           <w:p>
             <w:pPr>
-              <w:spacing w:after="0" w:before="0"/>
+              <w:spacing w:before="0" w:after="0" w:line="252" w:lineRule="auto"/>
             </w:pPr>
             <w:r>
               <w:rPr>
-                <w:rFonts w:ascii="Open Sans" w:hAnsi="Open Sans" w:cs="Open Sans"/>
+                <w:rFonts w:ascii="Calibri" w:hAnsi="Calibri" w:cs="Calibri"/>
                 <w:b/>
                 <w:i w:val="0"/>
-                <w:color w:val="54565A"/>
-                <w:sz w:val="21"/>
+                <w:color w:val="222222"/>
+                <w:sz w:val="19"/>
               </w:rPr>
               <w:t>Rotary year</w:t>
             </w:r>
             <w:r>
               <w:rPr>
-                <w:rFonts w:ascii="Open Sans" w:hAnsi="Open Sans" w:cs="Open Sans"/>
+                <w:rFonts w:ascii="Calibri" w:hAnsi="Calibri" w:cs="Calibri"/>
                 <w:b w:val="0"/>
                 <w:i/>
-                <w:color w:val="898A8D"/>
-                <w:sz w:val="18"/>
+                <w:color w:val="777777"/>
+                <w:sz w:val="16"/>
               </w:rPr>
               <w:t xml:space="preserve">  e.g. 2024-25</w:t>
             </w:r>
@@ -196,32 +287,32 @@
         </w:tc>
         <w:tc>
           <w:tcPr>
-            <w:tcW w:type="dxa" w:w="5472"/>
+            <w:tcW w:type="dxa" w:w="6048"/>
             <w:tcBorders>
-              <w:top w:val="single" w:sz="6" w:space="0" w:color="C9CCD1"/>
-              <w:left w:val="single" w:sz="6" w:space="0" w:color="C9CCD1"/>
-              <w:bottom w:val="single" w:sz="6" w:space="0" w:color="C9CCD1"/>
-              <w:right w:val="single" w:sz="6" w:space="0" w:color="C9CCD1"/>
+              <w:top w:val="single" w:sz="4" w:space="0" w:color="BFBFBF"/>
+              <w:left w:val="single" w:sz="4" w:space="0" w:color="BFBFBF"/>
+              <w:bottom w:val="single" w:sz="4" w:space="0" w:color="BFBFBF"/>
+              <w:right w:val="single" w:sz="4" w:space="0" w:color="BFBFBF"/>
             </w:tcBorders>
             <w:tcMar>
-              <w:top w:w="80" w:type="dxa"/>
-              <w:bottom w:w="80" w:type="dxa"/>
-              <w:left w:w="120" w:type="dxa"/>
-              <w:right w:w="120" w:type="dxa"/>
+              <w:top w:w="70" w:type="dxa"/>
+              <w:bottom w:w="70" w:type="dxa"/>
+              <w:left w:w="110" w:type="dxa"/>
+              <w:right w:w="110" w:type="dxa"/>
             </w:tcMar>
             <w:vAlign w:val="center"/>
           </w:tcPr>
           <w:p>
             <w:pPr>
-              <w:spacing w:after="0" w:before="0"/>
+              <w:spacing w:before="0" w:after="0" w:line="252" w:lineRule="auto"/>
             </w:pPr>
             <w:r>
               <w:rPr>
-                <w:rFonts w:ascii="Open Sans" w:hAnsi="Open Sans" w:cs="Open Sans"/>
+                <w:rFonts w:ascii="Calibri" w:hAnsi="Calibri" w:cs="Calibri"/>
                 <w:b w:val="0"/>
                 <w:i w:val="0"/>
-                <w:color w:val="54565A"/>
-                <w:sz w:val="21"/>
+                <w:color w:val="222222"/>
+                <w:sz w:val="19"/>
               </w:rPr>
               <w:t>2024-25</w:t>
             </w:r>
@@ -230,47 +321,47 @@
       </w:tr>
       <w:tr>
         <w:trPr>
-          <w:trHeight w:val="560" w:hRule="atLeast"/>
+          <w:trHeight w:val="380" w:hRule="atLeast"/>
         </w:trPr>
         <w:tc>
           <w:tcPr>
-            <w:tcW w:type="dxa" w:w="3888"/>
-            <w:shd w:val="clear" w:color="auto" w:fill="EAF1FB"/>
+            <w:tcW w:type="dxa" w:w="3600"/>
+            <w:shd w:val="clear" w:color="auto" w:fill="F5F5F5"/>
             <w:tcBorders>
-              <w:top w:val="single" w:sz="6" w:space="0" w:color="C9CCD1"/>
-              <w:left w:val="single" w:sz="6" w:space="0" w:color="C9CCD1"/>
-              <w:bottom w:val="single" w:sz="6" w:space="0" w:color="C9CCD1"/>
-              <w:right w:val="single" w:sz="6" w:space="0" w:color="C9CCD1"/>
+              <w:top w:val="single" w:sz="4" w:space="0" w:color="BFBFBF"/>
+              <w:left w:val="single" w:sz="4" w:space="0" w:color="BFBFBF"/>
+              <w:bottom w:val="single" w:sz="4" w:space="0" w:color="BFBFBF"/>
+              <w:right w:val="single" w:sz="4" w:space="0" w:color="BFBFBF"/>
             </w:tcBorders>
             <w:tcMar>
-              <w:top w:w="80" w:type="dxa"/>
-              <w:bottom w:w="80" w:type="dxa"/>
-              <w:left w:w="120" w:type="dxa"/>
-              <w:right w:w="120" w:type="dxa"/>
+              <w:top w:w="70" w:type="dxa"/>
+              <w:bottom w:w="70" w:type="dxa"/>
+              <w:left w:w="110" w:type="dxa"/>
+              <w:right w:w="110" w:type="dxa"/>
             </w:tcMar>
             <w:vAlign w:val="center"/>
           </w:tcPr>
           <w:p>
             <w:pPr>
-              <w:spacing w:after="0" w:before="0"/>
+              <w:spacing w:before="0" w:after="0" w:line="252" w:lineRule="auto"/>
             </w:pPr>
             <w:r>
               <w:rPr>
-                <w:rFonts w:ascii="Open Sans" w:hAnsi="Open Sans" w:cs="Open Sans"/>
+                <w:rFonts w:ascii="Calibri" w:hAnsi="Calibri" w:cs="Calibri"/>
                 <w:b/>
                 <w:i w:val="0"/>
-                <w:color w:val="54565A"/>
-                <w:sz w:val="21"/>
+                <w:color w:val="222222"/>
+                <w:sz w:val="19"/>
               </w:rPr>
               <w:t>Champion</w:t>
             </w:r>
             <w:r>
               <w:rPr>
-                <w:rFonts w:ascii="Open Sans" w:hAnsi="Open Sans" w:cs="Open Sans"/>
+                <w:rFonts w:ascii="Calibri" w:hAnsi="Calibri" w:cs="Calibri"/>
                 <w:b w:val="0"/>
                 <w:i/>
-                <w:color w:val="898A8D"/>
-                <w:sz w:val="18"/>
+                <w:color w:val="777777"/>
+                <w:sz w:val="16"/>
               </w:rPr>
               <w:t xml:space="preserve">  member who led it</w:t>
             </w:r>
@@ -278,32 +369,32 @@
         </w:tc>
         <w:tc>
           <w:tcPr>
-            <w:tcW w:type="dxa" w:w="5472"/>
+            <w:tcW w:type="dxa" w:w="6048"/>
             <w:tcBorders>
-              <w:top w:val="single" w:sz="6" w:space="0" w:color="C9CCD1"/>
-              <w:left w:val="single" w:sz="6" w:space="0" w:color="C9CCD1"/>
-              <w:bottom w:val="single" w:sz="6" w:space="0" w:color="C9CCD1"/>
-              <w:right w:val="single" w:sz="6" w:space="0" w:color="C9CCD1"/>
+              <w:top w:val="single" w:sz="4" w:space="0" w:color="BFBFBF"/>
+              <w:left w:val="single" w:sz="4" w:space="0" w:color="BFBFBF"/>
+              <w:bottom w:val="single" w:sz="4" w:space="0" w:color="BFBFBF"/>
+              <w:right w:val="single" w:sz="4" w:space="0" w:color="BFBFBF"/>
             </w:tcBorders>
             <w:tcMar>
-              <w:top w:w="80" w:type="dxa"/>
-              <w:bottom w:w="80" w:type="dxa"/>
-              <w:left w:w="120" w:type="dxa"/>
-              <w:right w:w="120" w:type="dxa"/>
+              <w:top w:w="70" w:type="dxa"/>
+              <w:bottom w:w="70" w:type="dxa"/>
+              <w:left w:w="110" w:type="dxa"/>
+              <w:right w:w="110" w:type="dxa"/>
             </w:tcMar>
             <w:vAlign w:val="center"/>
           </w:tcPr>
           <w:p>
             <w:pPr>
-              <w:spacing w:after="0" w:before="0"/>
+              <w:spacing w:before="0" w:after="0" w:line="252" w:lineRule="auto"/>
             </w:pPr>
             <w:r>
               <w:rPr>
-                <w:rFonts w:ascii="Open Sans" w:hAnsi="Open Sans" w:cs="Open Sans"/>
+                <w:rFonts w:ascii="Calibri" w:hAnsi="Calibri" w:cs="Calibri"/>
                 <w:b w:val="0"/>
                 <w:i w:val="0"/>
-                <w:color w:val="54565A"/>
-                <w:sz w:val="21"/>
+                <w:color w:val="222222"/>
+                <w:sz w:val="19"/>
               </w:rPr>
               <w:t>Mike Jackman</w:t>
             </w:r>
@@ -313,24 +404,62 @@
     </w:tbl>
     <w:p>
       <w:pPr>
-        <w:spacing w:after="40"/>
+        <w:spacing w:before="0" w:after="120" w:line="269" w:lineRule="auto"/>
       </w:pPr>
     </w:p>
+    <w:tbl>
+      <w:tblPr>
+        <w:tblW w:type="auto" w:w="0"/>
+        <w:jc w:val="left"/>
+        <w:tblLook w:firstColumn="1" w:firstRow="1" w:lastColumn="0" w:lastRow="0" w:noHBand="0" w:noVBand="1" w:val="04A0"/>
+      </w:tblPr>
+      <w:tblGrid>
+        <w:gridCol w:w="9648"/>
+      </w:tblGrid>
+      <w:tr>
+        <w:trPr>
+          <w:trHeight w:val="300" w:hRule="atLeast"/>
+        </w:trPr>
+        <w:tc>
+          <w:tcPr>
+            <w:tcW w:type="dxa" w:w="9648"/>
+            <w:shd w:val="clear" w:color="auto" w:fill="0067C8"/>
+            <w:tcBorders>
+              <w:top w:val="single" w:sz="4" w:space="0" w:color="0067C8"/>
+              <w:left w:val="single" w:sz="4" w:space="0" w:color="0067C8"/>
+              <w:bottom w:val="single" w:sz="4" w:space="0" w:color="0067C8"/>
+              <w:right w:val="single" w:sz="4" w:space="0" w:color="0067C8"/>
+            </w:tcBorders>
+            <w:tcMar>
+              <w:top w:w="40" w:type="dxa"/>
+              <w:bottom w:w="40" w:type="dxa"/>
+              <w:left w:w="110" w:type="dxa"/>
+              <w:right w:w="110" w:type="dxa"/>
+            </w:tcMar>
+            <w:vAlign w:val="center"/>
+          </w:tcPr>
+          <w:p>
+            <w:pPr>
+              <w:spacing w:before="0" w:after="0" w:line="252" w:lineRule="auto"/>
+            </w:pPr>
+            <w:r>
+              <w:rPr>
+                <w:rFonts w:ascii="Calibri" w:hAnsi="Calibri" w:cs="Calibri"/>
+                <w:b/>
+                <w:i w:val="0"/>
+                <w:color w:val="FFFFFF"/>
+                <w:sz w:val="21"/>
+              </w:rPr>
+              <w:t>The Story</w:t>
+            </w:r>
+          </w:p>
+        </w:tc>
+      </w:tr>
+    </w:tbl>
     <w:p>
       <w:pPr>
-        <w:keepNext/>
-        <w:spacing w:before="320" w:after="120"/>
+        <w:spacing w:before="0" w:after="0" w:line="269" w:lineRule="auto"/>
       </w:pPr>
-      <w:r>
-        <w:rPr>
-          <w:rFonts w:ascii="Open Sans Condensed" w:hAnsi="Open Sans Condensed" w:cs="Open Sans Condensed"/>
-          <w:b/>
-          <w:i w:val="0"/>
-          <w:color w:val="0067C8"/>
-          <w:sz w:val="30"/>
-        </w:rPr>
-        <w:t>The Story</w:t>
-      </w:r>
     </w:p>
     <w:tbl>
       <w:tblPr>
@@ -344,47 +473,47 @@
       </w:tblGrid>
       <w:tr>
         <w:trPr>
-          <w:trHeight w:val="560" w:hRule="atLeast"/>
+          <w:trHeight w:val="620" w:hRule="atLeast"/>
         </w:trPr>
         <w:tc>
           <w:tcPr>
-            <w:tcW w:type="dxa" w:w="3888"/>
-            <w:shd w:val="clear" w:color="auto" w:fill="EAF1FB"/>
+            <w:tcW w:type="dxa" w:w="3600"/>
+            <w:shd w:val="clear" w:color="auto" w:fill="F5F5F5"/>
             <w:tcBorders>
-              <w:top w:val="single" w:sz="6" w:space="0" w:color="C9CCD1"/>
-              <w:left w:val="single" w:sz="6" w:space="0" w:color="C9CCD1"/>
-              <w:bottom w:val="single" w:sz="6" w:space="0" w:color="C9CCD1"/>
-              <w:right w:val="single" w:sz="6" w:space="0" w:color="C9CCD1"/>
+              <w:top w:val="single" w:sz="4" w:space="0" w:color="BFBFBF"/>
+              <w:left w:val="single" w:sz="4" w:space="0" w:color="BFBFBF"/>
+              <w:bottom w:val="single" w:sz="4" w:space="0" w:color="BFBFBF"/>
+              <w:right w:val="single" w:sz="4" w:space="0" w:color="BFBFBF"/>
             </w:tcBorders>
             <w:tcMar>
-              <w:top w:w="80" w:type="dxa"/>
-              <w:bottom w:w="80" w:type="dxa"/>
-              <w:left w:w="120" w:type="dxa"/>
-              <w:right w:w="120" w:type="dxa"/>
+              <w:top w:w="70" w:type="dxa"/>
+              <w:bottom w:w="70" w:type="dxa"/>
+              <w:left w:w="110" w:type="dxa"/>
+              <w:right w:w="110" w:type="dxa"/>
             </w:tcMar>
             <w:vAlign w:val="center"/>
           </w:tcPr>
           <w:p>
             <w:pPr>
-              <w:spacing w:after="0" w:before="0"/>
+              <w:spacing w:before="0" w:after="0" w:line="252" w:lineRule="auto"/>
             </w:pPr>
             <w:r>
               <w:rPr>
-                <w:rFonts w:ascii="Open Sans" w:hAnsi="Open Sans" w:cs="Open Sans"/>
+                <w:rFonts w:ascii="Calibri" w:hAnsi="Calibri" w:cs="Calibri"/>
                 <w:b/>
                 <w:i w:val="0"/>
-                <w:color w:val="54565A"/>
-                <w:sz w:val="21"/>
+                <w:color w:val="222222"/>
+                <w:sz w:val="19"/>
               </w:rPr>
               <w:t>What was it?</w:t>
             </w:r>
             <w:r>
               <w:rPr>
-                <w:rFonts w:ascii="Open Sans" w:hAnsi="Open Sans" w:cs="Open Sans"/>
+                <w:rFonts w:ascii="Calibri" w:hAnsi="Calibri" w:cs="Calibri"/>
                 <w:b w:val="0"/>
                 <w:i/>
-                <w:color w:val="898A8D"/>
-                <w:sz w:val="18"/>
+                <w:color w:val="777777"/>
+                <w:sz w:val="16"/>
               </w:rPr>
               <w:t xml:space="preserve">  one or two sentences</w:t>
             </w:r>
@@ -392,71 +521,71 @@
         </w:tc>
         <w:tc>
           <w:tcPr>
-            <w:tcW w:type="dxa" w:w="5472"/>
+            <w:tcW w:type="dxa" w:w="6048"/>
             <w:tcBorders>
-              <w:top w:val="single" w:sz="6" w:space="0" w:color="C9CCD1"/>
-              <w:left w:val="single" w:sz="6" w:space="0" w:color="C9CCD1"/>
-              <w:bottom w:val="single" w:sz="6" w:space="0" w:color="C9CCD1"/>
-              <w:right w:val="single" w:sz="6" w:space="0" w:color="C9CCD1"/>
+              <w:top w:val="single" w:sz="4" w:space="0" w:color="BFBFBF"/>
+              <w:left w:val="single" w:sz="4" w:space="0" w:color="BFBFBF"/>
+              <w:bottom w:val="single" w:sz="4" w:space="0" w:color="BFBFBF"/>
+              <w:right w:val="single" w:sz="4" w:space="0" w:color="BFBFBF"/>
             </w:tcBorders>
             <w:tcMar>
-              <w:top w:w="80" w:type="dxa"/>
-              <w:bottom w:w="80" w:type="dxa"/>
-              <w:left w:w="120" w:type="dxa"/>
-              <w:right w:w="120" w:type="dxa"/>
+              <w:top w:w="70" w:type="dxa"/>
+              <w:bottom w:w="70" w:type="dxa"/>
+              <w:left w:w="110" w:type="dxa"/>
+              <w:right w:w="110" w:type="dxa"/>
             </w:tcMar>
             <w:vAlign w:val="center"/>
           </w:tcPr>
           <w:p>
             <w:pPr>
-              <w:spacing w:after="0" w:before="0"/>
+              <w:spacing w:before="0" w:after="0" w:line="252" w:lineRule="auto"/>
             </w:pPr>
           </w:p>
         </w:tc>
       </w:tr>
       <w:tr>
         <w:trPr>
-          <w:trHeight w:val="560" w:hRule="atLeast"/>
+          <w:trHeight w:val="620" w:hRule="atLeast"/>
         </w:trPr>
         <w:tc>
           <w:tcPr>
-            <w:tcW w:type="dxa" w:w="3888"/>
-            <w:shd w:val="clear" w:color="auto" w:fill="EAF1FB"/>
+            <w:tcW w:type="dxa" w:w="3600"/>
+            <w:shd w:val="clear" w:color="auto" w:fill="F5F5F5"/>
             <w:tcBorders>
-              <w:top w:val="single" w:sz="6" w:space="0" w:color="C9CCD1"/>
-              <w:left w:val="single" w:sz="6" w:space="0" w:color="C9CCD1"/>
-              <w:bottom w:val="single" w:sz="6" w:space="0" w:color="C9CCD1"/>
-              <w:right w:val="single" w:sz="6" w:space="0" w:color="C9CCD1"/>
+              <w:top w:val="single" w:sz="4" w:space="0" w:color="BFBFBF"/>
+              <w:left w:val="single" w:sz="4" w:space="0" w:color="BFBFBF"/>
+              <w:bottom w:val="single" w:sz="4" w:space="0" w:color="BFBFBF"/>
+              <w:right w:val="single" w:sz="4" w:space="0" w:color="BFBFBF"/>
             </w:tcBorders>
             <w:tcMar>
-              <w:top w:w="80" w:type="dxa"/>
-              <w:bottom w:w="80" w:type="dxa"/>
-              <w:left w:w="120" w:type="dxa"/>
-              <w:right w:w="120" w:type="dxa"/>
+              <w:top w:w="70" w:type="dxa"/>
+              <w:bottom w:w="70" w:type="dxa"/>
+              <w:left w:w="110" w:type="dxa"/>
+              <w:right w:w="110" w:type="dxa"/>
             </w:tcMar>
             <w:vAlign w:val="center"/>
           </w:tcPr>
           <w:p>
             <w:pPr>
-              <w:spacing w:after="0" w:before="0"/>
+              <w:spacing w:before="0" w:after="0" w:line="252" w:lineRule="auto"/>
             </w:pPr>
             <w:r>
               <w:rPr>
-                <w:rFonts w:ascii="Open Sans" w:hAnsi="Open Sans" w:cs="Open Sans"/>
+                <w:rFonts w:ascii="Calibri" w:hAnsi="Calibri" w:cs="Calibri"/>
                 <w:b/>
                 <w:i w:val="0"/>
-                <w:color w:val="54565A"/>
-                <w:sz w:val="21"/>
+                <w:color w:val="222222"/>
+                <w:sz w:val="19"/>
               </w:rPr>
               <w:t>Why did the club do it?</w:t>
             </w:r>
             <w:r>
               <w:rPr>
-                <w:rFonts w:ascii="Open Sans" w:hAnsi="Open Sans" w:cs="Open Sans"/>
+                <w:rFonts w:ascii="Calibri" w:hAnsi="Calibri" w:cs="Calibri"/>
                 <w:b w:val="0"/>
                 <w:i/>
-                <w:color w:val="898A8D"/>
-                <w:sz w:val="18"/>
+                <w:color w:val="777777"/>
+                <w:sz w:val="16"/>
               </w:rPr>
               <w:t xml:space="preserve">  the need it addressed</w:t>
             </w:r>
@@ -464,71 +593,71 @@
         </w:tc>
         <w:tc>
           <w:tcPr>
-            <w:tcW w:type="dxa" w:w="5472"/>
+            <w:tcW w:type="dxa" w:w="6048"/>
             <w:tcBorders>
-              <w:top w:val="single" w:sz="6" w:space="0" w:color="C9CCD1"/>
-              <w:left w:val="single" w:sz="6" w:space="0" w:color="C9CCD1"/>
-              <w:bottom w:val="single" w:sz="6" w:space="0" w:color="C9CCD1"/>
-              <w:right w:val="single" w:sz="6" w:space="0" w:color="C9CCD1"/>
+              <w:top w:val="single" w:sz="4" w:space="0" w:color="BFBFBF"/>
+              <w:left w:val="single" w:sz="4" w:space="0" w:color="BFBFBF"/>
+              <w:bottom w:val="single" w:sz="4" w:space="0" w:color="BFBFBF"/>
+              <w:right w:val="single" w:sz="4" w:space="0" w:color="BFBFBF"/>
             </w:tcBorders>
             <w:tcMar>
-              <w:top w:w="80" w:type="dxa"/>
-              <w:bottom w:w="80" w:type="dxa"/>
-              <w:left w:w="120" w:type="dxa"/>
-              <w:right w:w="120" w:type="dxa"/>
+              <w:top w:w="70" w:type="dxa"/>
+              <w:bottom w:w="70" w:type="dxa"/>
+              <w:left w:w="110" w:type="dxa"/>
+              <w:right w:w="110" w:type="dxa"/>
             </w:tcMar>
             <w:vAlign w:val="center"/>
           </w:tcPr>
           <w:p>
             <w:pPr>
-              <w:spacing w:after="0" w:before="0"/>
+              <w:spacing w:before="0" w:after="0" w:line="252" w:lineRule="auto"/>
             </w:pPr>
           </w:p>
         </w:tc>
       </w:tr>
       <w:tr>
         <w:trPr>
-          <w:trHeight w:val="560" w:hRule="atLeast"/>
+          <w:trHeight w:val="620" w:hRule="atLeast"/>
         </w:trPr>
         <w:tc>
           <w:tcPr>
-            <w:tcW w:type="dxa" w:w="3888"/>
-            <w:shd w:val="clear" w:color="auto" w:fill="EAF1FB"/>
+            <w:tcW w:type="dxa" w:w="3600"/>
+            <w:shd w:val="clear" w:color="auto" w:fill="F5F5F5"/>
             <w:tcBorders>
-              <w:top w:val="single" w:sz="6" w:space="0" w:color="C9CCD1"/>
-              <w:left w:val="single" w:sz="6" w:space="0" w:color="C9CCD1"/>
-              <w:bottom w:val="single" w:sz="6" w:space="0" w:color="C9CCD1"/>
-              <w:right w:val="single" w:sz="6" w:space="0" w:color="C9CCD1"/>
+              <w:top w:val="single" w:sz="4" w:space="0" w:color="BFBFBF"/>
+              <w:left w:val="single" w:sz="4" w:space="0" w:color="BFBFBF"/>
+              <w:bottom w:val="single" w:sz="4" w:space="0" w:color="BFBFBF"/>
+              <w:right w:val="single" w:sz="4" w:space="0" w:color="BFBFBF"/>
             </w:tcBorders>
             <w:tcMar>
-              <w:top w:w="80" w:type="dxa"/>
-              <w:bottom w:w="80" w:type="dxa"/>
-              <w:left w:w="120" w:type="dxa"/>
-              <w:right w:w="120" w:type="dxa"/>
+              <w:top w:w="70" w:type="dxa"/>
+              <w:bottom w:w="70" w:type="dxa"/>
+              <w:left w:w="110" w:type="dxa"/>
+              <w:right w:w="110" w:type="dxa"/>
             </w:tcMar>
             <w:vAlign w:val="center"/>
           </w:tcPr>
           <w:p>
             <w:pPr>
-              <w:spacing w:after="0" w:before="0"/>
+              <w:spacing w:before="0" w:after="0" w:line="252" w:lineRule="auto"/>
             </w:pPr>
             <w:r>
               <w:rPr>
-                <w:rFonts w:ascii="Open Sans" w:hAnsi="Open Sans" w:cs="Open Sans"/>
+                <w:rFonts w:ascii="Calibri" w:hAnsi="Calibri" w:cs="Calibri"/>
                 <w:b/>
                 <w:i w:val="0"/>
-                <w:color w:val="54565A"/>
-                <w:sz w:val="21"/>
+                <w:color w:val="222222"/>
+                <w:sz w:val="19"/>
               </w:rPr>
               <w:t>Impact</w:t>
             </w:r>
             <w:r>
               <w:rPr>
-                <w:rFonts w:ascii="Open Sans" w:hAnsi="Open Sans" w:cs="Open Sans"/>
+                <w:rFonts w:ascii="Calibri" w:hAnsi="Calibri" w:cs="Calibri"/>
                 <w:b w:val="0"/>
                 <w:i/>
-                <w:color w:val="898A8D"/>
-                <w:sz w:val="18"/>
+                <w:color w:val="777777"/>
+                <w:sz w:val="16"/>
               </w:rPr>
               <w:t xml:space="preserve">  what changed — in human terms</w:t>
             </w:r>
@@ -536,24 +665,24 @@
         </w:tc>
         <w:tc>
           <w:tcPr>
-            <w:tcW w:type="dxa" w:w="5472"/>
+            <w:tcW w:type="dxa" w:w="6048"/>
             <w:tcBorders>
-              <w:top w:val="single" w:sz="6" w:space="0" w:color="C9CCD1"/>
-              <w:left w:val="single" w:sz="6" w:space="0" w:color="C9CCD1"/>
-              <w:bottom w:val="single" w:sz="6" w:space="0" w:color="C9CCD1"/>
-              <w:right w:val="single" w:sz="6" w:space="0" w:color="C9CCD1"/>
+              <w:top w:val="single" w:sz="4" w:space="0" w:color="BFBFBF"/>
+              <w:left w:val="single" w:sz="4" w:space="0" w:color="BFBFBF"/>
+              <w:bottom w:val="single" w:sz="4" w:space="0" w:color="BFBFBF"/>
+              <w:right w:val="single" w:sz="4" w:space="0" w:color="BFBFBF"/>
             </w:tcBorders>
             <w:tcMar>
-              <w:top w:w="80" w:type="dxa"/>
-              <w:bottom w:w="80" w:type="dxa"/>
-              <w:left w:w="120" w:type="dxa"/>
-              <w:right w:w="120" w:type="dxa"/>
+              <w:top w:w="70" w:type="dxa"/>
+              <w:bottom w:w="70" w:type="dxa"/>
+              <w:left w:w="110" w:type="dxa"/>
+              <w:right w:w="110" w:type="dxa"/>
             </w:tcMar>
             <w:vAlign w:val="center"/>
           </w:tcPr>
           <w:p>
             <w:pPr>
-              <w:spacing w:after="0" w:before="0"/>
+              <w:spacing w:before="0" w:after="0" w:line="252" w:lineRule="auto"/>
             </w:pPr>
           </w:p>
         </w:tc>
@@ -561,24 +690,62 @@
     </w:tbl>
     <w:p>
       <w:pPr>
-        <w:spacing w:after="40"/>
+        <w:spacing w:before="0" w:after="120" w:line="269" w:lineRule="auto"/>
       </w:pPr>
     </w:p>
+    <w:tbl>
+      <w:tblPr>
+        <w:tblW w:type="auto" w:w="0"/>
+        <w:jc w:val="left"/>
+        <w:tblLook w:firstColumn="1" w:firstRow="1" w:lastColumn="0" w:lastRow="0" w:noHBand="0" w:noVBand="1" w:val="04A0"/>
+      </w:tblPr>
+      <w:tblGrid>
+        <w:gridCol w:w="9648"/>
+      </w:tblGrid>
+      <w:tr>
+        <w:trPr>
+          <w:trHeight w:val="300" w:hRule="atLeast"/>
+        </w:trPr>
+        <w:tc>
+          <w:tcPr>
+            <w:tcW w:type="dxa" w:w="9648"/>
+            <w:shd w:val="clear" w:color="auto" w:fill="0067C8"/>
+            <w:tcBorders>
+              <w:top w:val="single" w:sz="4" w:space="0" w:color="0067C8"/>
+              <w:left w:val="single" w:sz="4" w:space="0" w:color="0067C8"/>
+              <w:bottom w:val="single" w:sz="4" w:space="0" w:color="0067C8"/>
+              <w:right w:val="single" w:sz="4" w:space="0" w:color="0067C8"/>
+            </w:tcBorders>
+            <w:tcMar>
+              <w:top w:w="40" w:type="dxa"/>
+              <w:bottom w:w="40" w:type="dxa"/>
+              <w:left w:w="110" w:type="dxa"/>
+              <w:right w:w="110" w:type="dxa"/>
+            </w:tcMar>
+            <w:vAlign w:val="center"/>
+          </w:tcPr>
+          <w:p>
+            <w:pPr>
+              <w:spacing w:before="0" w:after="0" w:line="252" w:lineRule="auto"/>
+            </w:pPr>
+            <w:r>
+              <w:rPr>
+                <w:rFonts w:ascii="Calibri" w:hAnsi="Calibri" w:cs="Calibri"/>
+                <w:b/>
+                <w:i w:val="0"/>
+                <w:color w:val="FFFFFF"/>
+                <w:sz w:val="21"/>
+              </w:rPr>
+              <w:t>Classification</w:t>
+            </w:r>
+          </w:p>
+        </w:tc>
+      </w:tr>
+    </w:tbl>
     <w:p>
       <w:pPr>
-        <w:keepNext/>
-        <w:spacing w:before="320" w:after="120"/>
+        <w:spacing w:before="0" w:after="0" w:line="269" w:lineRule="auto"/>
       </w:pPr>
-      <w:r>
-        <w:rPr>
-          <w:rFonts w:ascii="Open Sans Condensed" w:hAnsi="Open Sans Condensed" w:cs="Open Sans Condensed"/>
-          <w:b/>
-          <w:i w:val="0"/>
-          <w:color w:val="0067C8"/>
-          <w:sz w:val="30"/>
-        </w:rPr>
-        <w:t>Classification</w:t>
-      </w:r>
     </w:p>
     <w:tbl>
       <w:tblPr>
@@ -592,47 +759,47 @@
       </w:tblGrid>
       <w:tr>
         <w:trPr>
-          <w:trHeight w:val="560" w:hRule="atLeast"/>
+          <w:trHeight w:val="380" w:hRule="atLeast"/>
         </w:trPr>
         <w:tc>
           <w:tcPr>
-            <w:tcW w:type="dxa" w:w="3888"/>
-            <w:shd w:val="clear" w:color="auto" w:fill="EAF1FB"/>
+            <w:tcW w:type="dxa" w:w="3600"/>
+            <w:shd w:val="clear" w:color="auto" w:fill="F5F5F5"/>
             <w:tcBorders>
-              <w:top w:val="single" w:sz="6" w:space="0" w:color="C9CCD1"/>
-              <w:left w:val="single" w:sz="6" w:space="0" w:color="C9CCD1"/>
-              <w:bottom w:val="single" w:sz="6" w:space="0" w:color="C9CCD1"/>
-              <w:right w:val="single" w:sz="6" w:space="0" w:color="C9CCD1"/>
+              <w:top w:val="single" w:sz="4" w:space="0" w:color="BFBFBF"/>
+              <w:left w:val="single" w:sz="4" w:space="0" w:color="BFBFBF"/>
+              <w:bottom w:val="single" w:sz="4" w:space="0" w:color="BFBFBF"/>
+              <w:right w:val="single" w:sz="4" w:space="0" w:color="BFBFBF"/>
             </w:tcBorders>
             <w:tcMar>
-              <w:top w:w="80" w:type="dxa"/>
-              <w:bottom w:w="80" w:type="dxa"/>
-              <w:left w:w="120" w:type="dxa"/>
-              <w:right w:w="120" w:type="dxa"/>
+              <w:top w:w="70" w:type="dxa"/>
+              <w:bottom w:w="70" w:type="dxa"/>
+              <w:left w:w="110" w:type="dxa"/>
+              <w:right w:w="110" w:type="dxa"/>
             </w:tcMar>
             <w:vAlign w:val="center"/>
           </w:tcPr>
           <w:p>
             <w:pPr>
-              <w:spacing w:after="0" w:before="0"/>
+              <w:spacing w:before="0" w:after="0" w:line="252" w:lineRule="auto"/>
             </w:pPr>
             <w:r>
               <w:rPr>
-                <w:rFonts w:ascii="Open Sans" w:hAnsi="Open Sans" w:cs="Open Sans"/>
+                <w:rFonts w:ascii="Calibri" w:hAnsi="Calibri" w:cs="Calibri"/>
                 <w:b/>
                 <w:i w:val="0"/>
-                <w:color w:val="54565A"/>
-                <w:sz w:val="21"/>
+                <w:color w:val="222222"/>
+                <w:sz w:val="19"/>
               </w:rPr>
               <w:t>Area of Focus</w:t>
             </w:r>
             <w:r>
               <w:rPr>
-                <w:rFonts w:ascii="Open Sans" w:hAnsi="Open Sans" w:cs="Open Sans"/>
+                <w:rFonts w:ascii="Calibri" w:hAnsi="Calibri" w:cs="Calibri"/>
                 <w:b w:val="0"/>
                 <w:i/>
-                <w:color w:val="898A8D"/>
-                <w:sz w:val="18"/>
+                <w:color w:val="777777"/>
+                <w:sz w:val="16"/>
               </w:rPr>
               <w:t xml:space="preserve">  Peace · Disease · Water · Maternal/Child · Education · Economy · Environment</w:t>
             </w:r>
@@ -640,32 +807,32 @@
         </w:tc>
         <w:tc>
           <w:tcPr>
-            <w:tcW w:type="dxa" w:w="5472"/>
+            <w:tcW w:type="dxa" w:w="6048"/>
             <w:tcBorders>
-              <w:top w:val="single" w:sz="6" w:space="0" w:color="C9CCD1"/>
-              <w:left w:val="single" w:sz="6" w:space="0" w:color="C9CCD1"/>
-              <w:bottom w:val="single" w:sz="6" w:space="0" w:color="C9CCD1"/>
-              <w:right w:val="single" w:sz="6" w:space="0" w:color="C9CCD1"/>
+              <w:top w:val="single" w:sz="4" w:space="0" w:color="BFBFBF"/>
+              <w:left w:val="single" w:sz="4" w:space="0" w:color="BFBFBF"/>
+              <w:bottom w:val="single" w:sz="4" w:space="0" w:color="BFBFBF"/>
+              <w:right w:val="single" w:sz="4" w:space="0" w:color="BFBFBF"/>
             </w:tcBorders>
             <w:tcMar>
-              <w:top w:w="80" w:type="dxa"/>
-              <w:bottom w:w="80" w:type="dxa"/>
-              <w:left w:w="120" w:type="dxa"/>
-              <w:right w:w="120" w:type="dxa"/>
+              <w:top w:w="70" w:type="dxa"/>
+              <w:bottom w:w="70" w:type="dxa"/>
+              <w:left w:w="110" w:type="dxa"/>
+              <w:right w:w="110" w:type="dxa"/>
             </w:tcMar>
             <w:vAlign w:val="center"/>
           </w:tcPr>
           <w:p>
             <w:pPr>
-              <w:spacing w:after="0" w:before="0"/>
+              <w:spacing w:before="0" w:after="0" w:line="252" w:lineRule="auto"/>
             </w:pPr>
             <w:r>
               <w:rPr>
-                <w:rFonts w:ascii="Open Sans" w:hAnsi="Open Sans" w:cs="Open Sans"/>
+                <w:rFonts w:ascii="Calibri" w:hAnsi="Calibri" w:cs="Calibri"/>
                 <w:b w:val="0"/>
                 <w:i w:val="0"/>
-                <w:color w:val="54565A"/>
-                <w:sz w:val="21"/>
+                <w:color w:val="222222"/>
+                <w:sz w:val="19"/>
               </w:rPr>
               <w:t>Environment</w:t>
             </w:r>
@@ -674,47 +841,47 @@
       </w:tr>
       <w:tr>
         <w:trPr>
-          <w:trHeight w:val="560" w:hRule="atLeast"/>
+          <w:trHeight w:val="380" w:hRule="atLeast"/>
         </w:trPr>
         <w:tc>
           <w:tcPr>
-            <w:tcW w:type="dxa" w:w="3888"/>
-            <w:shd w:val="clear" w:color="auto" w:fill="EAF1FB"/>
+            <w:tcW w:type="dxa" w:w="3600"/>
+            <w:shd w:val="clear" w:color="auto" w:fill="F5F5F5"/>
             <w:tcBorders>
-              <w:top w:val="single" w:sz="6" w:space="0" w:color="C9CCD1"/>
-              <w:left w:val="single" w:sz="6" w:space="0" w:color="C9CCD1"/>
-              <w:bottom w:val="single" w:sz="6" w:space="0" w:color="C9CCD1"/>
-              <w:right w:val="single" w:sz="6" w:space="0" w:color="C9CCD1"/>
+              <w:top w:val="single" w:sz="4" w:space="0" w:color="BFBFBF"/>
+              <w:left w:val="single" w:sz="4" w:space="0" w:color="BFBFBF"/>
+              <w:bottom w:val="single" w:sz="4" w:space="0" w:color="BFBFBF"/>
+              <w:right w:val="single" w:sz="4" w:space="0" w:color="BFBFBF"/>
             </w:tcBorders>
             <w:tcMar>
-              <w:top w:w="80" w:type="dxa"/>
-              <w:bottom w:w="80" w:type="dxa"/>
-              <w:left w:w="120" w:type="dxa"/>
-              <w:right w:w="120" w:type="dxa"/>
+              <w:top w:w="70" w:type="dxa"/>
+              <w:bottom w:w="70" w:type="dxa"/>
+              <w:left w:w="110" w:type="dxa"/>
+              <w:right w:w="110" w:type="dxa"/>
             </w:tcMar>
             <w:vAlign w:val="center"/>
           </w:tcPr>
           <w:p>
             <w:pPr>
-              <w:spacing w:after="0" w:before="0"/>
+              <w:spacing w:before="0" w:after="0" w:line="252" w:lineRule="auto"/>
             </w:pPr>
             <w:r>
               <w:rPr>
-                <w:rFonts w:ascii="Open Sans" w:hAnsi="Open Sans" w:cs="Open Sans"/>
+                <w:rFonts w:ascii="Calibri" w:hAnsi="Calibri" w:cs="Calibri"/>
                 <w:b/>
                 <w:i w:val="0"/>
-                <w:color w:val="54565A"/>
-                <w:sz w:val="21"/>
+                <w:color w:val="222222"/>
+                <w:sz w:val="19"/>
               </w:rPr>
               <w:t>Funding</w:t>
             </w:r>
             <w:r>
               <w:rPr>
-                <w:rFonts w:ascii="Open Sans" w:hAnsi="Open Sans" w:cs="Open Sans"/>
+                <w:rFonts w:ascii="Calibri" w:hAnsi="Calibri" w:cs="Calibri"/>
                 <w:b w:val="0"/>
                 <w:i/>
-                <w:color w:val="898A8D"/>
-                <w:sz w:val="18"/>
+                <w:color w:val="777777"/>
+                <w:sz w:val="16"/>
               </w:rPr>
               <w:t xml:space="preserve">  Club · District Grant · Global Grant · Joint</w:t>
             </w:r>
@@ -722,32 +889,32 @@
         </w:tc>
         <w:tc>
           <w:tcPr>
-            <w:tcW w:type="dxa" w:w="5472"/>
+            <w:tcW w:type="dxa" w:w="6048"/>
             <w:tcBorders>
-              <w:top w:val="single" w:sz="6" w:space="0" w:color="C9CCD1"/>
-              <w:left w:val="single" w:sz="6" w:space="0" w:color="C9CCD1"/>
-              <w:bottom w:val="single" w:sz="6" w:space="0" w:color="C9CCD1"/>
-              <w:right w:val="single" w:sz="6" w:space="0" w:color="C9CCD1"/>
+              <w:top w:val="single" w:sz="4" w:space="0" w:color="BFBFBF"/>
+              <w:left w:val="single" w:sz="4" w:space="0" w:color="BFBFBF"/>
+              <w:bottom w:val="single" w:sz="4" w:space="0" w:color="BFBFBF"/>
+              <w:right w:val="single" w:sz="4" w:space="0" w:color="BFBFBF"/>
             </w:tcBorders>
             <w:tcMar>
-              <w:top w:w="80" w:type="dxa"/>
-              <w:bottom w:w="80" w:type="dxa"/>
-              <w:left w:w="120" w:type="dxa"/>
-              <w:right w:w="120" w:type="dxa"/>
+              <w:top w:w="70" w:type="dxa"/>
+              <w:bottom w:w="70" w:type="dxa"/>
+              <w:left w:w="110" w:type="dxa"/>
+              <w:right w:w="110" w:type="dxa"/>
             </w:tcMar>
             <w:vAlign w:val="center"/>
           </w:tcPr>
           <w:p>
             <w:pPr>
-              <w:spacing w:after="0" w:before="0"/>
+              <w:spacing w:before="0" w:after="0" w:line="252" w:lineRule="auto"/>
             </w:pPr>
             <w:r>
               <w:rPr>
-                <w:rFonts w:ascii="Open Sans" w:hAnsi="Open Sans" w:cs="Open Sans"/>
+                <w:rFonts w:ascii="Calibri" w:hAnsi="Calibri" w:cs="Calibri"/>
                 <w:b w:val="0"/>
                 <w:i w:val="0"/>
-                <w:color w:val="54565A"/>
-                <w:sz w:val="21"/>
+                <w:color w:val="222222"/>
+                <w:sz w:val="19"/>
               </w:rPr>
               <w:t>Club</w:t>
             </w:r>
@@ -756,47 +923,47 @@
       </w:tr>
       <w:tr>
         <w:trPr>
-          <w:trHeight w:val="560" w:hRule="atLeast"/>
+          <w:trHeight w:val="380" w:hRule="atLeast"/>
         </w:trPr>
         <w:tc>
           <w:tcPr>
-            <w:tcW w:type="dxa" w:w="3888"/>
-            <w:shd w:val="clear" w:color="auto" w:fill="EAF1FB"/>
+            <w:tcW w:type="dxa" w:w="3600"/>
+            <w:shd w:val="clear" w:color="auto" w:fill="F5F5F5"/>
             <w:tcBorders>
-              <w:top w:val="single" w:sz="6" w:space="0" w:color="C9CCD1"/>
-              <w:left w:val="single" w:sz="6" w:space="0" w:color="C9CCD1"/>
-              <w:bottom w:val="single" w:sz="6" w:space="0" w:color="C9CCD1"/>
-              <w:right w:val="single" w:sz="6" w:space="0" w:color="C9CCD1"/>
+              <w:top w:val="single" w:sz="4" w:space="0" w:color="BFBFBF"/>
+              <w:left w:val="single" w:sz="4" w:space="0" w:color="BFBFBF"/>
+              <w:bottom w:val="single" w:sz="4" w:space="0" w:color="BFBFBF"/>
+              <w:right w:val="single" w:sz="4" w:space="0" w:color="BFBFBF"/>
             </w:tcBorders>
             <w:tcMar>
-              <w:top w:w="80" w:type="dxa"/>
-              <w:bottom w:w="80" w:type="dxa"/>
-              <w:left w:w="120" w:type="dxa"/>
-              <w:right w:w="120" w:type="dxa"/>
+              <w:top w:w="70" w:type="dxa"/>
+              <w:bottom w:w="70" w:type="dxa"/>
+              <w:left w:w="110" w:type="dxa"/>
+              <w:right w:w="110" w:type="dxa"/>
             </w:tcMar>
             <w:vAlign w:val="center"/>
           </w:tcPr>
           <w:p>
             <w:pPr>
-              <w:spacing w:after="0" w:before="0"/>
+              <w:spacing w:before="0" w:after="0" w:line="252" w:lineRule="auto"/>
             </w:pPr>
             <w:r>
               <w:rPr>
-                <w:rFonts w:ascii="Open Sans" w:hAnsi="Open Sans" w:cs="Open Sans"/>
+                <w:rFonts w:ascii="Calibri" w:hAnsi="Calibri" w:cs="Calibri"/>
                 <w:b/>
                 <w:i w:val="0"/>
-                <w:color w:val="54565A"/>
-                <w:sz w:val="21"/>
+                <w:color w:val="222222"/>
+                <w:sz w:val="19"/>
               </w:rPr>
               <w:t>Status</w:t>
             </w:r>
             <w:r>
               <w:rPr>
-                <w:rFonts w:ascii="Open Sans" w:hAnsi="Open Sans" w:cs="Open Sans"/>
+                <w:rFonts w:ascii="Calibri" w:hAnsi="Calibri" w:cs="Calibri"/>
                 <w:b w:val="0"/>
                 <w:i/>
-                <w:color w:val="898A8D"/>
-                <w:sz w:val="18"/>
+                <w:color w:val="777777"/>
+                <w:sz w:val="16"/>
               </w:rPr>
               <w:t xml:space="preserve">  Planning · Execution · Paused · Completed · Dropped</w:t>
             </w:r>
@@ -804,32 +971,32 @@
         </w:tc>
         <w:tc>
           <w:tcPr>
-            <w:tcW w:type="dxa" w:w="5472"/>
+            <w:tcW w:type="dxa" w:w="6048"/>
             <w:tcBorders>
-              <w:top w:val="single" w:sz="6" w:space="0" w:color="C9CCD1"/>
-              <w:left w:val="single" w:sz="6" w:space="0" w:color="C9CCD1"/>
-              <w:bottom w:val="single" w:sz="6" w:space="0" w:color="C9CCD1"/>
-              <w:right w:val="single" w:sz="6" w:space="0" w:color="C9CCD1"/>
+              <w:top w:val="single" w:sz="4" w:space="0" w:color="BFBFBF"/>
+              <w:left w:val="single" w:sz="4" w:space="0" w:color="BFBFBF"/>
+              <w:bottom w:val="single" w:sz="4" w:space="0" w:color="BFBFBF"/>
+              <w:right w:val="single" w:sz="4" w:space="0" w:color="BFBFBF"/>
             </w:tcBorders>
             <w:tcMar>
-              <w:top w:w="80" w:type="dxa"/>
-              <w:bottom w:w="80" w:type="dxa"/>
-              <w:left w:w="120" w:type="dxa"/>
-              <w:right w:w="120" w:type="dxa"/>
+              <w:top w:w="70" w:type="dxa"/>
+              <w:bottom w:w="70" w:type="dxa"/>
+              <w:left w:w="110" w:type="dxa"/>
+              <w:right w:w="110" w:type="dxa"/>
             </w:tcMar>
             <w:vAlign w:val="center"/>
           </w:tcPr>
           <w:p>
             <w:pPr>
-              <w:spacing w:after="0" w:before="0"/>
+              <w:spacing w:before="0" w:after="0" w:line="252" w:lineRule="auto"/>
             </w:pPr>
             <w:r>
               <w:rPr>
-                <w:rFonts w:ascii="Open Sans" w:hAnsi="Open Sans" w:cs="Open Sans"/>
+                <w:rFonts w:ascii="Calibri" w:hAnsi="Calibri" w:cs="Calibri"/>
                 <w:b w:val="0"/>
                 <w:i w:val="0"/>
-                <w:color w:val="54565A"/>
-                <w:sz w:val="21"/>
+                <w:color w:val="222222"/>
+                <w:sz w:val="19"/>
               </w:rPr>
               <w:t>Completed</w:t>
             </w:r>
@@ -839,24 +1006,62 @@
     </w:tbl>
     <w:p>
       <w:pPr>
-        <w:spacing w:after="40"/>
+        <w:spacing w:before="0" w:after="120" w:line="269" w:lineRule="auto"/>
       </w:pPr>
     </w:p>
+    <w:tbl>
+      <w:tblPr>
+        <w:tblW w:type="auto" w:w="0"/>
+        <w:jc w:val="left"/>
+        <w:tblLook w:firstColumn="1" w:firstRow="1" w:lastColumn="0" w:lastRow="0" w:noHBand="0" w:noVBand="1" w:val="04A0"/>
+      </w:tblPr>
+      <w:tblGrid>
+        <w:gridCol w:w="9648"/>
+      </w:tblGrid>
+      <w:tr>
+        <w:trPr>
+          <w:trHeight w:val="300" w:hRule="atLeast"/>
+        </w:trPr>
+        <w:tc>
+          <w:tcPr>
+            <w:tcW w:type="dxa" w:w="9648"/>
+            <w:shd w:val="clear" w:color="auto" w:fill="0067C8"/>
+            <w:tcBorders>
+              <w:top w:val="single" w:sz="4" w:space="0" w:color="0067C8"/>
+              <w:left w:val="single" w:sz="4" w:space="0" w:color="0067C8"/>
+              <w:bottom w:val="single" w:sz="4" w:space="0" w:color="0067C8"/>
+              <w:right w:val="single" w:sz="4" w:space="0" w:color="0067C8"/>
+            </w:tcBorders>
+            <w:tcMar>
+              <w:top w:w="40" w:type="dxa"/>
+              <w:bottom w:w="40" w:type="dxa"/>
+              <w:left w:w="110" w:type="dxa"/>
+              <w:right w:w="110" w:type="dxa"/>
+            </w:tcMar>
+            <w:vAlign w:val="center"/>
+          </w:tcPr>
+          <w:p>
+            <w:pPr>
+              <w:spacing w:before="0" w:after="0" w:line="252" w:lineRule="auto"/>
+            </w:pPr>
+            <w:r>
+              <w:rPr>
+                <w:rFonts w:ascii="Calibri" w:hAnsi="Calibri" w:cs="Calibri"/>
+                <w:b/>
+                <w:i w:val="0"/>
+                <w:color w:val="FFFFFF"/>
+                <w:sz w:val="21"/>
+              </w:rPr>
+              <w:t>When &amp; Where</w:t>
+            </w:r>
+          </w:p>
+        </w:tc>
+      </w:tr>
+    </w:tbl>
     <w:p>
       <w:pPr>
-        <w:keepNext/>
-        <w:spacing w:before="320" w:after="120"/>
+        <w:spacing w:before="0" w:after="0" w:line="269" w:lineRule="auto"/>
       </w:pPr>
-      <w:r>
-        <w:rPr>
-          <w:rFonts w:ascii="Open Sans Condensed" w:hAnsi="Open Sans Condensed" w:cs="Open Sans Condensed"/>
-          <w:b/>
-          <w:i w:val="0"/>
-          <w:color w:val="0067C8"/>
-          <w:sz w:val="30"/>
-        </w:rPr>
-        <w:t>When &amp; Where</w:t>
-      </w:r>
     </w:p>
     <w:tbl>
       <w:tblPr>
@@ -870,47 +1075,47 @@
       </w:tblGrid>
       <w:tr>
         <w:trPr>
-          <w:trHeight w:val="560" w:hRule="atLeast"/>
+          <w:trHeight w:val="380" w:hRule="atLeast"/>
         </w:trPr>
         <w:tc>
           <w:tcPr>
-            <w:tcW w:type="dxa" w:w="3888"/>
-            <w:shd w:val="clear" w:color="auto" w:fill="EAF1FB"/>
+            <w:tcW w:type="dxa" w:w="3600"/>
+            <w:shd w:val="clear" w:color="auto" w:fill="F5F5F5"/>
             <w:tcBorders>
-              <w:top w:val="single" w:sz="6" w:space="0" w:color="C9CCD1"/>
-              <w:left w:val="single" w:sz="6" w:space="0" w:color="C9CCD1"/>
-              <w:bottom w:val="single" w:sz="6" w:space="0" w:color="C9CCD1"/>
-              <w:right w:val="single" w:sz="6" w:space="0" w:color="C9CCD1"/>
+              <w:top w:val="single" w:sz="4" w:space="0" w:color="BFBFBF"/>
+              <w:left w:val="single" w:sz="4" w:space="0" w:color="BFBFBF"/>
+              <w:bottom w:val="single" w:sz="4" w:space="0" w:color="BFBFBF"/>
+              <w:right w:val="single" w:sz="4" w:space="0" w:color="BFBFBF"/>
             </w:tcBorders>
             <w:tcMar>
-              <w:top w:w="80" w:type="dxa"/>
-              <w:bottom w:w="80" w:type="dxa"/>
-              <w:left w:w="120" w:type="dxa"/>
-              <w:right w:w="120" w:type="dxa"/>
+              <w:top w:w="70" w:type="dxa"/>
+              <w:bottom w:w="70" w:type="dxa"/>
+              <w:left w:w="110" w:type="dxa"/>
+              <w:right w:w="110" w:type="dxa"/>
             </w:tcMar>
             <w:vAlign w:val="center"/>
           </w:tcPr>
           <w:p>
             <w:pPr>
-              <w:spacing w:after="0" w:before="0"/>
+              <w:spacing w:before="0" w:after="0" w:line="252" w:lineRule="auto"/>
             </w:pPr>
             <w:r>
               <w:rPr>
-                <w:rFonts w:ascii="Open Sans" w:hAnsi="Open Sans" w:cs="Open Sans"/>
+                <w:rFonts w:ascii="Calibri" w:hAnsi="Calibri" w:cs="Calibri"/>
                 <w:b/>
                 <w:i w:val="0"/>
-                <w:color w:val="54565A"/>
-                <w:sz w:val="21"/>
+                <w:color w:val="222222"/>
+                <w:sz w:val="19"/>
               </w:rPr>
               <w:t>Start date</w:t>
             </w:r>
             <w:r>
               <w:rPr>
-                <w:rFonts w:ascii="Open Sans" w:hAnsi="Open Sans" w:cs="Open Sans"/>
+                <w:rFonts w:ascii="Calibri" w:hAnsi="Calibri" w:cs="Calibri"/>
                 <w:b w:val="0"/>
                 <w:i/>
-                <w:color w:val="898A8D"/>
-                <w:sz w:val="18"/>
+                <w:color w:val="777777"/>
+                <w:sz w:val="16"/>
               </w:rPr>
               <w:t xml:space="preserve">  e.g. 2024-09</w:t>
             </w:r>
@@ -918,71 +1123,71 @@
         </w:tc>
         <w:tc>
           <w:tcPr>
-            <w:tcW w:type="dxa" w:w="5472"/>
+            <w:tcW w:type="dxa" w:w="6048"/>
             <w:tcBorders>
-              <w:top w:val="single" w:sz="6" w:space="0" w:color="C9CCD1"/>
-              <w:left w:val="single" w:sz="6" w:space="0" w:color="C9CCD1"/>
-              <w:bottom w:val="single" w:sz="6" w:space="0" w:color="C9CCD1"/>
-              <w:right w:val="single" w:sz="6" w:space="0" w:color="C9CCD1"/>
+              <w:top w:val="single" w:sz="4" w:space="0" w:color="BFBFBF"/>
+              <w:left w:val="single" w:sz="4" w:space="0" w:color="BFBFBF"/>
+              <w:bottom w:val="single" w:sz="4" w:space="0" w:color="BFBFBF"/>
+              <w:right w:val="single" w:sz="4" w:space="0" w:color="BFBFBF"/>
             </w:tcBorders>
             <w:tcMar>
-              <w:top w:w="80" w:type="dxa"/>
-              <w:bottom w:w="80" w:type="dxa"/>
-              <w:left w:w="120" w:type="dxa"/>
-              <w:right w:w="120" w:type="dxa"/>
+              <w:top w:w="70" w:type="dxa"/>
+              <w:bottom w:w="70" w:type="dxa"/>
+              <w:left w:w="110" w:type="dxa"/>
+              <w:right w:w="110" w:type="dxa"/>
             </w:tcMar>
             <w:vAlign w:val="center"/>
           </w:tcPr>
           <w:p>
             <w:pPr>
-              <w:spacing w:after="0" w:before="0"/>
+              <w:spacing w:before="0" w:after="0" w:line="252" w:lineRule="auto"/>
             </w:pPr>
           </w:p>
         </w:tc>
       </w:tr>
       <w:tr>
         <w:trPr>
-          <w:trHeight w:val="560" w:hRule="atLeast"/>
+          <w:trHeight w:val="380" w:hRule="atLeast"/>
         </w:trPr>
         <w:tc>
           <w:tcPr>
-            <w:tcW w:type="dxa" w:w="3888"/>
-            <w:shd w:val="clear" w:color="auto" w:fill="EAF1FB"/>
+            <w:tcW w:type="dxa" w:w="3600"/>
+            <w:shd w:val="clear" w:color="auto" w:fill="F5F5F5"/>
             <w:tcBorders>
-              <w:top w:val="single" w:sz="6" w:space="0" w:color="C9CCD1"/>
-              <w:left w:val="single" w:sz="6" w:space="0" w:color="C9CCD1"/>
-              <w:bottom w:val="single" w:sz="6" w:space="0" w:color="C9CCD1"/>
-              <w:right w:val="single" w:sz="6" w:space="0" w:color="C9CCD1"/>
+              <w:top w:val="single" w:sz="4" w:space="0" w:color="BFBFBF"/>
+              <w:left w:val="single" w:sz="4" w:space="0" w:color="BFBFBF"/>
+              <w:bottom w:val="single" w:sz="4" w:space="0" w:color="BFBFBF"/>
+              <w:right w:val="single" w:sz="4" w:space="0" w:color="BFBFBF"/>
             </w:tcBorders>
             <w:tcMar>
-              <w:top w:w="80" w:type="dxa"/>
-              <w:bottom w:w="80" w:type="dxa"/>
-              <w:left w:w="120" w:type="dxa"/>
-              <w:right w:w="120" w:type="dxa"/>
+              <w:top w:w="70" w:type="dxa"/>
+              <w:bottom w:w="70" w:type="dxa"/>
+              <w:left w:w="110" w:type="dxa"/>
+              <w:right w:w="110" w:type="dxa"/>
             </w:tcMar>
             <w:vAlign w:val="center"/>
           </w:tcPr>
           <w:p>
             <w:pPr>
-              <w:spacing w:after="0" w:before="0"/>
+              <w:spacing w:before="0" w:after="0" w:line="252" w:lineRule="auto"/>
             </w:pPr>
             <w:r>
               <w:rPr>
-                <w:rFonts w:ascii="Open Sans" w:hAnsi="Open Sans" w:cs="Open Sans"/>
+                <w:rFonts w:ascii="Calibri" w:hAnsi="Calibri" w:cs="Calibri"/>
                 <w:b/>
                 <w:i w:val="0"/>
-                <w:color w:val="54565A"/>
-                <w:sz w:val="21"/>
+                <w:color w:val="222222"/>
+                <w:sz w:val="19"/>
               </w:rPr>
               <w:t>Completion date</w:t>
             </w:r>
             <w:r>
               <w:rPr>
-                <w:rFonts w:ascii="Open Sans" w:hAnsi="Open Sans" w:cs="Open Sans"/>
+                <w:rFonts w:ascii="Calibri" w:hAnsi="Calibri" w:cs="Calibri"/>
                 <w:b w:val="0"/>
                 <w:i/>
-                <w:color w:val="898A8D"/>
-                <w:sz w:val="18"/>
+                <w:color w:val="777777"/>
+                <w:sz w:val="16"/>
               </w:rPr>
               <w:t xml:space="preserve">  blank if ongoing</w:t>
             </w:r>
@@ -990,61 +1195,61 @@
         </w:tc>
         <w:tc>
           <w:tcPr>
-            <w:tcW w:type="dxa" w:w="5472"/>
+            <w:tcW w:type="dxa" w:w="6048"/>
             <w:tcBorders>
-              <w:top w:val="single" w:sz="6" w:space="0" w:color="C9CCD1"/>
-              <w:left w:val="single" w:sz="6" w:space="0" w:color="C9CCD1"/>
-              <w:bottom w:val="single" w:sz="6" w:space="0" w:color="C9CCD1"/>
-              <w:right w:val="single" w:sz="6" w:space="0" w:color="C9CCD1"/>
+              <w:top w:val="single" w:sz="4" w:space="0" w:color="BFBFBF"/>
+              <w:left w:val="single" w:sz="4" w:space="0" w:color="BFBFBF"/>
+              <w:bottom w:val="single" w:sz="4" w:space="0" w:color="BFBFBF"/>
+              <w:right w:val="single" w:sz="4" w:space="0" w:color="BFBFBF"/>
             </w:tcBorders>
             <w:tcMar>
-              <w:top w:w="80" w:type="dxa"/>
-              <w:bottom w:w="80" w:type="dxa"/>
-              <w:left w:w="120" w:type="dxa"/>
-              <w:right w:w="120" w:type="dxa"/>
+              <w:top w:w="70" w:type="dxa"/>
+              <w:bottom w:w="70" w:type="dxa"/>
+              <w:left w:w="110" w:type="dxa"/>
+              <w:right w:w="110" w:type="dxa"/>
             </w:tcMar>
             <w:vAlign w:val="center"/>
           </w:tcPr>
           <w:p>
             <w:pPr>
-              <w:spacing w:after="0" w:before="0"/>
+              <w:spacing w:before="0" w:after="0" w:line="252" w:lineRule="auto"/>
             </w:pPr>
           </w:p>
         </w:tc>
       </w:tr>
       <w:tr>
         <w:trPr>
-          <w:trHeight w:val="560" w:hRule="atLeast"/>
+          <w:trHeight w:val="380" w:hRule="atLeast"/>
         </w:trPr>
         <w:tc>
           <w:tcPr>
-            <w:tcW w:type="dxa" w:w="3888"/>
-            <w:shd w:val="clear" w:color="auto" w:fill="EAF1FB"/>
+            <w:tcW w:type="dxa" w:w="3600"/>
+            <w:shd w:val="clear" w:color="auto" w:fill="F5F5F5"/>
             <w:tcBorders>
-              <w:top w:val="single" w:sz="6" w:space="0" w:color="C9CCD1"/>
-              <w:left w:val="single" w:sz="6" w:space="0" w:color="C9CCD1"/>
-              <w:bottom w:val="single" w:sz="6" w:space="0" w:color="C9CCD1"/>
-              <w:right w:val="single" w:sz="6" w:space="0" w:color="C9CCD1"/>
+              <w:top w:val="single" w:sz="4" w:space="0" w:color="BFBFBF"/>
+              <w:left w:val="single" w:sz="4" w:space="0" w:color="BFBFBF"/>
+              <w:bottom w:val="single" w:sz="4" w:space="0" w:color="BFBFBF"/>
+              <w:right w:val="single" w:sz="4" w:space="0" w:color="BFBFBF"/>
             </w:tcBorders>
             <w:tcMar>
-              <w:top w:w="80" w:type="dxa"/>
-              <w:bottom w:w="80" w:type="dxa"/>
-              <w:left w:w="120" w:type="dxa"/>
-              <w:right w:w="120" w:type="dxa"/>
+              <w:top w:w="70" w:type="dxa"/>
+              <w:bottom w:w="70" w:type="dxa"/>
+              <w:left w:w="110" w:type="dxa"/>
+              <w:right w:w="110" w:type="dxa"/>
             </w:tcMar>
             <w:vAlign w:val="center"/>
           </w:tcPr>
           <w:p>
             <w:pPr>
-              <w:spacing w:after="0" w:before="0"/>
+              <w:spacing w:before="0" w:after="0" w:line="252" w:lineRule="auto"/>
             </w:pPr>
             <w:r>
               <w:rPr>
-                <w:rFonts w:ascii="Open Sans" w:hAnsi="Open Sans" w:cs="Open Sans"/>
+                <w:rFonts w:ascii="Calibri" w:hAnsi="Calibri" w:cs="Calibri"/>
                 <w:b/>
                 <w:i w:val="0"/>
-                <w:color w:val="54565A"/>
-                <w:sz w:val="21"/>
+                <w:color w:val="222222"/>
+                <w:sz w:val="19"/>
               </w:rPr>
               <w:t>Location</w:t>
             </w:r>
@@ -1052,32 +1257,32 @@
         </w:tc>
         <w:tc>
           <w:tcPr>
-            <w:tcW w:type="dxa" w:w="5472"/>
+            <w:tcW w:type="dxa" w:w="6048"/>
             <w:tcBorders>
-              <w:top w:val="single" w:sz="6" w:space="0" w:color="C9CCD1"/>
-              <w:left w:val="single" w:sz="6" w:space="0" w:color="C9CCD1"/>
-              <w:bottom w:val="single" w:sz="6" w:space="0" w:color="C9CCD1"/>
-              <w:right w:val="single" w:sz="6" w:space="0" w:color="C9CCD1"/>
+              <w:top w:val="single" w:sz="4" w:space="0" w:color="BFBFBF"/>
+              <w:left w:val="single" w:sz="4" w:space="0" w:color="BFBFBF"/>
+              <w:bottom w:val="single" w:sz="4" w:space="0" w:color="BFBFBF"/>
+              <w:right w:val="single" w:sz="4" w:space="0" w:color="BFBFBF"/>
             </w:tcBorders>
             <w:tcMar>
-              <w:top w:w="80" w:type="dxa"/>
-              <w:bottom w:w="80" w:type="dxa"/>
-              <w:left w:w="120" w:type="dxa"/>
-              <w:right w:w="120" w:type="dxa"/>
+              <w:top w:w="70" w:type="dxa"/>
+              <w:bottom w:w="70" w:type="dxa"/>
+              <w:left w:w="110" w:type="dxa"/>
+              <w:right w:w="110" w:type="dxa"/>
             </w:tcMar>
             <w:vAlign w:val="center"/>
           </w:tcPr>
           <w:p>
             <w:pPr>
-              <w:spacing w:after="0" w:before="0"/>
+              <w:spacing w:before="0" w:after="0" w:line="252" w:lineRule="auto"/>
             </w:pPr>
             <w:r>
               <w:rPr>
-                <w:rFonts w:ascii="Open Sans" w:hAnsi="Open Sans" w:cs="Open Sans"/>
+                <w:rFonts w:ascii="Calibri" w:hAnsi="Calibri" w:cs="Calibri"/>
                 <w:b w:val="0"/>
                 <w:i w:val="0"/>
-                <w:color w:val="54565A"/>
-                <w:sz w:val="21"/>
+                <w:color w:val="222222"/>
+                <w:sz w:val="19"/>
               </w:rPr>
               <w:t>Penang</w:t>
             </w:r>
@@ -1087,24 +1292,62 @@
     </w:tbl>
     <w:p>
       <w:pPr>
-        <w:spacing w:after="40"/>
+        <w:spacing w:before="0" w:after="120" w:line="269" w:lineRule="auto"/>
       </w:pPr>
     </w:p>
+    <w:tbl>
+      <w:tblPr>
+        <w:tblW w:type="auto" w:w="0"/>
+        <w:jc w:val="left"/>
+        <w:tblLook w:firstColumn="1" w:firstRow="1" w:lastColumn="0" w:lastRow="0" w:noHBand="0" w:noVBand="1" w:val="04A0"/>
+      </w:tblPr>
+      <w:tblGrid>
+        <w:gridCol w:w="9648"/>
+      </w:tblGrid>
+      <w:tr>
+        <w:trPr>
+          <w:trHeight w:val="300" w:hRule="atLeast"/>
+        </w:trPr>
+        <w:tc>
+          <w:tcPr>
+            <w:tcW w:type="dxa" w:w="9648"/>
+            <w:shd w:val="clear" w:color="auto" w:fill="0067C8"/>
+            <w:tcBorders>
+              <w:top w:val="single" w:sz="4" w:space="0" w:color="0067C8"/>
+              <w:left w:val="single" w:sz="4" w:space="0" w:color="0067C8"/>
+              <w:bottom w:val="single" w:sz="4" w:space="0" w:color="0067C8"/>
+              <w:right w:val="single" w:sz="4" w:space="0" w:color="0067C8"/>
+            </w:tcBorders>
+            <w:tcMar>
+              <w:top w:w="40" w:type="dxa"/>
+              <w:bottom w:w="40" w:type="dxa"/>
+              <w:left w:w="110" w:type="dxa"/>
+              <w:right w:w="110" w:type="dxa"/>
+            </w:tcMar>
+            <w:vAlign w:val="center"/>
+          </w:tcPr>
+          <w:p>
+            <w:pPr>
+              <w:spacing w:before="0" w:after="0" w:line="252" w:lineRule="auto"/>
+            </w:pPr>
+            <w:r>
+              <w:rPr>
+                <w:rFonts w:ascii="Calibri" w:hAnsi="Calibri" w:cs="Calibri"/>
+                <w:b/>
+                <w:i w:val="0"/>
+                <w:color w:val="FFFFFF"/>
+                <w:sz w:val="21"/>
+              </w:rPr>
+              <w:t>By the Numbers</w:t>
+            </w:r>
+          </w:p>
+        </w:tc>
+      </w:tr>
+    </w:tbl>
     <w:p>
       <w:pPr>
-        <w:keepNext/>
-        <w:spacing w:before="320" w:after="120"/>
+        <w:spacing w:before="0" w:after="0" w:line="269" w:lineRule="auto"/>
       </w:pPr>
-      <w:r>
-        <w:rPr>
-          <w:rFonts w:ascii="Open Sans Condensed" w:hAnsi="Open Sans Condensed" w:cs="Open Sans Condensed"/>
-          <w:b/>
-          <w:i w:val="0"/>
-          <w:color w:val="0067C8"/>
-          <w:sz w:val="30"/>
-        </w:rPr>
-        <w:t>By the Numbers</w:t>
-      </w:r>
     </w:p>
     <w:tbl>
       <w:tblPr>
@@ -1118,47 +1361,47 @@
       </w:tblGrid>
       <w:tr>
         <w:trPr>
-          <w:trHeight w:val="560" w:hRule="atLeast"/>
+          <w:trHeight w:val="380" w:hRule="atLeast"/>
         </w:trPr>
         <w:tc>
           <w:tcPr>
-            <w:tcW w:type="dxa" w:w="3888"/>
-            <w:shd w:val="clear" w:color="auto" w:fill="EAF1FB"/>
+            <w:tcW w:type="dxa" w:w="3600"/>
+            <w:shd w:val="clear" w:color="auto" w:fill="F5F5F5"/>
             <w:tcBorders>
-              <w:top w:val="single" w:sz="6" w:space="0" w:color="C9CCD1"/>
-              <w:left w:val="single" w:sz="6" w:space="0" w:color="C9CCD1"/>
-              <w:bottom w:val="single" w:sz="6" w:space="0" w:color="C9CCD1"/>
-              <w:right w:val="single" w:sz="6" w:space="0" w:color="C9CCD1"/>
+              <w:top w:val="single" w:sz="4" w:space="0" w:color="BFBFBF"/>
+              <w:left w:val="single" w:sz="4" w:space="0" w:color="BFBFBF"/>
+              <w:bottom w:val="single" w:sz="4" w:space="0" w:color="BFBFBF"/>
+              <w:right w:val="single" w:sz="4" w:space="0" w:color="BFBFBF"/>
             </w:tcBorders>
             <w:tcMar>
-              <w:top w:w="80" w:type="dxa"/>
-              <w:bottom w:w="80" w:type="dxa"/>
-              <w:left w:w="120" w:type="dxa"/>
-              <w:right w:w="120" w:type="dxa"/>
+              <w:top w:w="70" w:type="dxa"/>
+              <w:bottom w:w="70" w:type="dxa"/>
+              <w:left w:w="110" w:type="dxa"/>
+              <w:right w:w="110" w:type="dxa"/>
             </w:tcMar>
             <w:vAlign w:val="center"/>
           </w:tcPr>
           <w:p>
             <w:pPr>
-              <w:spacing w:after="0" w:before="0"/>
+              <w:spacing w:before="0" w:after="0" w:line="252" w:lineRule="auto"/>
             </w:pPr>
             <w:r>
               <w:rPr>
-                <w:rFonts w:ascii="Open Sans" w:hAnsi="Open Sans" w:cs="Open Sans"/>
+                <w:rFonts w:ascii="Calibri" w:hAnsi="Calibri" w:cs="Calibri"/>
                 <w:b/>
                 <w:i w:val="0"/>
-                <w:color w:val="54565A"/>
-                <w:sz w:val="21"/>
+                <w:color w:val="222222"/>
+                <w:sz w:val="19"/>
               </w:rPr>
               <w:t>Beneficiaries</w:t>
             </w:r>
             <w:r>
               <w:rPr>
-                <w:rFonts w:ascii="Open Sans" w:hAnsi="Open Sans" w:cs="Open Sans"/>
+                <w:rFonts w:ascii="Calibri" w:hAnsi="Calibri" w:cs="Calibri"/>
                 <w:b w:val="0"/>
                 <w:i/>
-                <w:color w:val="898A8D"/>
-                <w:sz w:val="18"/>
+                <w:color w:val="777777"/>
+                <w:sz w:val="16"/>
               </w:rPr>
               <w:t xml:space="preserve">  people helped</w:t>
             </w:r>
@@ -1166,61 +1409,61 @@
         </w:tc>
         <w:tc>
           <w:tcPr>
-            <w:tcW w:type="dxa" w:w="5472"/>
+            <w:tcW w:type="dxa" w:w="6048"/>
             <w:tcBorders>
-              <w:top w:val="single" w:sz="6" w:space="0" w:color="C9CCD1"/>
-              <w:left w:val="single" w:sz="6" w:space="0" w:color="C9CCD1"/>
-              <w:bottom w:val="single" w:sz="6" w:space="0" w:color="C9CCD1"/>
-              <w:right w:val="single" w:sz="6" w:space="0" w:color="C9CCD1"/>
+              <w:top w:val="single" w:sz="4" w:space="0" w:color="BFBFBF"/>
+              <w:left w:val="single" w:sz="4" w:space="0" w:color="BFBFBF"/>
+              <w:bottom w:val="single" w:sz="4" w:space="0" w:color="BFBFBF"/>
+              <w:right w:val="single" w:sz="4" w:space="0" w:color="BFBFBF"/>
             </w:tcBorders>
             <w:tcMar>
-              <w:top w:w="80" w:type="dxa"/>
-              <w:bottom w:w="80" w:type="dxa"/>
-              <w:left w:w="120" w:type="dxa"/>
-              <w:right w:w="120" w:type="dxa"/>
+              <w:top w:w="70" w:type="dxa"/>
+              <w:bottom w:w="70" w:type="dxa"/>
+              <w:left w:w="110" w:type="dxa"/>
+              <w:right w:w="110" w:type="dxa"/>
             </w:tcMar>
             <w:vAlign w:val="center"/>
           </w:tcPr>
           <w:p>
             <w:pPr>
-              <w:spacing w:after="0" w:before="0"/>
+              <w:spacing w:before="0" w:after="0" w:line="252" w:lineRule="auto"/>
             </w:pPr>
           </w:p>
         </w:tc>
       </w:tr>
       <w:tr>
         <w:trPr>
-          <w:trHeight w:val="560" w:hRule="atLeast"/>
+          <w:trHeight w:val="380" w:hRule="atLeast"/>
         </w:trPr>
         <w:tc>
           <w:tcPr>
-            <w:tcW w:type="dxa" w:w="3888"/>
-            <w:shd w:val="clear" w:color="auto" w:fill="EAF1FB"/>
+            <w:tcW w:type="dxa" w:w="3600"/>
+            <w:shd w:val="clear" w:color="auto" w:fill="F5F5F5"/>
             <w:tcBorders>
-              <w:top w:val="single" w:sz="6" w:space="0" w:color="C9CCD1"/>
-              <w:left w:val="single" w:sz="6" w:space="0" w:color="C9CCD1"/>
-              <w:bottom w:val="single" w:sz="6" w:space="0" w:color="C9CCD1"/>
-              <w:right w:val="single" w:sz="6" w:space="0" w:color="C9CCD1"/>
+              <w:top w:val="single" w:sz="4" w:space="0" w:color="BFBFBF"/>
+              <w:left w:val="single" w:sz="4" w:space="0" w:color="BFBFBF"/>
+              <w:bottom w:val="single" w:sz="4" w:space="0" w:color="BFBFBF"/>
+              <w:right w:val="single" w:sz="4" w:space="0" w:color="BFBFBF"/>
             </w:tcBorders>
             <w:tcMar>
-              <w:top w:w="80" w:type="dxa"/>
-              <w:bottom w:w="80" w:type="dxa"/>
-              <w:left w:w="120" w:type="dxa"/>
-              <w:right w:w="120" w:type="dxa"/>
+              <w:top w:w="70" w:type="dxa"/>
+              <w:bottom w:w="70" w:type="dxa"/>
+              <w:left w:w="110" w:type="dxa"/>
+              <w:right w:w="110" w:type="dxa"/>
             </w:tcMar>
             <w:vAlign w:val="center"/>
           </w:tcPr>
           <w:p>
             <w:pPr>
-              <w:spacing w:after="0" w:before="0"/>
+              <w:spacing w:before="0" w:after="0" w:line="252" w:lineRule="auto"/>
             </w:pPr>
             <w:r>
               <w:rPr>
-                <w:rFonts w:ascii="Open Sans" w:hAnsi="Open Sans" w:cs="Open Sans"/>
+                <w:rFonts w:ascii="Calibri" w:hAnsi="Calibri" w:cs="Calibri"/>
                 <w:b/>
                 <w:i w:val="0"/>
-                <w:color w:val="54565A"/>
-                <w:sz w:val="21"/>
+                <w:color w:val="222222"/>
+                <w:sz w:val="19"/>
               </w:rPr>
               <w:t>Project value (RM)</w:t>
             </w:r>
@@ -1228,71 +1471,71 @@
         </w:tc>
         <w:tc>
           <w:tcPr>
-            <w:tcW w:type="dxa" w:w="5472"/>
+            <w:tcW w:type="dxa" w:w="6048"/>
             <w:tcBorders>
-              <w:top w:val="single" w:sz="6" w:space="0" w:color="C9CCD1"/>
-              <w:left w:val="single" w:sz="6" w:space="0" w:color="C9CCD1"/>
-              <w:bottom w:val="single" w:sz="6" w:space="0" w:color="C9CCD1"/>
-              <w:right w:val="single" w:sz="6" w:space="0" w:color="C9CCD1"/>
+              <w:top w:val="single" w:sz="4" w:space="0" w:color="BFBFBF"/>
+              <w:left w:val="single" w:sz="4" w:space="0" w:color="BFBFBF"/>
+              <w:bottom w:val="single" w:sz="4" w:space="0" w:color="BFBFBF"/>
+              <w:right w:val="single" w:sz="4" w:space="0" w:color="BFBFBF"/>
             </w:tcBorders>
             <w:tcMar>
-              <w:top w:w="80" w:type="dxa"/>
-              <w:bottom w:w="80" w:type="dxa"/>
-              <w:left w:w="120" w:type="dxa"/>
-              <w:right w:w="120" w:type="dxa"/>
+              <w:top w:w="70" w:type="dxa"/>
+              <w:bottom w:w="70" w:type="dxa"/>
+              <w:left w:w="110" w:type="dxa"/>
+              <w:right w:w="110" w:type="dxa"/>
             </w:tcMar>
             <w:vAlign w:val="center"/>
           </w:tcPr>
           <w:p>
             <w:pPr>
-              <w:spacing w:after="0" w:before="0"/>
+              <w:spacing w:before="0" w:after="0" w:line="252" w:lineRule="auto"/>
             </w:pPr>
           </w:p>
         </w:tc>
       </w:tr>
       <w:tr>
         <w:trPr>
-          <w:trHeight w:val="560" w:hRule="atLeast"/>
+          <w:trHeight w:val="380" w:hRule="atLeast"/>
         </w:trPr>
         <w:tc>
           <w:tcPr>
-            <w:tcW w:type="dxa" w:w="3888"/>
-            <w:shd w:val="clear" w:color="auto" w:fill="EAF1FB"/>
+            <w:tcW w:type="dxa" w:w="3600"/>
+            <w:shd w:val="clear" w:color="auto" w:fill="F5F5F5"/>
             <w:tcBorders>
-              <w:top w:val="single" w:sz="6" w:space="0" w:color="C9CCD1"/>
-              <w:left w:val="single" w:sz="6" w:space="0" w:color="C9CCD1"/>
-              <w:bottom w:val="single" w:sz="6" w:space="0" w:color="C9CCD1"/>
-              <w:right w:val="single" w:sz="6" w:space="0" w:color="C9CCD1"/>
+              <w:top w:val="single" w:sz="4" w:space="0" w:color="BFBFBF"/>
+              <w:left w:val="single" w:sz="4" w:space="0" w:color="BFBFBF"/>
+              <w:bottom w:val="single" w:sz="4" w:space="0" w:color="BFBFBF"/>
+              <w:right w:val="single" w:sz="4" w:space="0" w:color="BFBFBF"/>
             </w:tcBorders>
             <w:tcMar>
-              <w:top w:w="80" w:type="dxa"/>
-              <w:bottom w:w="80" w:type="dxa"/>
-              <w:left w:w="120" w:type="dxa"/>
-              <w:right w:w="120" w:type="dxa"/>
+              <w:top w:w="70" w:type="dxa"/>
+              <w:bottom w:w="70" w:type="dxa"/>
+              <w:left w:w="110" w:type="dxa"/>
+              <w:right w:w="110" w:type="dxa"/>
             </w:tcMar>
             <w:vAlign w:val="center"/>
           </w:tcPr>
           <w:p>
             <w:pPr>
-              <w:spacing w:after="0" w:before="0"/>
+              <w:spacing w:before="0" w:after="0" w:line="252" w:lineRule="auto"/>
             </w:pPr>
             <w:r>
               <w:rPr>
-                <w:rFonts w:ascii="Open Sans" w:hAnsi="Open Sans" w:cs="Open Sans"/>
+                <w:rFonts w:ascii="Calibri" w:hAnsi="Calibri" w:cs="Calibri"/>
                 <w:b/>
                 <w:i w:val="0"/>
-                <w:color w:val="54565A"/>
-                <w:sz w:val="21"/>
+                <w:color w:val="222222"/>
+                <w:sz w:val="19"/>
               </w:rPr>
               <w:t>Volunteer hours</w:t>
             </w:r>
             <w:r>
               <w:rPr>
-                <w:rFonts w:ascii="Open Sans" w:hAnsi="Open Sans" w:cs="Open Sans"/>
+                <w:rFonts w:ascii="Calibri" w:hAnsi="Calibri" w:cs="Calibri"/>
                 <w:b w:val="0"/>
                 <w:i/>
-                <w:color w:val="898A8D"/>
-                <w:sz w:val="18"/>
+                <w:color w:val="777777"/>
+                <w:sz w:val="16"/>
               </w:rPr>
               <w:t xml:space="preserve">  optional</w:t>
             </w:r>
@@ -1300,24 +1543,24 @@
         </w:tc>
         <w:tc>
           <w:tcPr>
-            <w:tcW w:type="dxa" w:w="5472"/>
+            <w:tcW w:type="dxa" w:w="6048"/>
             <w:tcBorders>
-              <w:top w:val="single" w:sz="6" w:space="0" w:color="C9CCD1"/>
-              <w:left w:val="single" w:sz="6" w:space="0" w:color="C9CCD1"/>
-              <w:bottom w:val="single" w:sz="6" w:space="0" w:color="C9CCD1"/>
-              <w:right w:val="single" w:sz="6" w:space="0" w:color="C9CCD1"/>
+              <w:top w:val="single" w:sz="4" w:space="0" w:color="BFBFBF"/>
+              <w:left w:val="single" w:sz="4" w:space="0" w:color="BFBFBF"/>
+              <w:bottom w:val="single" w:sz="4" w:space="0" w:color="BFBFBF"/>
+              <w:right w:val="single" w:sz="4" w:space="0" w:color="BFBFBF"/>
             </w:tcBorders>
             <w:tcMar>
-              <w:top w:w="80" w:type="dxa"/>
-              <w:bottom w:w="80" w:type="dxa"/>
-              <w:left w:w="120" w:type="dxa"/>
-              <w:right w:w="120" w:type="dxa"/>
+              <w:top w:w="70" w:type="dxa"/>
+              <w:bottom w:w="70" w:type="dxa"/>
+              <w:left w:w="110" w:type="dxa"/>
+              <w:right w:w="110" w:type="dxa"/>
             </w:tcMar>
             <w:vAlign w:val="center"/>
           </w:tcPr>
           <w:p>
             <w:pPr>
-              <w:spacing w:after="0" w:before="0"/>
+              <w:spacing w:before="0" w:after="0" w:line="252" w:lineRule="auto"/>
             </w:pPr>
           </w:p>
         </w:tc>
@@ -1325,24 +1568,62 @@
     </w:tbl>
     <w:p>
       <w:pPr>
-        <w:spacing w:after="40"/>
+        <w:spacing w:before="0" w:after="120" w:line="269" w:lineRule="auto"/>
       </w:pPr>
     </w:p>
+    <w:tbl>
+      <w:tblPr>
+        <w:tblW w:type="auto" w:w="0"/>
+        <w:jc w:val="left"/>
+        <w:tblLook w:firstColumn="1" w:firstRow="1" w:lastColumn="0" w:lastRow="0" w:noHBand="0" w:noVBand="1" w:val="04A0"/>
+      </w:tblPr>
+      <w:tblGrid>
+        <w:gridCol w:w="9648"/>
+      </w:tblGrid>
+      <w:tr>
+        <w:trPr>
+          <w:trHeight w:val="300" w:hRule="atLeast"/>
+        </w:trPr>
+        <w:tc>
+          <w:tcPr>
+            <w:tcW w:type="dxa" w:w="9648"/>
+            <w:shd w:val="clear" w:color="auto" w:fill="0067C8"/>
+            <w:tcBorders>
+              <w:top w:val="single" w:sz="4" w:space="0" w:color="0067C8"/>
+              <w:left w:val="single" w:sz="4" w:space="0" w:color="0067C8"/>
+              <w:bottom w:val="single" w:sz="4" w:space="0" w:color="0067C8"/>
+              <w:right w:val="single" w:sz="4" w:space="0" w:color="0067C8"/>
+            </w:tcBorders>
+            <w:tcMar>
+              <w:top w:w="40" w:type="dxa"/>
+              <w:bottom w:w="40" w:type="dxa"/>
+              <w:left w:w="110" w:type="dxa"/>
+              <w:right w:w="110" w:type="dxa"/>
+            </w:tcMar>
+            <w:vAlign w:val="center"/>
+          </w:tcPr>
+          <w:p>
+            <w:pPr>
+              <w:spacing w:before="0" w:after="0" w:line="252" w:lineRule="auto"/>
+            </w:pPr>
+            <w:r>
+              <w:rPr>
+                <w:rFonts w:ascii="Calibri" w:hAnsi="Calibri" w:cs="Calibri"/>
+                <w:b/>
+                <w:i w:val="0"/>
+                <w:color w:val="FFFFFF"/>
+                <w:sz w:val="21"/>
+              </w:rPr>
+              <w:t>Partners</w:t>
+            </w:r>
+          </w:p>
+        </w:tc>
+      </w:tr>
+    </w:tbl>
     <w:p>
       <w:pPr>
-        <w:keepNext/>
-        <w:spacing w:before="320" w:after="120"/>
+        <w:spacing w:before="0" w:after="0" w:line="269" w:lineRule="auto"/>
       </w:pPr>
-      <w:r>
-        <w:rPr>
-          <w:rFonts w:ascii="Open Sans Condensed" w:hAnsi="Open Sans Condensed" w:cs="Open Sans Condensed"/>
-          <w:b/>
-          <w:i w:val="0"/>
-          <w:color w:val="0067C8"/>
-          <w:sz w:val="30"/>
-        </w:rPr>
-        <w:t>Partners</w:t>
-      </w:r>
     </w:p>
     <w:tbl>
       <w:tblPr>
@@ -1356,47 +1637,47 @@
       </w:tblGrid>
       <w:tr>
         <w:trPr>
-          <w:trHeight w:val="560" w:hRule="atLeast"/>
+          <w:trHeight w:val="620" w:hRule="atLeast"/>
         </w:trPr>
         <w:tc>
           <w:tcPr>
-            <w:tcW w:type="dxa" w:w="3888"/>
-            <w:shd w:val="clear" w:color="auto" w:fill="EAF1FB"/>
+            <w:tcW w:type="dxa" w:w="3600"/>
+            <w:shd w:val="clear" w:color="auto" w:fill="F5F5F5"/>
             <w:tcBorders>
-              <w:top w:val="single" w:sz="6" w:space="0" w:color="C9CCD1"/>
-              <w:left w:val="single" w:sz="6" w:space="0" w:color="C9CCD1"/>
-              <w:bottom w:val="single" w:sz="6" w:space="0" w:color="C9CCD1"/>
-              <w:right w:val="single" w:sz="6" w:space="0" w:color="C9CCD1"/>
+              <w:top w:val="single" w:sz="4" w:space="0" w:color="BFBFBF"/>
+              <w:left w:val="single" w:sz="4" w:space="0" w:color="BFBFBF"/>
+              <w:bottom w:val="single" w:sz="4" w:space="0" w:color="BFBFBF"/>
+              <w:right w:val="single" w:sz="4" w:space="0" w:color="BFBFBF"/>
             </w:tcBorders>
             <w:tcMar>
-              <w:top w:w="80" w:type="dxa"/>
-              <w:bottom w:w="80" w:type="dxa"/>
-              <w:left w:w="120" w:type="dxa"/>
-              <w:right w:w="120" w:type="dxa"/>
+              <w:top w:w="70" w:type="dxa"/>
+              <w:bottom w:w="70" w:type="dxa"/>
+              <w:left w:w="110" w:type="dxa"/>
+              <w:right w:w="110" w:type="dxa"/>
             </w:tcMar>
             <w:vAlign w:val="center"/>
           </w:tcPr>
           <w:p>
             <w:pPr>
-              <w:spacing w:after="0" w:before="0"/>
+              <w:spacing w:before="0" w:after="0" w:line="252" w:lineRule="auto"/>
             </w:pPr>
             <w:r>
               <w:rPr>
-                <w:rFonts w:ascii="Open Sans" w:hAnsi="Open Sans" w:cs="Open Sans"/>
+                <w:rFonts w:ascii="Calibri" w:hAnsi="Calibri" w:cs="Calibri"/>
                 <w:b/>
                 <w:i w:val="0"/>
-                <w:color w:val="54565A"/>
-                <w:sz w:val="21"/>
+                <w:color w:val="222222"/>
+                <w:sz w:val="19"/>
               </w:rPr>
               <w:t>Organisations / sponsors / co-clubs</w:t>
             </w:r>
             <w:r>
               <w:rPr>
-                <w:rFonts w:ascii="Open Sans" w:hAnsi="Open Sans" w:cs="Open Sans"/>
+                <w:rFonts w:ascii="Calibri" w:hAnsi="Calibri" w:cs="Calibri"/>
                 <w:b w:val="0"/>
                 <w:i/>
-                <w:color w:val="898A8D"/>
-                <w:sz w:val="18"/>
+                <w:color w:val="777777"/>
+                <w:sz w:val="16"/>
               </w:rPr>
               <w:t xml:space="preserve">  or “none”</w:t>
             </w:r>
@@ -1404,24 +1685,24 @@
         </w:tc>
         <w:tc>
           <w:tcPr>
-            <w:tcW w:type="dxa" w:w="5472"/>
+            <w:tcW w:type="dxa" w:w="6048"/>
             <w:tcBorders>
-              <w:top w:val="single" w:sz="6" w:space="0" w:color="C9CCD1"/>
-              <w:left w:val="single" w:sz="6" w:space="0" w:color="C9CCD1"/>
-              <w:bottom w:val="single" w:sz="6" w:space="0" w:color="C9CCD1"/>
-              <w:right w:val="single" w:sz="6" w:space="0" w:color="C9CCD1"/>
+              <w:top w:val="single" w:sz="4" w:space="0" w:color="BFBFBF"/>
+              <w:left w:val="single" w:sz="4" w:space="0" w:color="BFBFBF"/>
+              <w:bottom w:val="single" w:sz="4" w:space="0" w:color="BFBFBF"/>
+              <w:right w:val="single" w:sz="4" w:space="0" w:color="BFBFBF"/>
             </w:tcBorders>
             <w:tcMar>
-              <w:top w:w="80" w:type="dxa"/>
-              <w:bottom w:w="80" w:type="dxa"/>
-              <w:left w:w="120" w:type="dxa"/>
-              <w:right w:w="120" w:type="dxa"/>
+              <w:top w:w="70" w:type="dxa"/>
+              <w:bottom w:w="70" w:type="dxa"/>
+              <w:left w:w="110" w:type="dxa"/>
+              <w:right w:w="110" w:type="dxa"/>
             </w:tcMar>
             <w:vAlign w:val="center"/>
           </w:tcPr>
           <w:p>
             <w:pPr>
-              <w:spacing w:after="0" w:before="0"/>
+              <w:spacing w:before="0" w:after="0" w:line="252" w:lineRule="auto"/>
             </w:pPr>
           </w:p>
         </w:tc>
@@ -1429,24 +1710,62 @@
     </w:tbl>
     <w:p>
       <w:pPr>
-        <w:spacing w:after="40"/>
+        <w:spacing w:before="0" w:after="120" w:line="269" w:lineRule="auto"/>
       </w:pPr>
     </w:p>
+    <w:tbl>
+      <w:tblPr>
+        <w:tblW w:type="auto" w:w="0"/>
+        <w:jc w:val="left"/>
+        <w:tblLook w:firstColumn="1" w:firstRow="1" w:lastColumn="0" w:lastRow="0" w:noHBand="0" w:noVBand="1" w:val="04A0"/>
+      </w:tblPr>
+      <w:tblGrid>
+        <w:gridCol w:w="9648"/>
+      </w:tblGrid>
+      <w:tr>
+        <w:trPr>
+          <w:trHeight w:val="300" w:hRule="atLeast"/>
+        </w:trPr>
+        <w:tc>
+          <w:tcPr>
+            <w:tcW w:type="dxa" w:w="9648"/>
+            <w:shd w:val="clear" w:color="auto" w:fill="0067C8"/>
+            <w:tcBorders>
+              <w:top w:val="single" w:sz="4" w:space="0" w:color="0067C8"/>
+              <w:left w:val="single" w:sz="4" w:space="0" w:color="0067C8"/>
+              <w:bottom w:val="single" w:sz="4" w:space="0" w:color="0067C8"/>
+              <w:right w:val="single" w:sz="4" w:space="0" w:color="0067C8"/>
+            </w:tcBorders>
+            <w:tcMar>
+              <w:top w:w="40" w:type="dxa"/>
+              <w:bottom w:w="40" w:type="dxa"/>
+              <w:left w:w="110" w:type="dxa"/>
+              <w:right w:w="110" w:type="dxa"/>
+            </w:tcMar>
+            <w:vAlign w:val="center"/>
+          </w:tcPr>
+          <w:p>
+            <w:pPr>
+              <w:spacing w:before="0" w:after="0" w:line="252" w:lineRule="auto"/>
+            </w:pPr>
+            <w:r>
+              <w:rPr>
+                <w:rFonts w:ascii="Calibri" w:hAnsi="Calibri" w:cs="Calibri"/>
+                <w:b/>
+                <w:i w:val="0"/>
+                <w:color w:val="FFFFFF"/>
+                <w:sz w:val="21"/>
+              </w:rPr>
+              <w:t>Extras  (all optional)</w:t>
+            </w:r>
+          </w:p>
+        </w:tc>
+      </w:tr>
+    </w:tbl>
     <w:p>
       <w:pPr>
-        <w:keepNext/>
-        <w:spacing w:before="320" w:after="120"/>
+        <w:spacing w:before="0" w:after="0" w:line="269" w:lineRule="auto"/>
       </w:pPr>
-      <w:r>
-        <w:rPr>
-          <w:rFonts w:ascii="Open Sans Condensed" w:hAnsi="Open Sans Condensed" w:cs="Open Sans Condensed"/>
-          <w:b/>
-          <w:i w:val="0"/>
-          <w:color w:val="0067C8"/>
-          <w:sz w:val="30"/>
-        </w:rPr>
-        <w:t>Extras  (all optional)</w:t>
-      </w:r>
     </w:p>
     <w:tbl>
       <w:tblPr>
@@ -1460,47 +1779,47 @@
       </w:tblGrid>
       <w:tr>
         <w:trPr>
-          <w:trHeight w:val="560" w:hRule="atLeast"/>
+          <w:trHeight w:val="380" w:hRule="atLeast"/>
         </w:trPr>
         <w:tc>
           <w:tcPr>
-            <w:tcW w:type="dxa" w:w="3888"/>
-            <w:shd w:val="clear" w:color="auto" w:fill="EAF1FB"/>
+            <w:tcW w:type="dxa" w:w="3600"/>
+            <w:shd w:val="clear" w:color="auto" w:fill="F5F5F5"/>
             <w:tcBorders>
-              <w:top w:val="single" w:sz="6" w:space="0" w:color="C9CCD1"/>
-              <w:left w:val="single" w:sz="6" w:space="0" w:color="C9CCD1"/>
-              <w:bottom w:val="single" w:sz="6" w:space="0" w:color="C9CCD1"/>
-              <w:right w:val="single" w:sz="6" w:space="0" w:color="C9CCD1"/>
+              <w:top w:val="single" w:sz="4" w:space="0" w:color="BFBFBF"/>
+              <w:left w:val="single" w:sz="4" w:space="0" w:color="BFBFBF"/>
+              <w:bottom w:val="single" w:sz="4" w:space="0" w:color="BFBFBF"/>
+              <w:right w:val="single" w:sz="4" w:space="0" w:color="BFBFBF"/>
             </w:tcBorders>
             <w:tcMar>
-              <w:top w:w="80" w:type="dxa"/>
-              <w:bottom w:w="80" w:type="dxa"/>
-              <w:left w:w="120" w:type="dxa"/>
-              <w:right w:w="120" w:type="dxa"/>
+              <w:top w:w="70" w:type="dxa"/>
+              <w:bottom w:w="70" w:type="dxa"/>
+              <w:left w:w="110" w:type="dxa"/>
+              <w:right w:w="110" w:type="dxa"/>
             </w:tcMar>
             <w:vAlign w:val="center"/>
           </w:tcPr>
           <w:p>
             <w:pPr>
-              <w:spacing w:after="0" w:before="0"/>
+              <w:spacing w:before="0" w:after="0" w:line="252" w:lineRule="auto"/>
             </w:pPr>
             <w:r>
               <w:rPr>
-                <w:rFonts w:ascii="Open Sans" w:hAnsi="Open Sans" w:cs="Open Sans"/>
+                <w:rFonts w:ascii="Calibri" w:hAnsi="Calibri" w:cs="Calibri"/>
                 <w:b/>
                 <w:i w:val="0"/>
-                <w:color w:val="54565A"/>
-                <w:sz w:val="21"/>
+                <w:color w:val="222222"/>
+                <w:sz w:val="19"/>
               </w:rPr>
               <w:t>Photos?</w:t>
             </w:r>
             <w:r>
               <w:rPr>
-                <w:rFonts w:ascii="Open Sans" w:hAnsi="Open Sans" w:cs="Open Sans"/>
+                <w:rFonts w:ascii="Calibri" w:hAnsi="Calibri" w:cs="Calibri"/>
                 <w:b w:val="0"/>
                 <w:i/>
-                <w:color w:val="898A8D"/>
-                <w:sz w:val="18"/>
+                <w:color w:val="777777"/>
+                <w:sz w:val="16"/>
               </w:rPr>
               <w:t xml:space="preserve">  yes / no — where?</w:t>
             </w:r>
@@ -1508,71 +1827,71 @@
         </w:tc>
         <w:tc>
           <w:tcPr>
-            <w:tcW w:type="dxa" w:w="5472"/>
+            <w:tcW w:type="dxa" w:w="6048"/>
             <w:tcBorders>
-              <w:top w:val="single" w:sz="6" w:space="0" w:color="C9CCD1"/>
-              <w:left w:val="single" w:sz="6" w:space="0" w:color="C9CCD1"/>
-              <w:bottom w:val="single" w:sz="6" w:space="0" w:color="C9CCD1"/>
-              <w:right w:val="single" w:sz="6" w:space="0" w:color="C9CCD1"/>
+              <w:top w:val="single" w:sz="4" w:space="0" w:color="BFBFBF"/>
+              <w:left w:val="single" w:sz="4" w:space="0" w:color="BFBFBF"/>
+              <w:bottom w:val="single" w:sz="4" w:space="0" w:color="BFBFBF"/>
+              <w:right w:val="single" w:sz="4" w:space="0" w:color="BFBFBF"/>
             </w:tcBorders>
             <w:tcMar>
-              <w:top w:w="80" w:type="dxa"/>
-              <w:bottom w:w="80" w:type="dxa"/>
-              <w:left w:w="120" w:type="dxa"/>
-              <w:right w:w="120" w:type="dxa"/>
+              <w:top w:w="70" w:type="dxa"/>
+              <w:bottom w:w="70" w:type="dxa"/>
+              <w:left w:w="110" w:type="dxa"/>
+              <w:right w:w="110" w:type="dxa"/>
             </w:tcMar>
             <w:vAlign w:val="center"/>
           </w:tcPr>
           <w:p>
             <w:pPr>
-              <w:spacing w:after="0" w:before="0"/>
+              <w:spacing w:before="0" w:after="0" w:line="252" w:lineRule="auto"/>
             </w:pPr>
           </w:p>
         </w:tc>
       </w:tr>
       <w:tr>
         <w:trPr>
-          <w:trHeight w:val="560" w:hRule="atLeast"/>
+          <w:trHeight w:val="380" w:hRule="atLeast"/>
         </w:trPr>
         <w:tc>
           <w:tcPr>
-            <w:tcW w:type="dxa" w:w="3888"/>
-            <w:shd w:val="clear" w:color="auto" w:fill="EAF1FB"/>
+            <w:tcW w:type="dxa" w:w="3600"/>
+            <w:shd w:val="clear" w:color="auto" w:fill="F5F5F5"/>
             <w:tcBorders>
-              <w:top w:val="single" w:sz="6" w:space="0" w:color="C9CCD1"/>
-              <w:left w:val="single" w:sz="6" w:space="0" w:color="C9CCD1"/>
-              <w:bottom w:val="single" w:sz="6" w:space="0" w:color="C9CCD1"/>
-              <w:right w:val="single" w:sz="6" w:space="0" w:color="C9CCD1"/>
+              <w:top w:val="single" w:sz="4" w:space="0" w:color="BFBFBF"/>
+              <w:left w:val="single" w:sz="4" w:space="0" w:color="BFBFBF"/>
+              <w:bottom w:val="single" w:sz="4" w:space="0" w:color="BFBFBF"/>
+              <w:right w:val="single" w:sz="4" w:space="0" w:color="BFBFBF"/>
             </w:tcBorders>
             <w:tcMar>
-              <w:top w:w="80" w:type="dxa"/>
-              <w:bottom w:w="80" w:type="dxa"/>
-              <w:left w:w="120" w:type="dxa"/>
-              <w:right w:w="120" w:type="dxa"/>
+              <w:top w:w="70" w:type="dxa"/>
+              <w:bottom w:w="70" w:type="dxa"/>
+              <w:left w:w="110" w:type="dxa"/>
+              <w:right w:w="110" w:type="dxa"/>
             </w:tcMar>
             <w:vAlign w:val="center"/>
           </w:tcPr>
           <w:p>
             <w:pPr>
-              <w:spacing w:after="0" w:before="0"/>
+              <w:spacing w:before="0" w:after="0" w:line="252" w:lineRule="auto"/>
             </w:pPr>
             <w:r>
               <w:rPr>
-                <w:rFonts w:ascii="Open Sans" w:hAnsi="Open Sans" w:cs="Open Sans"/>
+                <w:rFonts w:ascii="Calibri" w:hAnsi="Calibri" w:cs="Calibri"/>
                 <w:b/>
                 <w:i w:val="0"/>
-                <w:color w:val="54565A"/>
-                <w:sz w:val="21"/>
+                <w:color w:val="222222"/>
+                <w:sz w:val="19"/>
               </w:rPr>
               <w:t>Publicity</w:t>
             </w:r>
             <w:r>
               <w:rPr>
-                <w:rFonts w:ascii="Open Sans" w:hAnsi="Open Sans" w:cs="Open Sans"/>
+                <w:rFonts w:ascii="Calibri" w:hAnsi="Calibri" w:cs="Calibri"/>
                 <w:b w:val="0"/>
                 <w:i/>
-                <w:color w:val="898A8D"/>
-                <w:sz w:val="18"/>
+                <w:color w:val="777777"/>
+                <w:sz w:val="16"/>
               </w:rPr>
               <w:t xml:space="preserve">  links, write-ups</w:t>
             </w:r>
@@ -1580,61 +1899,61 @@
         </w:tc>
         <w:tc>
           <w:tcPr>
-            <w:tcW w:type="dxa" w:w="5472"/>
+            <w:tcW w:type="dxa" w:w="6048"/>
             <w:tcBorders>
-              <w:top w:val="single" w:sz="6" w:space="0" w:color="C9CCD1"/>
-              <w:left w:val="single" w:sz="6" w:space="0" w:color="C9CCD1"/>
-              <w:bottom w:val="single" w:sz="6" w:space="0" w:color="C9CCD1"/>
-              <w:right w:val="single" w:sz="6" w:space="0" w:color="C9CCD1"/>
+              <w:top w:val="single" w:sz="4" w:space="0" w:color="BFBFBF"/>
+              <w:left w:val="single" w:sz="4" w:space="0" w:color="BFBFBF"/>
+              <w:bottom w:val="single" w:sz="4" w:space="0" w:color="BFBFBF"/>
+              <w:right w:val="single" w:sz="4" w:space="0" w:color="BFBFBF"/>
             </w:tcBorders>
             <w:tcMar>
-              <w:top w:w="80" w:type="dxa"/>
-              <w:bottom w:w="80" w:type="dxa"/>
-              <w:left w:w="120" w:type="dxa"/>
-              <w:right w:w="120" w:type="dxa"/>
+              <w:top w:w="70" w:type="dxa"/>
+              <w:bottom w:w="70" w:type="dxa"/>
+              <w:left w:w="110" w:type="dxa"/>
+              <w:right w:w="110" w:type="dxa"/>
             </w:tcMar>
             <w:vAlign w:val="center"/>
           </w:tcPr>
           <w:p>
             <w:pPr>
-              <w:spacing w:after="0" w:before="0"/>
+              <w:spacing w:before="0" w:after="0" w:line="252" w:lineRule="auto"/>
             </w:pPr>
           </w:p>
         </w:tc>
       </w:tr>
       <w:tr>
         <w:trPr>
-          <w:trHeight w:val="560" w:hRule="atLeast"/>
+          <w:trHeight w:val="620" w:hRule="atLeast"/>
         </w:trPr>
         <w:tc>
           <w:tcPr>
-            <w:tcW w:type="dxa" w:w="3888"/>
-            <w:shd w:val="clear" w:color="auto" w:fill="EAF1FB"/>
+            <w:tcW w:type="dxa" w:w="3600"/>
+            <w:shd w:val="clear" w:color="auto" w:fill="F5F5F5"/>
             <w:tcBorders>
-              <w:top w:val="single" w:sz="6" w:space="0" w:color="C9CCD1"/>
-              <w:left w:val="single" w:sz="6" w:space="0" w:color="C9CCD1"/>
-              <w:bottom w:val="single" w:sz="6" w:space="0" w:color="C9CCD1"/>
-              <w:right w:val="single" w:sz="6" w:space="0" w:color="C9CCD1"/>
+              <w:top w:val="single" w:sz="4" w:space="0" w:color="BFBFBF"/>
+              <w:left w:val="single" w:sz="4" w:space="0" w:color="BFBFBF"/>
+              <w:bottom w:val="single" w:sz="4" w:space="0" w:color="BFBFBF"/>
+              <w:right w:val="single" w:sz="4" w:space="0" w:color="BFBFBF"/>
             </w:tcBorders>
             <w:tcMar>
-              <w:top w:w="80" w:type="dxa"/>
-              <w:bottom w:w="80" w:type="dxa"/>
-              <w:left w:w="120" w:type="dxa"/>
-              <w:right w:w="120" w:type="dxa"/>
+              <w:top w:w="70" w:type="dxa"/>
+              <w:bottom w:w="70" w:type="dxa"/>
+              <w:left w:w="110" w:type="dxa"/>
+              <w:right w:w="110" w:type="dxa"/>
             </w:tcMar>
             <w:vAlign w:val="center"/>
           </w:tcPr>
           <w:p>
             <w:pPr>
-              <w:spacing w:after="0" w:before="0"/>
+              <w:spacing w:before="0" w:after="0" w:line="252" w:lineRule="auto"/>
             </w:pPr>
             <w:r>
               <w:rPr>
-                <w:rFonts w:ascii="Open Sans" w:hAnsi="Open Sans" w:cs="Open Sans"/>
+                <w:rFonts w:ascii="Calibri" w:hAnsi="Calibri" w:cs="Calibri"/>
                 <w:b/>
                 <w:i w:val="0"/>
-                <w:color w:val="54565A"/>
-                <w:sz w:val="21"/>
+                <w:color w:val="222222"/>
+                <w:sz w:val="19"/>
               </w:rPr>
               <w:t>Lessons learned / would you repeat it?</w:t>
             </w:r>
@@ -1642,71 +1961,71 @@
         </w:tc>
         <w:tc>
           <w:tcPr>
-            <w:tcW w:type="dxa" w:w="5472"/>
+            <w:tcW w:type="dxa" w:w="6048"/>
             <w:tcBorders>
-              <w:top w:val="single" w:sz="6" w:space="0" w:color="C9CCD1"/>
-              <w:left w:val="single" w:sz="6" w:space="0" w:color="C9CCD1"/>
-              <w:bottom w:val="single" w:sz="6" w:space="0" w:color="C9CCD1"/>
-              <w:right w:val="single" w:sz="6" w:space="0" w:color="C9CCD1"/>
+              <w:top w:val="single" w:sz="4" w:space="0" w:color="BFBFBF"/>
+              <w:left w:val="single" w:sz="4" w:space="0" w:color="BFBFBF"/>
+              <w:bottom w:val="single" w:sz="4" w:space="0" w:color="BFBFBF"/>
+              <w:right w:val="single" w:sz="4" w:space="0" w:color="BFBFBF"/>
             </w:tcBorders>
             <w:tcMar>
-              <w:top w:w="80" w:type="dxa"/>
-              <w:bottom w:w="80" w:type="dxa"/>
-              <w:left w:w="120" w:type="dxa"/>
-              <w:right w:w="120" w:type="dxa"/>
+              <w:top w:w="70" w:type="dxa"/>
+              <w:bottom w:w="70" w:type="dxa"/>
+              <w:left w:w="110" w:type="dxa"/>
+              <w:right w:w="110" w:type="dxa"/>
             </w:tcMar>
             <w:vAlign w:val="center"/>
           </w:tcPr>
           <w:p>
             <w:pPr>
-              <w:spacing w:after="0" w:before="0"/>
+              <w:spacing w:before="0" w:after="0" w:line="252" w:lineRule="auto"/>
             </w:pPr>
           </w:p>
         </w:tc>
       </w:tr>
       <w:tr>
         <w:trPr>
-          <w:trHeight w:val="560" w:hRule="atLeast"/>
+          <w:trHeight w:val="620" w:hRule="atLeast"/>
         </w:trPr>
         <w:tc>
           <w:tcPr>
-            <w:tcW w:type="dxa" w:w="3888"/>
-            <w:shd w:val="clear" w:color="auto" w:fill="EAF1FB"/>
+            <w:tcW w:type="dxa" w:w="3600"/>
+            <w:shd w:val="clear" w:color="auto" w:fill="F5F5F5"/>
             <w:tcBorders>
-              <w:top w:val="single" w:sz="6" w:space="0" w:color="C9CCD1"/>
-              <w:left w:val="single" w:sz="6" w:space="0" w:color="C9CCD1"/>
-              <w:bottom w:val="single" w:sz="6" w:space="0" w:color="C9CCD1"/>
-              <w:right w:val="single" w:sz="6" w:space="0" w:color="C9CCD1"/>
+              <w:top w:val="single" w:sz="4" w:space="0" w:color="BFBFBF"/>
+              <w:left w:val="single" w:sz="4" w:space="0" w:color="BFBFBF"/>
+              <w:bottom w:val="single" w:sz="4" w:space="0" w:color="BFBFBF"/>
+              <w:right w:val="single" w:sz="4" w:space="0" w:color="BFBFBF"/>
             </w:tcBorders>
             <w:tcMar>
-              <w:top w:w="80" w:type="dxa"/>
-              <w:bottom w:w="80" w:type="dxa"/>
-              <w:left w:w="120" w:type="dxa"/>
-              <w:right w:w="120" w:type="dxa"/>
+              <w:top w:w="70" w:type="dxa"/>
+              <w:bottom w:w="70" w:type="dxa"/>
+              <w:left w:w="110" w:type="dxa"/>
+              <w:right w:w="110" w:type="dxa"/>
             </w:tcMar>
             <w:vAlign w:val="center"/>
           </w:tcPr>
           <w:p>
             <w:pPr>
-              <w:spacing w:after="0" w:before="0"/>
+              <w:spacing w:before="0" w:after="0" w:line="252" w:lineRule="auto"/>
             </w:pPr>
             <w:r>
               <w:rPr>
-                <w:rFonts w:ascii="Open Sans" w:hAnsi="Open Sans" w:cs="Open Sans"/>
+                <w:rFonts w:ascii="Calibri" w:hAnsi="Calibri" w:cs="Calibri"/>
                 <w:b/>
                 <w:i w:val="0"/>
-                <w:color w:val="54565A"/>
-                <w:sz w:val="21"/>
+                <w:color w:val="222222"/>
+                <w:sz w:val="19"/>
               </w:rPr>
-              <w:t>Anything else?</w:t>
+              <w:t>Anything else we should record?</w:t>
             </w:r>
             <w:r>
               <w:rPr>
-                <w:rFonts w:ascii="Open Sans" w:hAnsi="Open Sans" w:cs="Open Sans"/>
+                <w:rFonts w:ascii="Calibri" w:hAnsi="Calibri" w:cs="Calibri"/>
                 <w:b w:val="0"/>
                 <w:i/>
-                <w:color w:val="898A8D"/>
-                <w:sz w:val="18"/>
+                <w:color w:val="777777"/>
+                <w:sz w:val="16"/>
               </w:rPr>
               <w:t xml:space="preserve">  the club ran an earlier aquaponics installation at St Nicholas Home for the Blind in 2021-22 — was this related?</w:t>
             </w:r>
@@ -1714,24 +2033,24 @@
         </w:tc>
         <w:tc>
           <w:tcPr>
-            <w:tcW w:type="dxa" w:w="5472"/>
+            <w:tcW w:type="dxa" w:w="6048"/>
             <w:tcBorders>
-              <w:top w:val="single" w:sz="6" w:space="0" w:color="C9CCD1"/>
-              <w:left w:val="single" w:sz="6" w:space="0" w:color="C9CCD1"/>
-              <w:bottom w:val="single" w:sz="6" w:space="0" w:color="C9CCD1"/>
-              <w:right w:val="single" w:sz="6" w:space="0" w:color="C9CCD1"/>
+              <w:top w:val="single" w:sz="4" w:space="0" w:color="BFBFBF"/>
+              <w:left w:val="single" w:sz="4" w:space="0" w:color="BFBFBF"/>
+              <w:bottom w:val="single" w:sz="4" w:space="0" w:color="BFBFBF"/>
+              <w:right w:val="single" w:sz="4" w:space="0" w:color="BFBFBF"/>
             </w:tcBorders>
             <w:tcMar>
-              <w:top w:w="80" w:type="dxa"/>
-              <w:bottom w:w="80" w:type="dxa"/>
-              <w:left w:w="120" w:type="dxa"/>
-              <w:right w:w="120" w:type="dxa"/>
+              <w:top w:w="70" w:type="dxa"/>
+              <w:bottom w:w="70" w:type="dxa"/>
+              <w:left w:w="110" w:type="dxa"/>
+              <w:right w:w="110" w:type="dxa"/>
             </w:tcMar>
             <w:vAlign w:val="center"/>
           </w:tcPr>
           <w:p>
             <w:pPr>
-              <w:spacing w:after="0" w:before="0"/>
+              <w:spacing w:before="0" w:after="0" w:line="252" w:lineRule="auto"/>
             </w:pPr>
           </w:p>
         </w:tc>
@@ -1739,27 +2058,27 @@
     </w:tbl>
     <w:p>
       <w:pPr>
-        <w:spacing w:after="40"/>
+        <w:spacing w:before="0" w:after="120" w:line="269" w:lineRule="auto"/>
       </w:pPr>
     </w:p>
     <w:p>
       <w:pPr>
-        <w:spacing w:before="240"/>
+        <w:spacing w:before="200" w:after="0" w:line="269" w:lineRule="auto"/>
       </w:pPr>
       <w:r>
         <w:rPr>
-          <w:rFonts w:ascii="Open Sans" w:hAnsi="Open Sans" w:cs="Open Sans"/>
+          <w:rFonts w:ascii="Calibri" w:hAnsi="Calibri" w:cs="Calibri"/>
           <w:b w:val="0"/>
           <w:i/>
-          <w:color w:val="54565A"/>
-          <w:sz w:val="19"/>
+          <w:color w:val="777777"/>
+          <w:sz w:val="17"/>
         </w:rPr>
         <w:t>Thank you, Mike. This completes the 2024-25 entry in the club's Service Projects record.</w:t>
       </w:r>
     </w:p>
     <w:sectPr>
       <w:pgSz w:w="12240" w:h="15840"/>
-      <w:pgMar w:top="1152" w:right="1296" w:bottom="1152" w:left="1296" w:header="720" w:footer="720" w:gutter="0"/>
+      <w:pgMar w:top="1008" w:right="1296" w:bottom="1008" w:left="1296" w:header="720" w:footer="720" w:gutter="0"/>
       <w:cols w:space="720"/>
       <w:docGrid w:linePitch="360"/>
     </w:sectPr>
@@ -2130,13 +2449,10 @@
     <w:name w:val="Normal"/>
     <w:qFormat/>
     <w:rsid w:val="00FC693F"/>
-    <w:pPr>
-      <w:spacing w:after="120" w:line="276" w:lineRule="auto"/>
-    </w:pPr>
     <w:rPr>
-      <w:rFonts w:ascii="Open Sans" w:hAnsi="Open Sans"/>
-      <w:color w:val="54565A"/>
-      <w:sz w:val="21"/>
+      <w:rFonts w:ascii="Calibri" w:hAnsi="Calibri"/>
+      <w:color w:val="222222"/>
+      <w:sz w:val="19"/>
     </w:rPr>
   </w:style>
   <w:style w:type="paragraph" w:styleId="Header">

</xml_diff>